<commit_message>
Check the 28 September corrections against the exact-campaign bid logic
Re-derives the in-focus price corrections from the Bids and Placements
logic (market bound, gap lift, climb cap, rank prediction, suppression
check), treats the flagship hold as the funding decision the logic
requires, adds the deal-window read and four-conditions sections, and
lists where the logic document contradicts itself.

Co-Authored-By: Claude Opus 5.5 <noreply@anthropic.com>
Claude-Session: https://claude.ai/code/session_01LY7A1KPDoE1cQtWdmceR2R
</commit_message>
<xml_diff>
--- a/docs/DBS4_Corrections_by_Situation_20260928.docx
+++ b/docs/DBS4_Corrections_by_Situation_20260928.docx
@@ -38,6 +38,14 @@
         <w:spacing w:after="100"/>
       </w:pPr>
       <w:r>
+        <w:t xml:space="preserve">Every exact-campaign price correction here is checked against “Bids and placements on Exact campaigns” (cited as “the logic”, with its section number). Where the logic and the 21 September deal rules differ, the logic governs now that the deal is over. Part E lists the places where the logic document contradicts itself.</w:t>
+      </w:r>
+    </w:p>
+    <w:p>
+      <w:pPr>
+        <w:spacing w:after="100"/>
+      </w:pPr>
+      <w:r>
         <w:rPr>
           <w:b/>
           <w:bCs/>
@@ -46,7 +54,7 @@
         <w:t xml:space="preserve">In short. </w:t>
       </w:r>
       <w:r>
-        <w:t xml:space="preserve">The direction holds for Bamboo|Cooling and is weak for California King. About 110 rows should not load as written (103 to pull, 9 to correct), most of them the same engine faults the 21 September document named: rows the engine itself marks HOLD, no-op and duplicate rows, and predictions no budget can buy. Two decisions need the owner before anything loads: the flagship “Bamboo Sheets” campaign, left at deal spend with its decision parked in a hold row, and the California King push on a hero with 44 units.</w:t>
+        <w:t xml:space="preserve">The direction holds for Bamboo|Cooling and is weak for California King. About 110 rows should not load as written (105 to pull, 9 to correct), most of them the same engine faults the 21 September document named: rows the engine itself marks HOLD, no-op and duplicate rows, and predictions no budget can buy. Checked against the logic, the three dose pushes are capped by the market bound, so 369 comes down rather than up, and two pushed terms with no rank on file drop to the ceiling. Every 14-day read in this run falls inside a deal window, which the logic treats as void. Two decisions need the owner before anything loads. The first is the flagship “Bamboo Sheets” campaign: the logic says its hold is right, but it has to be written as a funding decision. The second is the California King push on a hero with 44 units.</w:t>
       </w:r>
     </w:p>
     <w:p>
@@ -1902,7 +1910,7 @@
         <w:spacing w:after="100"/>
       </w:pPr>
       <w:r>
-        <w:t xml:space="preserve">The audit export (JSON and workbook) for run 20260928-9e6e6bb5: 343 decisions, 2,106 considered rows, the brief and review 22. Engine figures are as of the audit. Campaign 14-day spend covers 09-14 → 09-27, all of them deal days; clicks and orders are 90 days; keyword ranks are single tracker readings. From Command Center: product and syntax-group summaries for 09-15 → 09-27 against 09-02 → 09-14, the daily placement split for all keywords, and group ranks as 7-day medians of the daily crawl. Orders in the last seven days are still filling in (7-day attribution).</w:t>
+        <w:t xml:space="preserve">The audit export (JSON and workbook) for run 20260928-9e6e6bb5: 343 decisions, 2,106 considered rows, the brief and review 22. Engine figures are as of the audit. Campaign 14-day spend covers 09-14 → 09-27, all of them deal days; clicks and orders are 90 days; keyword ranks are single tracker readings. From Command Center: product and syntax-group summaries for 09-15 → 09-27 against 09-02 → 09-14, the daily placement split for all keywords, and group ranks as 7-day medians of the daily crawl. Orders in the last seven days are still filling in (7-day attribution). The logic (§12) voids any read with a deal week inside its window. Every 14-day figure in this run is a deal figure, and the 90-day figures carry 13 deal days (C1b).</w:t>
       </w:r>
     </w:p>
     <w:p>
@@ -1923,10 +1931,138 @@
           <w:bCs/>
           <w:color w:val="1F3A5F"/>
         </w:rPr>
-        <w:t xml:space="preserve">The rule. </w:t>
-      </w:r>
-      <w:r>
-        <w:t xml:space="preserve">In focus, every ranking campaign short of its clicks is pushed on the top-of-search modifier. The step follows the delivery gap: +30% under 30% of required clicks delivered, +20% at 30–70%, +10% over 70%. It stays inside the loss stop: a top-of-search order may cost at most 3× contribution, 3 × $24.49 = $73.47, which is a $10.07 top-of-search price at the engine’s 13.7% lane conversion. The budget goes up in the same write wherever the push would out-spend it. A campaign with a record that stopped serving is restored before it is pushed. A term that lost more than 10 positions is pushed and its cause named the same day. The deal is over, so the push now sells at list price.</w:t>
+        <w:t xml:space="preserve">The rule (the logic, §4–§11). </w:t>
+      </w:r>
+      <w:r>
+        <w:t xml:space="preserve">Each in-focus row decides one top-of-search price, and the modifier is divided out from it.</w:t>
+      </w:r>
+    </w:p>
+    <w:p>
+      <w:pPr>
+        <w:pStyle w:val="ListParagraph"/>
+        <w:numPr>
+          <w:ilvl w:val="0"/>
+          <w:numId w:val="2"/>
+        </w:numPr>
+        <w:spacing w:after="60"/>
+      </w:pPr>
+      <w:r>
+        <w:rPr>
+          <w:b/>
+          <w:bCs/>
+        </w:rPr>
+        <w:t xml:space="preserve">Target. </w:t>
+      </w:r>
+      <w:r>
+        <w:t xml:space="preserve">The ceiling (contribution × top-of-search conversion) lifted by the binding gap. A gap up to 1.5× lifts it 0.25; beyond that, the lift is (ratio − 1) × 0.5.</w:t>
+      </w:r>
+    </w:p>
+    <w:p>
+      <w:pPr>
+        <w:pStyle w:val="ListParagraph"/>
+        <w:numPr>
+          <w:ilvl w:val="0"/>
+          <w:numId w:val="2"/>
+        </w:numPr>
+        <w:spacing w:after="60"/>
+      </w:pPr>
+      <w:r>
+        <w:rPr>
+          <w:b/>
+          <w:bCs/>
+        </w:rPr>
+        <w:t xml:space="preserve">Bound. </w:t>
+      </w:r>
+      <w:r>
+        <w:t xml:space="preserve">The target is held to the market bound: what the position clears at, plus 15%.</w:t>
+      </w:r>
+    </w:p>
+    <w:p>
+      <w:pPr>
+        <w:pStyle w:val="ListParagraph"/>
+        <w:numPr>
+          <w:ilvl w:val="0"/>
+          <w:numId w:val="2"/>
+        </w:numPr>
+        <w:spacing w:after="60"/>
+      </w:pPr>
+      <w:r>
+        <w:rPr>
+          <w:b/>
+          <w:bCs/>
+        </w:rPr>
+        <w:t xml:space="preserve">Step. </w:t>
+      </w:r>
+      <w:r>
+        <w:t xml:space="preserve">Each write climbs at most 20–30% of the current price toward the target.</w:t>
+      </w:r>
+    </w:p>
+    <w:p>
+      <w:pPr>
+        <w:pStyle w:val="ListParagraph"/>
+        <w:numPr>
+          <w:ilvl w:val="0"/>
+          <w:numId w:val="2"/>
+        </w:numPr>
+        <w:spacing w:after="60"/>
+      </w:pPr>
+      <w:r>
+        <w:rPr>
+          <w:b/>
+          <w:bCs/>
+        </w:rPr>
+        <w:t xml:space="preserve">Budget. </w:t>
+      </w:r>
+      <w:r>
+        <w:t xml:space="preserve">Required clicks × this write’s price (§7).</w:t>
+      </w:r>
+    </w:p>
+    <w:p>
+      <w:pPr>
+        <w:pStyle w:val="ListParagraph"/>
+        <w:numPr>
+          <w:ilvl w:val="0"/>
+          <w:numId w:val="2"/>
+        </w:numPr>
+        <w:spacing w:after="60"/>
+      </w:pPr>
+      <w:r>
+        <w:rPr>
+          <w:b/>
+          <w:bCs/>
+        </w:rPr>
+        <w:t xml:space="preserve">What a push must carry. </w:t>
+      </w:r>
+      <w:r>
+        <w:t xml:space="preserve">A rank prediction (§11); without one it is priced at the ceiling. A term with no rank on file is ceiling only (§6). The delivery gap lifts the price only when the budget is intact and impression share is low (§6).</w:t>
+      </w:r>
+    </w:p>
+    <w:p>
+      <w:pPr>
+        <w:pStyle w:val="ListParagraph"/>
+        <w:numPr>
+          <w:ilvl w:val="0"/>
+          <w:numId w:val="2"/>
+        </w:numPr>
+        <w:spacing w:after="60"/>
+      </w:pPr>
+      <w:r>
+        <w:rPr>
+          <w:b/>
+          <w:bCs/>
+        </w:rPr>
+        <w:t xml:space="preserve">Rows not delivering. </w:t>
+      </w:r>
+      <w:r>
+        <w:t xml:space="preserve">No clicks arriving: hold the base and move the modifier only (§12). A down-only campaign that is not delivering is checked for suppression before its price is raised again (§10).</w:t>
+      </w:r>
+    </w:p>
+    <w:p>
+      <w:pPr>
+        <w:spacing w:after="100"/>
+      </w:pPr>
+      <w:r>
+        <w:t xml:space="preserve">The 21 September loss stop (3× contribution per order) was a deal rule and lapsed with the deal. The deal is over, so the push now sells at list price, and the logic (§6) asks for sales velocity in the window before a wide gap is funded. The next velocity window is the 10-26 Lightning Deal.</w:t>
       </w:r>
     </w:p>
     <w:p>
@@ -4643,7 +4779,7 @@
         <w:spacing w:after="100"/>
       </w:pPr>
       <w:r>
-        <w:t xml:space="preserve">One row is past the loss stop: 369, at $88 an order. Every dose row is written above the row’s own break-even ceiling ($3.51) and its own market bound ($5.74–$6.62); the dose rule sets both aside. The four budget halves were not held on judgement. Their prediction reads “no claim — budget-follows-price”, which the prediction check cannot parse, so the code held them. The export itself calls a failed check an engine bug. The price halves shipped without them.</w:t>
+        <w:t xml:space="preserve">The market bound is $6.62 on the California King rows and $5.74 on Bamboo|Cooling. All three dose rows are written past it ($8.04, $12.07, $8.04), and each says “no cap bound this write”. The logic (§8) requires the binding bound to be named on the row with the loss per order it implies. 369 was already above its bound before the write ($6.90 against $5.74). Every in-focus row is on down-only bidding (LEGACY_FOR_SALES), and none is delivering, so the §10 suppression check applies to all of them. Their ceilings are the engine’s “lane” figures ($3.51 and $3.77: a 13.7% lane conversion and a $25.57 lane contribution), not the serving child’s, which is what §2, §3 and §8 require. The four budget halves were not held on judgement. Their prediction reads “no claim — budget-follows-price”, which the prediction check cannot parse, so the code held them. The export itself calls a failed check an engine bug. The price halves shipped without them.</w:t>
       </w:r>
     </w:p>
     <w:p>
@@ -4651,7 +4787,209 @@
         <w:pStyle w:val="Heading1"/>
       </w:pPr>
       <w:r>
-        <w:t xml:space="preserve">A2. Three dose pushes at +75%: past the row’s own limits, on terms with no orders</w:t>
+        <w:t xml:space="preserve">A2. Three dose pushes at +75%: past the market bound, with no rank prediction, on terms with no orders</w:t>
+      </w:r>
+    </w:p>
+    <w:p>
+      <w:pPr>
+        <w:spacing w:after="100"/>
+      </w:pPr>
+      <w:r>
+        <w:rPr>
+          <w:b/>
+          <w:bCs/>
+          <w:color w:val="1F3A5F"/>
+        </w:rPr>
+        <w:t xml:space="preserve">The rule (the logic, §4, §6, §8, §11). </w:t>
+      </w:r>
+      <w:r>
+        <w:t xml:space="preserve">Price toward the target the gap sets, held to the market bound, in steps of at most 20–30% of the current price. The binding bound is named on the row with its loss per order. A push carries a rank prediction; without one it is priced at the ceiling. A wide gap is funded only when the four conditions are all present: sales velocity in the window, click-through above the market, conversion above the market, and stock to sustain it.</w:t>
+      </w:r>
+    </w:p>
+    <w:p>
+      <w:pPr>
+        <w:spacing w:after="100"/>
+      </w:pPr>
+      <w:r>
+        <w:rPr>
+          <w:b/>
+          <w:bCs/>
+          <w:color w:val="1F3A5F"/>
+        </w:rPr>
+        <w:t xml:space="preserve">What the run did. </w:t>
+      </w:r>
+      <w:r>
+        <w:t xml:space="preserve">Raised all three by +75% (288, 369, 398) under a “dose push” rule that sets aside the climb cap and the market bound. None carries a rank prediction (“UNGRADEABLE — no rank claim until it lands”), so under §11 none is a push. The budget halves were held by the code check, and the review passed all three.</w:t>
+      </w:r>
+    </w:p>
+    <w:p>
+      <w:pPr>
+        <w:spacing w:after="100"/>
+      </w:pPr>
+      <w:r>
+        <w:rPr>
+          <w:b/>
+          <w:bCs/>
+        </w:rPr>
+        <w:t xml:space="preserve">Bamboo Cooling Sheets King Size-[Bamboo|Cooling]-(LSV)-Exact-(Ranking)-DO-BAMBOO-KING-WHITE</w:t>
+      </w:r>
+      <w:r>
+        <w:t xml:space="preserve"> — “bamboo cooling sheets king size” rank 31 (35 thirty days ago). It held 7 earlier in the window, so 24 positions have been lost. 90 days: 7 clicks, 0 orders; 3 top-of-search clicks on 141 impressions, top-of-search impression share 0.51%. The run writes modifier 200% → 425%: top of search $6.90 → $12.07, about $88 a top-of-search order at 13.7%. The logic’s arithmetic: gap 31 ÷ 7 = 4.4, lift 1.71, so the target is $3.51 × 2.71 = $9.53. The Bamboo|Cooling market bound of $5.74 binds, which puts the target below today’s $6.90. The row’s own BASE WRITE says the same thing (“held to 200%” by the market bound), and its TIMELINE says “not pushed this run”. Correction: a descent to a named point (§9): top of search $5.74, modifier 150% on the $2.30 base, about $42 an order. The current $11.42 budget already buys 14 clicks a week at that price, so drop the raise to $22.91 (368). Name the cause of the fall from 7 to 31 before any climb (§12).</w:t>
+      </w:r>
+    </w:p>
+    <w:p>
+      <w:pPr>
+        <w:spacing w:after="100"/>
+      </w:pPr>
+      <w:r>
+        <w:rPr>
+          <w:b/>
+          <w:bCs/>
+        </w:rPr>
+        <w:t xml:space="preserve">Bamboo Sheets California King-(LSV)-Exact-(Ranking)-DO-BAMBOO-CALIFKING-WHITE</w:t>
+      </w:r>
+      <w:r>
+        <w:t xml:space="preserve"> — “bamboo sheets california king” rank 16, from 4 thirty days ago (12 positions lost). 90 days: 9 clicks, 0 orders; top-of-search impression share 2.82%, and the budget is not capping ($27 in 14 days on $10 a day), so price is the lever (§6). The run writes 238% → 491%: $4.60 → $8.04 (+75%), about $59 an order. The logic’s arithmetic: gap 16 ÷ 6 = 2.67, lift 0.83, so the target is $3.51 × 1.83 = $6.43, inside the $6.62 bound. The 30% cap binds this write. The same row’s “certain-win press” section holds this term because “the child that serves the term has no stock room”, and it prices the prize at about 0.4 orders a week ($4.83 a day in sales). Row 2161 moves this campaign’s ad to BAMBOO-CALIFKING-BURGUNDY-NEW while the rank target is read on BAMBOO-CALIFKING-WHITE (A4). Correction: $5.98, modifier 340% on the $1.36 base, about $44 an order. The budget is 16 required clicks a week × $5.98, about $13.70 a day, so load the row’s $13.98. Write the rank prediction the row omits (16 → a dated target), and confirm the tracked child before the re-point.</w:t>
+      </w:r>
+    </w:p>
+    <w:p>
+      <w:pPr>
+        <w:spacing w:after="100"/>
+      </w:pPr>
+      <w:r>
+        <w:rPr>
+          <w:b/>
+          <w:bCs/>
+        </w:rPr>
+        <w:t xml:space="preserve">Cooling Bamboo Sheets-[Bamboo|Cooling]-(MSV)-Exact-(Ranking)-DO-BAMBOO-KING-WHITE</w:t>
+      </w:r>
+      <w:r>
+        <w:t xml:space="preserve"> — “cooling bamboo sheets” rank 12, climbing from 30. 90 days: 7 clicks, 0 orders; top-of-search impression share 1.27%. The run writes 130% → 302%: $4.60 → $8.04. The row’s own prose says “the run had written 187%”, and its PRICES line still quotes $5.32 a click. The logic’s arithmetic: gap 12 ÷ 5 = 2.4, lift 0.70, so the target is $5.97, and the $5.74 bound binds. 187% is exactly the bound: $2.00 × 2.87 = $5.74. Correction: $5.74, modifier 187%, written with the bound named. The budget at the plan’s 40 clicks a week is $32.80 a day against the $14.21 written. Under §11 that is an $18.59-a-day shortfall, stated as such: fund it or hold it with the number named. It is not a funded push at $14.21.</w:t>
+      </w:r>
+    </w:p>
+    <w:p>
+      <w:pPr>
+        <w:spacing w:after="100"/>
+      </w:pPr>
+      <w:r>
+        <w:rPr>
+          <w:b/>
+          <w:bCs/>
+          <w:color w:val="1F3A5F"/>
+        </w:rPr>
+        <w:t xml:space="preserve">Correction. </w:t>
+      </w:r>
+      <w:r>
+        <w:t xml:space="preserve">Write 288 at 340% ($5.98), 369 down to 150% ($5.74) and 398 at 187% ($5.74), each with its bound, its loss per order and a rank prediction. Two of the four §6 conditions are not yet shown on these terms. Conversion is unread (0 orders on 7–9 clicks), and there is no sales-velocity window until the 10-26 Lightning Deal. So these steps are tests that earn the conversion read, not a funded climb. Read them at 10-05, and size the funded push for the 10-26 window with §7’s budget.</w:t>
+      </w:r>
+    </w:p>
+    <w:p>
+      <w:pPr>
+        <w:pStyle w:val="Heading1"/>
+      </w:pPr>
+      <w:r>
+        <w:t xml:space="preserve">A3. Three in-focus campaigns with a real record took no clicks in the deal: check down-only suppression before the price rises again</w:t>
+      </w:r>
+    </w:p>
+    <w:p>
+      <w:pPr>
+        <w:spacing w:after="100"/>
+      </w:pPr>
+      <w:r>
+        <w:rPr>
+          <w:b/>
+          <w:bCs/>
+          <w:color w:val="1F3A5F"/>
+        </w:rPr>
+        <w:t xml:space="preserve">The rule (the logic, §10, §12). </w:t>
+      </w:r>
+      <w:r>
+        <w:t xml:space="preserve">Campaign on, no clicks arriving: hold the base and push the modifier only, because cutting the base of a row that isn’t delivering makes delivery worse. Down-only bidding can quietly lower the price at the placement being funded, so a push that is not delivering is checked for suppression before its price is raised again. If it is suppressed, the next move is fixed bidding, stated as a trade. A budget is raised only when it is running out (§6).</w:t>
+      </w:r>
+    </w:p>
+    <w:p>
+      <w:pPr>
+        <w:spacing w:after="100"/>
+      </w:pPr>
+      <w:r>
+        <w:rPr>
+          <w:b/>
+          <w:bCs/>
+          <w:color w:val="1F3A5F"/>
+        </w:rPr>
+        <w:t xml:space="preserve">What the run did. </w:t>
+      </w:r>
+      <w:r>
+        <w:t xml:space="preserve">Raised the modifier on all three, by +25% to +30%, with the base held on two (687, 1002) and cut on the third (293). All three are down-only (LEGACY_FOR_SALES) and spent $0.00 in the last 14 days. The review corrected 293 to hold the price but kept its base cut, and passed the other two.</w:t>
+      </w:r>
+    </w:p>
+    <w:p>
+      <w:pPr>
+        <w:spacing w:after="100"/>
+      </w:pPr>
+      <w:r>
+        <w:rPr>
+          <w:b/>
+          <w:bCs/>
+        </w:rPr>
+        <w:t xml:space="preserve">Bamboo Cooling Sheets King Size-(LSV)-Exact-(Ranking)-DO-BAMBOO-KING-WHITE</w:t>
+      </w:r>
+      <w:r>
+        <w:t xml:space="preserve"> — “bamboo cooling sheets king” rank 27 (37; it held 12 earlier in the window). 90 days: 238 clicks, 29 orders, the best record in the focus. Last 14 days: $0.00. The modifier-only step ($2.55 → $3.19, +25%, inside the $5.74 bound) is the move §12 prescribes. What is missing is §10’s check: a down-only campaign that went from 29 orders to zero spend may be suppressed, not under-priced. The row also says “BUDGET CAPPED … the budget goes first”, but a campaign that spent nothing is not capping, so the budget raise (686) has nothing to fix. Correction: check suppression, the ad and the child (BAMBOO-KING-WHITE) first. If they are clear, load the +25%. If it is suppressed, switch to fixed bids at today’s $2.55, stated as a trade. Drop 686.</w:t>
+      </w:r>
+    </w:p>
+    <w:p>
+      <w:pPr>
+        <w:spacing w:after="100"/>
+      </w:pPr>
+      <w:r>
+        <w:rPr>
+          <w:b/>
+          <w:bCs/>
+        </w:rPr>
+        <w:t xml:space="preserve">Cal King Bamboo Sheets-[Bamboo|California King]-(VLSV)-Exact-(Ranking)-DO-BAMBOO-CALIFKING-WHITE</w:t>
+      </w:r>
+      <w:r>
+        <w:t xml:space="preserve"> — “california king bamboo sheets” rank 10 (7). 90 days: 58 clicks, 7 orders, 91% of them on product pages; last 14 days $0.00. The run cuts the base $1.02 → $0.92 and writes 421% (+25%). The review corrected it to 317%, holding $3.84, which is a distribution fix. The logic reads it the other way: with no clicks arriving there is no distribution to fix (§10: “none arriving means there is no distribution to fix — hold the base and move the modifier only”). The 91% is a 90-day mix of clicks that have stopped. Correction: hold the $1.02 base and drop 296 and 297. Run the §10 suppression check, then take a modifier-only step toward the $6.62 bound if it clears.</w:t>
+      </w:r>
+    </w:p>
+    <w:p>
+      <w:pPr>
+        <w:spacing w:after="100"/>
+      </w:pPr>
+      <w:r>
+        <w:rPr>
+          <w:b/>
+          <w:bCs/>
+        </w:rPr>
+        <w:t xml:space="preserve">Cooling Bamboo Sheets Queen Size-[Bamboo|Cooling]-(LSV)-Exact-(Ranking)-DO-BAMBOO-QUEEN-WHITE</w:t>
+      </w:r>
+      <w:r>
+        <w:t xml:space="preserve"> — “cooling bamboo sheets queen size” rank 55 (43; 11 earlier in the window). 90 days: 54 clicks, 7 orders, but no top-of-search impressions at all, and $0.00 in the last 14 days. The modifier-only step (69% → 119%, $1.67 → $2.17) fits §12. The prediction does not: 0 → 32 top-of-search clicks a week, priced in the outcome at $35.22 a day on a $9.94 budget, with a rank claim of 55 → 11 in two weeks, while the Rank tab lists the term as “not pushed”. It also advertises BAMBOO-QUEEN-WHITE, the Queen hero the run pivots off, and is not among the 33 Queen re-points. Correction: suppression check first, then the step. Re-point it to BAMBOO-QUEEN-OLIVE, re-derive the base from Olive (§8, bound 1), and cut the claim to what the book buys on a +30% step (about ×2.6 of today’s near-zero).</w:t>
+      </w:r>
+    </w:p>
+    <w:p>
+      <w:pPr>
+        <w:spacing w:after="100"/>
+      </w:pPr>
+      <w:r>
+        <w:rPr>
+          <w:b/>
+          <w:bCs/>
+          <w:color w:val="1F3A5F"/>
+        </w:rPr>
+        <w:t xml:space="preserve">Correction. </w:t>
+      </w:r>
+      <w:r>
+        <w:t xml:space="preserve">Run the §10 check on all three before loading. 526 (Bamboo California King Sheets) is serving but has the same forecasting fault: it predicts 0.23 → 32 top-of-search clicks a week from an +11% step and is priced at $21.79 a day on a $10 budget. Keep its step and cut its claim to under one click a week.</w:t>
+      </w:r>
+    </w:p>
+    <w:p>
+      <w:pPr>
+        <w:pStyle w:val="Heading1"/>
+      </w:pPr>
+      <w:r>
+        <w:t xml:space="preserve">A4. California King: the push goes on the size with the least stock, re-pointed to a child the tracker may not read</w:t>
       </w:r>
     </w:p>
     <w:p>
@@ -4667,7 +5005,7 @@
         <w:t xml:space="preserve">The rule. </w:t>
       </w:r>
       <w:r>
-        <w:t xml:space="preserve">A dose push buys a term up to the click count at which past pushes moved rank: 15 paid clicks a week for 14 days. Its size is still bounded: one delivery-gap step per write, inside the loss stop, with the budget that lets the step spend. These rows expect to fall short themselves. The book’s largest step bought ×3.76 where these need ×5 to ×10, and the rows put their own odds at “about 20%”. A step like that is a probe, and a probe is sized to earn the read, not taken all the way to the ceiling.</w:t>
+        <w:t xml:space="preserve">First check which child the rank tracker reads for each term. If the ad moves to another child, the push buys sales the tracker doesn’t watch, and the read shows a miss that is not one. A push on a child that runs out before the next arrival rents the position instead of buying it.</w:t>
       </w:r>
     </w:p>
     <w:p>
@@ -4683,52 +5021,127 @@
         <w:t xml:space="preserve">What the run did. </w:t>
       </w:r>
       <w:r>
-        <w:t xml:space="preserve">Raised all three by +75% (288, 369, 398). Their budget halves were held by the code check, and the review passed all three.</w:t>
-      </w:r>
-    </w:p>
-    <w:p>
-      <w:pPr>
-        <w:spacing w:after="100"/>
+        <w:t xml:space="preserve">Re-pointed 15 California King campaigns from BAMBOO-CALIFKING-WHITE to BAMBOO-CALIFKING-BURGUNDY-NEW (2151, 2154, 2157, 2159, 2160, 2161, 2167, 2169, 2176, 2178, 2191, 2194, 2204, 2208, 2211). Every California King push row still names its rank target “on BAMBOO-CALIFKING-WHITE”.</w:t>
+      </w:r>
+    </w:p>
+    <w:p>
+      <w:pPr>
+        <w:pStyle w:val="ListParagraph"/>
+        <w:numPr>
+          <w:ilvl w:val="0"/>
+          <w:numId w:val="2"/>
+        </w:numPr>
+        <w:spacing w:after="60"/>
       </w:pPr>
       <w:r>
         <w:rPr>
           <w:b/>
           <w:bCs/>
         </w:rPr>
-        <w:t xml:space="preserve">Bamboo Cooling Sheets King Size-[Bamboo|Cooling]-(LSV)-Exact-(Ranking)-DO-BAMBOO-KING-WHITE</w:t>
-      </w:r>
-      <w:r>
-        <w:t xml:space="preserve"> — “bamboo cooling sheets king size” rank 31 (35 thirty days ago). It held 7 earlier in the window, so 24 positions have been lost. 90 days: 7 clicks, 0 orders; 3 top-of-search clicks on 141 impressions, top-of-search impression share 0.51%. It takes 1.5 paid clicks a week against a dose of 15. The run writes modifier 200% → 425%: top of search $6.90 → $12.07. At 13.7% a top-of-search order then costs $88, past the $73.47 loss stop. The same row’s BASE WRITE says the modifier “is held to 200%” by the market bound ($5.74), and its TIMELINE says “not pushed this run”, yet the column writes 425%. The budget half ($11.42 → $22.91) is held, so at about $8.89 a click the campaign can buy 1.3 clicks a day against the 2.1 the dose needs. Correction: +30% (10% of the dose delivered): top of search $8.97, modifier 290% on the $2.30 base, about $65 a top-of-search order. Load the budget raise to $22.91 and name the cause of the fall from 7 to 31 the same day.</w:t>
-      </w:r>
-    </w:p>
-    <w:p>
-      <w:pPr>
-        <w:spacing w:after="100"/>
+        <w:t xml:space="preserve">Stock. </w:t>
+      </w:r>
+      <w:r>
+        <w:t xml:space="preserve">The hero, White, has 44 units: 27 days at 1.63 a day, 18 at the push pace. There is no dated arrival, and the next PO is 11-05 for 36 units. Burgundy-New has 76. The size holds 495 units across 16 colours (54 days).</w:t>
+      </w:r>
+    </w:p>
+    <w:p>
+      <w:pPr>
+        <w:pStyle w:val="ListParagraph"/>
+        <w:numPr>
+          <w:ilvl w:val="0"/>
+          <w:numId w:val="2"/>
+        </w:numPr>
+        <w:spacing w:after="60"/>
       </w:pPr>
       <w:r>
         <w:rPr>
           <w:b/>
           <w:bCs/>
         </w:rPr>
-        <w:t xml:space="preserve">Bamboo Sheets California King-(LSV)-Exact-(Ranking)-DO-BAMBOO-CALIFKING-WHITE</w:t>
-      </w:r>
-      <w:r>
-        <w:t xml:space="preserve"> — “bamboo sheets california king” rank 16, from 4 thirty days ago (12 positions lost). 90 days: 9 clicks, 0 orders; top-of-search impression share 2.82%. It takes 3 paid clicks a week against 15. The run writes 238% → 491%: $4.60 → $8.04 (+75%), about $59 a top-of-search order, against the row’s own $3.51 ceiling and $6.62 market bound. The same row’s “certain-win press” section holds this term because “the child that serves the term has no stock room”. It prices the prize at about 0.4 orders a week ($4.83 a day in sales), while the dose costs $9.69 a day. Row 2161 moves this campaign’s ad to BAMBOO-CALIFKING-BURGUNDY-NEW while the rank target is read on BAMBOO-CALIFKING-WHITE (A4). Correction: +30%: top of search $5.98, modifier 340% on the $1.36 base, about $44 an order. Load the budget to $13.98 and confirm the tracked child before the re-point.</w:t>
-      </w:r>
-    </w:p>
-    <w:p>
-      <w:pPr>
-        <w:spacing w:after="100"/>
+        <w:t xml:space="preserve">What the deal did here. </w:t>
+      </w:r>
+      <w:r>
+        <w:t xml:space="preserve">09-15 → 09-27: $16 a day, 50 clicks, 4 orders, ACoS 67.9%, CVR 8.0% (21.4% in the 13 days before). Group rank (7-day median) went from 19 to 17.</w:t>
+      </w:r>
+    </w:p>
+    <w:p>
+      <w:pPr>
+        <w:pStyle w:val="ListParagraph"/>
+        <w:numPr>
+          <w:ilvl w:val="0"/>
+          <w:numId w:val="2"/>
+        </w:numPr>
+        <w:spacing w:after="60"/>
       </w:pPr>
       <w:r>
         <w:rPr>
           <w:b/>
           <w:bCs/>
         </w:rPr>
-        <w:t xml:space="preserve">Cooling Bamboo Sheets-[Bamboo|Cooling]-(MSV)-Exact-(Ranking)-DO-BAMBOO-KING-WHITE</w:t>
-      </w:r>
-      <w:r>
-        <w:t xml:space="preserve"> — “cooling bamboo sheets” rank 12, climbing from 30. The engine reads it as a “cold push” with no loss. 90 days: 7 clicks, 0 orders; top-of-search impression share 1.27%. The run writes 130% → 302%: $4.60 → $8.04. The row’s own prose says “the run had written 187%”, and its PRICES line still quotes $5.32 a click and $38.80 an order. The figures a reviewer reads are not the ones it writes. Correction: +30%: $5.98, modifier 199% on the $2.00 base; load the budget to $14.21. This term climbed 18 places without a dose, and a +30% step keeps it moving at about half the cost.</w:t>
+        <w:t xml:space="preserve">Keyword ranks (tracker). </w:t>
+      </w:r>
+      <w:r>
+        <w:t xml:space="preserve">“bamboo sheets california king” 4 → 16, “bamboo sheets cal king” 23 → 39, “bamboo sheets california king size” 19 → 30, “california king bamboo sheets” 7 → 10.</w:t>
+      </w:r>
+    </w:p>
+    <w:p>
+      <w:pPr>
+        <w:pStyle w:val="ListParagraph"/>
+        <w:numPr>
+          <w:ilvl w:val="0"/>
+          <w:numId w:val="2"/>
+        </w:numPr>
+        <w:spacing w:after="60"/>
+      </w:pPr>
+      <w:r>
+        <w:rPr>
+          <w:b/>
+          <w:bCs/>
+        </w:rPr>
+        <w:t xml:space="preserve">Two pushed terms have no rank on file. </w:t>
+      </w:r>
+      <w:r>
+        <w:t xml:space="preserve">“bamboo cal king sheets” (462) is unranked, and “california king sheets bamboo” (571) has only a 26 June reading. The engine gates both to “change → HOLD” and still writes +25%. The logic (§6, fourth row of its table) says a term with no rank on file is “enabled at the ceiling with no premium” and becomes a push candidate once a rank read exists. Both sit above their ceilings today ($4.82 against $3.51, and $4.75 against $3.77) with almost no delivery. §10 allows “any size, straight to the derived price” for a row with no delivery. Correction: 462 → $3.51 (modifier 255% on $0.99); 571 → $3.77 (modifier 98% on $1.90).</w:t>
+      </w:r>
+    </w:p>
+    <w:p>
+      <w:pPr>
+        <w:pStyle w:val="ListParagraph"/>
+        <w:numPr>
+          <w:ilvl w:val="0"/>
+          <w:numId w:val="2"/>
+        </w:numPr>
+        <w:spacing w:after="60"/>
+      </w:pPr>
+      <w:r>
+        <w:rPr>
+          <w:b/>
+          <w:bCs/>
+        </w:rPr>
+        <w:t xml:space="preserve">The base follows the serving child. </w:t>
+      </w:r>
+      <w:r>
+        <w:t xml:space="preserve">The logic’s first bound is that the base is derived from the serving child, never inherited (§8). The 15 re-points change the serving child, but the rows keep bases and ceilings built on lane figures. Re-derive them from Burgundy-New’s contribution and product-page rate in the same write.</w:t>
+      </w:r>
+    </w:p>
+    <w:p>
+      <w:pPr>
+        <w:pStyle w:val="ListParagraph"/>
+        <w:numPr>
+          <w:ilvl w:val="0"/>
+          <w:numId w:val="2"/>
+        </w:numPr>
+        <w:spacing w:after="60"/>
+      </w:pPr>
+      <w:r>
+        <w:rPr>
+          <w:b/>
+          <w:bCs/>
+        </w:rPr>
+        <w:t xml:space="preserve">A child that cannot ship voids the read. </w:t>
+      </w:r>
+      <w:r>
+        <w:t xml:space="preserve">The logic (§12) says reads are void when the serving child cannot ship. White is under its horizon, which is why the size pivots, so any California King rate read on White is not a basis for pricing the Burgundy-New ads.</w:t>
       </w:r>
     </w:p>
     <w:p>
@@ -4744,7 +5157,7 @@
         <w:t xml:space="preserve">Correction. </w:t>
       </w:r>
       <w:r>
-        <w:t xml:space="preserve">Write the three dose rows at +30% (288 → 340%, 369 → 290%, 398 → 199%) with their budget raises, and read them at the day-7 checkpoint (10-05). If clicks are still short and impression share rose, step again. The dose arrives in two or three reads, not one jump.</w:t>
+        <w:t xml:space="preserve">Confirm which child the tracker reads for the California King terms before the 15 re-points load. If it reads White, there are two options. Keep the pushed campaigns (288, 374, 526) on White and accept 44 units as the limit of the read. Or move them, and grade the push on Burgundy-New’s sales rather than on the White rank. Name the cause of the fall from 4 to 16 on the head California King term the same day: the rival now ahead, the child, or the listing. Part D asks whether California King belongs in the focus at all.</w:t>
       </w:r>
     </w:p>
     <w:p>
@@ -4752,7 +5165,7 @@
         <w:pStyle w:val="Heading1"/>
       </w:pPr>
       <w:r>
-        <w:t xml:space="preserve">A3. Three in-focus campaigns with a real record went dark — the run climbs the price instead of restoring them</w:t>
+        <w:t xml:space="preserve">A5. Focus terms the run does not push, including the largest one</w:t>
       </w:r>
     </w:p>
     <w:p>
@@ -4768,224 +5181,7 @@
         <w:t xml:space="preserve">The rule. </w:t>
       </w:r>
       <w:r>
-        <w:t xml:space="preserve">A campaign with a record that stopped serving usually stopped after a change. Put back the values it last served at, and check the ad, the child it advertises and eligibility the same day. A price climb on a campaign that isn’t in the auction doesn’t show.</w:t>
-      </w:r>
-    </w:p>
-    <w:p>
-      <w:pPr>
-        <w:spacing w:after="100"/>
-      </w:pPr>
-      <w:r>
-        <w:rPr>
-          <w:b/>
-          <w:bCs/>
-          <w:color w:val="1F3A5F"/>
-        </w:rPr>
-        <w:t xml:space="preserve">What the run did. </w:t>
-      </w:r>
-      <w:r>
-        <w:t xml:space="preserve">Raised the top-of-search price on all three by +25% to +30%. The review corrected one (293) to hold the price and passed the other two.</w:t>
-      </w:r>
-    </w:p>
-    <w:p>
-      <w:pPr>
-        <w:spacing w:after="100"/>
-      </w:pPr>
-      <w:r>
-        <w:rPr>
-          <w:b/>
-          <w:bCs/>
-        </w:rPr>
-        <w:t xml:space="preserve">Bamboo Cooling Sheets King Size-(LSV)-Exact-(Ranking)-DO-BAMBOO-KING-WHITE</w:t>
-      </w:r>
-      <w:r>
-        <w:t xml:space="preserve"> — “bamboo cooling sheets king” rank 27 (37; it held 12 earlier in the window). 90 days: 238 clicks, 29 orders, the best record in the focus. Last 14 days: $0.00 spent. The row says “BUDGET CAPPED … the budget goes first, the price holds … no climb on this campaign this run” and then writes the opposite. The modifier climbs 101% → 151% ($2.55 → $3.19), while the budget half (686, $5 → $6.51) is held by the code check. A campaign that spent nothing in 14 days is not budget-capped; it is not serving. Correction: no price move. Check the ad, the child (BAMBOO-KING-WHITE) and eligibility today, restore the values it last served at, then take the delivery-gap step.</w:t>
-      </w:r>
-    </w:p>
-    <w:p>
-      <w:pPr>
-        <w:spacing w:after="100"/>
-      </w:pPr>
-      <w:r>
-        <w:rPr>
-          <w:b/>
-          <w:bCs/>
-        </w:rPr>
-        <w:t xml:space="preserve">Cal King Bamboo Sheets-[Bamboo|California King]-(VLSV)-Exact-(Ranking)-DO-BAMBOO-CALIFKING-WHITE</w:t>
-      </w:r>
-      <w:r>
-        <w:t xml:space="preserve"> — “california king bamboo sheets” rank 10 (7). 90 days: 58 clicks, 7 orders; last 14 days $0.00. The run’s thin fix cuts the base $1.02 → $0.92 and writes 421%. The review caught that as a +25% climb and corrected it to 317%, holding top of search at $3.84. The base cut (296, 297) still ships. On a campaign that isn’t serving, a lower base makes it darker; the engine’s own rule (team document §12) is not to cut the base of a row that isn’t delivering. Correction: hold 276% and the $1.02 base, and drop 296 and 297, until it serves again.</w:t>
-      </w:r>
-    </w:p>
-    <w:p>
-      <w:pPr>
-        <w:spacing w:after="100"/>
-      </w:pPr>
-      <w:r>
-        <w:rPr>
-          <w:b/>
-          <w:bCs/>
-        </w:rPr>
-        <w:t xml:space="preserve">Cooling Bamboo Sheets Queen Size-[Bamboo|Cooling]-(LSV)-Exact-(Ranking)-DO-BAMBOO-QUEEN-WHITE</w:t>
-      </w:r>
-      <w:r>
-        <w:t xml:space="preserve"> — “cooling bamboo sheets queen size” rank 55 (43; 11 earlier in the window). 90 days: 54 clicks, 7 orders, but 0 top-of-search impressions, and $0.00 in the last 14 days. The run writes 69% → 119% and predicts 0 → 32 top-of-search clicks a week, with a rank claim of 55 → 11 in two weeks. The outcome prices it at $35.22 a day on a $9.94 budget. The Rank tab lists the same term as “not pushed”. It advertises BAMBOO-QUEEN-WHITE, the Queen hero the run pivots off, and is not among the 33 Queen re-points. Correction: no price move and no claim until it serves. Check the ad and eligibility, and re-point it to BAMBOO-QUEEN-OLIVE with the other Queen campaigns.</w:t>
-      </w:r>
-    </w:p>
-    <w:p>
-      <w:pPr>
-        <w:spacing w:after="100"/>
-      </w:pPr>
-      <w:r>
-        <w:rPr>
-          <w:b/>
-          <w:bCs/>
-          <w:color w:val="1F3A5F"/>
-        </w:rPr>
-        <w:t xml:space="preserve">Correction. </w:t>
-      </w:r>
-      <w:r>
-        <w:t xml:space="preserve">All three: find why they went dark before any price moves. 526 (Bamboo California King Sheets) is still serving but has the same forecasting fault: it predicts 0.23 → 32 top-of-search clicks a week from an +11% step and is priced at $21.79 a day on a $10 budget. Keep its step, and cut its claim to what the book buys (about ×2.6, under one click a week).</w:t>
-      </w:r>
-    </w:p>
-    <w:p>
-      <w:pPr>
-        <w:pStyle w:val="Heading1"/>
-      </w:pPr>
-      <w:r>
-        <w:t xml:space="preserve">A4. California King: the push goes on the size with the least stock, re-pointed to a child the tracker may not read</w:t>
-      </w:r>
-    </w:p>
-    <w:p>
-      <w:pPr>
-        <w:spacing w:after="100"/>
-      </w:pPr>
-      <w:r>
-        <w:rPr>
-          <w:b/>
-          <w:bCs/>
-          <w:color w:val="1F3A5F"/>
-        </w:rPr>
-        <w:t xml:space="preserve">The rule. </w:t>
-      </w:r>
-      <w:r>
-        <w:t xml:space="preserve">First check which child the rank tracker reads for each term. If the ad moves to another child, the push buys sales the tracker doesn’t watch, and the read shows a miss that is not one. A push on a child that runs out before the next arrival rents the position instead of buying it.</w:t>
-      </w:r>
-    </w:p>
-    <w:p>
-      <w:pPr>
-        <w:spacing w:after="100"/>
-      </w:pPr>
-      <w:r>
-        <w:rPr>
-          <w:b/>
-          <w:bCs/>
-          <w:color w:val="1F3A5F"/>
-        </w:rPr>
-        <w:t xml:space="preserve">What the run did. </w:t>
-      </w:r>
-      <w:r>
-        <w:t xml:space="preserve">Re-pointed 15 California King campaigns from BAMBOO-CALIFKING-WHITE to BAMBOO-CALIFKING-BURGUNDY-NEW (2151, 2154, 2157, 2159, 2160, 2161, 2167, 2169, 2176, 2178, 2191, 2194, 2204, 2208, 2211). Every California King push row still names its rank target “on BAMBOO-CALIFKING-WHITE”.</w:t>
-      </w:r>
-    </w:p>
-    <w:p>
-      <w:pPr>
-        <w:pStyle w:val="ListParagraph"/>
-        <w:numPr>
-          <w:ilvl w:val="0"/>
-          <w:numId w:val="2"/>
-        </w:numPr>
-        <w:spacing w:after="60"/>
-      </w:pPr>
-      <w:r>
-        <w:rPr>
-          <w:b/>
-          <w:bCs/>
-        </w:rPr>
-        <w:t xml:space="preserve">Stock. </w:t>
-      </w:r>
-      <w:r>
-        <w:t xml:space="preserve">The hero, White, has 44 units: 27 days at 1.63 a day, 18 at the push pace. There is no dated arrival, and the next PO is 11-05 for 36 units. Burgundy-New has 76. The size holds 495 units across 16 colours (54 days).</w:t>
-      </w:r>
-    </w:p>
-    <w:p>
-      <w:pPr>
-        <w:pStyle w:val="ListParagraph"/>
-        <w:numPr>
-          <w:ilvl w:val="0"/>
-          <w:numId w:val="2"/>
-        </w:numPr>
-        <w:spacing w:after="60"/>
-      </w:pPr>
-      <w:r>
-        <w:rPr>
-          <w:b/>
-          <w:bCs/>
-        </w:rPr>
-        <w:t xml:space="preserve">What the deal did here. </w:t>
-      </w:r>
-      <w:r>
-        <w:t xml:space="preserve">09-15 → 09-27: $16 a day, 50 clicks, 4 orders, ACoS 67.9%, CVR 8.0% (21.4% in the 13 days before). Group rank (7-day median) went from 19 to 17.</w:t>
-      </w:r>
-    </w:p>
-    <w:p>
-      <w:pPr>
-        <w:pStyle w:val="ListParagraph"/>
-        <w:numPr>
-          <w:ilvl w:val="0"/>
-          <w:numId w:val="2"/>
-        </w:numPr>
-        <w:spacing w:after="60"/>
-      </w:pPr>
-      <w:r>
-        <w:rPr>
-          <w:b/>
-          <w:bCs/>
-        </w:rPr>
-        <w:t xml:space="preserve">Keyword ranks (tracker). </w:t>
-      </w:r>
-      <w:r>
-        <w:t xml:space="preserve">“bamboo sheets california king” 4 → 16, “bamboo sheets cal king” 23 → 39, “bamboo sheets california king size” 19 → 30, “california king bamboo sheets” 7 → 10.</w:t>
-      </w:r>
-    </w:p>
-    <w:p>
-      <w:pPr>
-        <w:spacing w:after="100"/>
-      </w:pPr>
-      <w:r>
-        <w:rPr>
-          <w:b/>
-          <w:bCs/>
-          <w:color w:val="1F3A5F"/>
-        </w:rPr>
-        <w:t xml:space="preserve">Correction. </w:t>
-      </w:r>
-      <w:r>
-        <w:t xml:space="preserve">Confirm which child the tracker reads for the California King terms before the 15 re-points load. If it reads White, there are two options. Keep the pushed campaigns (288, 374, 462, 526, 571) on White and accept 44 units as the limit of the read. Or move them, and grade the push on Burgundy-New’s sales rather than on the White rank. Name the cause of the fall from 4 to 16 on the head California King term the same day: the rival now ahead, the child, or the listing. Part D asks whether California King belongs in the focus at all.</w:t>
-      </w:r>
-    </w:p>
-    <w:p>
-      <w:pPr>
-        <w:pStyle w:val="Heading1"/>
-      </w:pPr>
-      <w:r>
-        <w:t xml:space="preserve">A5. Focus terms the run does not push, including the largest one</w:t>
-      </w:r>
-    </w:p>
-    <w:p>
-      <w:pPr>
-        <w:spacing w:after="100"/>
-      </w:pPr>
-      <w:r>
-        <w:rPr>
-          <w:b/>
-          <w:bCs/>
-          <w:color w:val="1F3A5F"/>
-        </w:rPr>
-        <w:t xml:space="preserve">The rule. </w:t>
-      </w:r>
-      <w:r>
-        <w:t xml:space="preserve">The focus is a group. Every term in it with a rank gap gets the step or a written reason. A term that lost more than 10 positions is pushed, and its cause is named the same day.</w:t>
+        <w:t xml:space="preserve">The focus is a group. Every term in it with a rank gap gets a capped step toward its target, or a written reason why not. A term that collapsed more than 10 positions despite delivery gets no more spend until the cause is named: the listing, then the competitor now ahead, then whether the fall is category-wide (the logic, §12).</w:t>
       </w:r>
     </w:p>
     <w:p>
@@ -6051,7 +6247,7 @@
         <w:t xml:space="preserve">Correction. </w:t>
       </w:r>
       <w:r>
-        <w:t xml:space="preserve">Write the focus term list with each term’s owning campaign. Step each short term by the delivery gap or write down why not, and name the causes of the nine falls. Re-point 31’s ad to a serving child with room (the review’s choice for this term’s brand ads is BAMBOO-KING-CREME), and read record 2150 at the 10-02 checkpoint before re-proposing its price.</w:t>
+        <w:t xml:space="preserve">Write the focus term list with each term’s owning campaign. Give each short term a capped step toward its gap-set target inside its bound, or write down why not, and name the causes of the nine falls. Re-point 31’s ad to a serving child with room (the review’s choice for this term’s brand ads is BAMBOO-KING-CREME), and read record 2150 at the 10-02 checkpoint before re-proposing its price.</w:t>
       </w:r>
     </w:p>
     <w:p>
@@ -6067,7 +6263,7 @@
         <w:pStyle w:val="Heading1"/>
       </w:pPr>
       <w:r>
-        <w:t xml:space="preserve">B1. The flagship “Bamboo Sheets” campaign: held at deal spend, its decision left in a hold row</w:t>
+        <w:t xml:space="preserve">B1. The flagship “Bamboo Sheets” campaign: the hold is right, but it is not written as the funding decision it is</w:t>
       </w:r>
     </w:p>
     <w:p>
@@ -6080,10 +6276,10 @@
           <w:bCs/>
           <w:color w:val="1F3A5F"/>
         </w:rPr>
-        <w:t xml:space="preserve">The rule. </w:t>
-      </w:r>
-      <w:r>
-        <w:t xml:space="preserve">After the deal (21 September document), a campaign short of its requirement does not keep climbing. It steps down toward break-even over two writes four days apart, unless its 7-day rank has reached the target range. The run’s own taper is one −10% rung per run, starting with the modifier.</w:t>
+        <w:t xml:space="preserve">The rule (the logic, §6, §11, §14). </w:t>
+      </w:r>
+      <w:r>
+        <w:t xml:space="preserve">A push is not cut back until it has delivered 70% of its required top-of-search clicks a day with product pages under 20%. Below that there are three verdicts only: continue, fix delivery, or stop on the dated loss ceiling. When delivery is short and the budget is running out, the budget is the cause, not the price. A push that cannot be funded is stated with its shortfall and becomes a decision: fund it, or hold it with the number named.</w:t>
       </w:r>
     </w:p>
     <w:p>
@@ -6145,7 +6341,7 @@
         <w:t xml:space="preserve">Correction. </w:t>
       </w:r>
       <w:r>
-        <w:t xml:space="preserve">Put the flagship on the owner’s list today (Part D), with both options priced. If the focus stands, take the first taper rung now: modifier 299% → 259% and top of search $7.42 → $6.68, with the $1.86 base held and the budget following next run. Read share, clicks and the Bamboo 7-day rank at 7 days, and restore one step if the median loses more than 3 positions. Don’t leave $319 a day at deal prices with no one deciding. For “bamboo sheets king size”, name the cause of the 11-position fall before the reshape loads.</w:t>
+        <w:t xml:space="preserve">The engine’s hold is what §14 requires. The campaign delivered about 68% of 490 in the deal and 16% on its 90-day read, so both the 21 September step-down to break-even and the run’s own −10% taper would cut a push that never received its clicks. I withdraw the taper rung I proposed in the first version of this document. What is missing is §11. At today’s $7.42, 490 clicks a week is 70 a day, or $519 a day, against a $340 budget that is already spending $319 (94%): a $179-a-day shortfall, and budget is the first cause §6 names. At 12.9% top-of-search conversion each order costs about $57.50 against $24.49 contribution, so funding it fully is roughly $300 a day of deliberate loss. Write it as one decision row for the owner by 09-30 (Part D): fund it at $519 a day at today’s price with no climb, or stop it on a dated loss ceiling. For “bamboo sheets king size”, name the cause of the 11-position fall before the reshape loads (§12: a collapse of more than 10 positions is never answered with spend).</w:t>
       </w:r>
     </w:p>
     <w:p>
@@ -8707,6 +8903,135 @@
         <w:pStyle w:val="Heading1"/>
       </w:pPr>
       <w:r>
+        <w:t xml:space="preserve">C1b. Every 14-day read in this run is a deal read</w:t>
+      </w:r>
+    </w:p>
+    <w:p>
+      <w:pPr>
+        <w:spacing w:after="100"/>
+      </w:pPr>
+      <w:r>
+        <w:rPr>
+          <w:b/>
+          <w:bCs/>
+          <w:color w:val="1F3A5F"/>
+        </w:rPr>
+        <w:t xml:space="preserve">The rule (the logic, §12). </w:t>
+      </w:r>
+      <w:r>
+        <w:t xml:space="preserve">“Two conditions void every read above. The serving child cannot ship, or a deal week sits inside the window and contaminates every rate. Resolve those first.”</w:t>
+      </w:r>
+    </w:p>
+    <w:p>
+      <w:pPr>
+        <w:spacing w:after="100"/>
+      </w:pPr>
+      <w:r>
+        <w:rPr>
+          <w:b/>
+          <w:bCs/>
+          <w:color w:val="1F3A5F"/>
+        </w:rPr>
+        <w:t xml:space="preserve">What the run did. </w:t>
+      </w:r>
+      <w:r>
+        <w:t xml:space="preserve">Read its 14-day window (09-14 → 09-27), 13 of whose 14 days are deal days. That window feeds the outcome baseline, budget use, placement mix, the dose rows’ “last two weeks” of clicks and the sweep’s ACoS reads. The 90-day figures carry the same 13 deal days. The second void condition is live too: the Full and Twin heroes are at zero, and the Queen and California King heroes are under their horizon.</w:t>
+      </w:r>
+    </w:p>
+    <w:p>
+      <w:pPr>
+        <w:spacing w:after="100"/>
+      </w:pPr>
+      <w:r>
+        <w:rPr>
+          <w:b/>
+          <w:bCs/>
+          <w:color w:val="1F3A5F"/>
+        </w:rPr>
+        <w:t xml:space="preserve">Correction. </w:t>
+      </w:r>
+      <w:r>
+        <w:t xml:space="preserve">Treat every row sized on a 14-day read as provisional. Load the stock and hygiene rows now: re-points to serving children, pauses, walls, and renames that match the child. Re-read the price rows on the first seven post-deal days as they settle (09-29 → 10-05, attribution complete by 10-12). The capped steps in A2 go ahead because they are tests of a condition, not reads of one.</w:t>
+      </w:r>
+    </w:p>
+    <w:p>
+      <w:pPr>
+        <w:pStyle w:val="Heading1"/>
+      </w:pPr>
+      <w:r>
+        <w:t xml:space="preserve">C1c. Where the run already follows the logic</w:t>
+      </w:r>
+    </w:p>
+    <w:p>
+      <w:pPr>
+        <w:pStyle w:val="ListParagraph"/>
+        <w:numPr>
+          <w:ilvl w:val="0"/>
+          <w:numId w:val="2"/>
+        </w:numPr>
+        <w:spacing w:after="60"/>
+      </w:pPr>
+      <w:r>
+        <w:t xml:space="preserve">Reshapes hold the top-of-search price to the cent while the base comes down: 13 of the out-of-focus reshapes (§9: the price never falls as a residue of a base cut).</w:t>
+      </w:r>
+    </w:p>
+    <w:p>
+      <w:pPr>
+        <w:pStyle w:val="ListParagraph"/>
+        <w:numPr>
+          <w:ilvl w:val="0"/>
+          <w:numId w:val="2"/>
+        </w:numPr>
+        <w:spacing w:after="60"/>
+      </w:pPr>
+      <w:r>
+        <w:t xml:space="preserve">Rest-of-search modifiers go to 0% on seven campaigns (71, 88, 371, 382, 522, 913, 1195), per §8: rest of search sits at zero until it earns a lift.</w:t>
+      </w:r>
+    </w:p>
+    <w:p>
+      <w:pPr>
+        <w:pStyle w:val="ListParagraph"/>
+        <w:numPr>
+          <w:ilvl w:val="0"/>
+          <w:numId w:val="2"/>
+        </w:numPr>
+        <w:spacing w:after="60"/>
+      </w:pPr>
+      <w:r>
+        <w:t xml:space="preserve">Rows with no clicks arriving keep their base and move the modifier only (687, 1002, 526; §12).</w:t>
+      </w:r>
+    </w:p>
+    <w:p>
+      <w:pPr>
+        <w:pStyle w:val="ListParagraph"/>
+        <w:numPr>
+          <w:ilvl w:val="0"/>
+          <w:numId w:val="2"/>
+        </w:numPr>
+        <w:spacing w:after="60"/>
+      </w:pPr>
+      <w:r>
+        <w:t xml:space="preserve">The flagship is not cut while its delivery is under 70% of requirement (§14).</w:t>
+      </w:r>
+    </w:p>
+    <w:p>
+      <w:pPr>
+        <w:pStyle w:val="ListParagraph"/>
+        <w:numPr>
+          <w:ilvl w:val="0"/>
+          <w:numId w:val="2"/>
+        </w:numPr>
+        <w:spacing w:after="60"/>
+      </w:pPr>
+      <w:r>
+        <w:t xml:space="preserve">Priced rows state both prices and the ratio, for example “Top of search $5.32 against $1.36 on product pages, 3.91 to one” (§5). On the dose rows the stated prices are stale (A2).</w:t>
+      </w:r>
+    </w:p>
+    <w:p>
+      <w:pPr>
+        <w:pStyle w:val="Heading1"/>
+      </w:pPr>
+      <w:r>
         <w:t xml:space="preserve">C2. Conversions, discovery and product-targeting campaigns: the sweep cuts the modifier on nearly all of them</w:t>
       </w:r>
     </w:p>
@@ -9106,10 +9431,10 @@
           <w:b/>
           <w:bCs/>
         </w:rPr>
-        <w:t xml:space="preserve">40 rows the engine itself gates to HOLD </w:t>
-      </w:r>
-      <w:r>
-        <w:t xml:space="preserve">(“change → HOLD”; 39 passed by the review): 71–77, 86, 88–91, 93, 94, 121–123, 127, 130, 149, 156, 159, 160, 170, 173, 239, 242, 270, 273–276, 278, 403, 462, 493, 522, 571, 913, 1195.</w:t>
+        <w:t xml:space="preserve">38 rows the engine itself gates to HOLD </w:t>
+      </w:r>
+      <w:r>
+        <w:t xml:space="preserve">(“change → HOLD”; the review passed all but 493): 71–77, 86, 88–91, 93, 94, 121–123, 127, 130, 149, 156, 159, 160, 170, 173, 239, 242, 270, 273–276, 278, 403, 493, 522, 913, 1195. The two others in the same gate, 462 and 571, are corrected to the ceiling instead (A4).</w:t>
       </w:r>
     </w:p>
     <w:p>
@@ -9206,10 +9531,10 @@
           <w:b/>
           <w:bCs/>
         </w:rPr>
-        <w:t xml:space="preserve">To correct, not pull: </w:t>
-      </w:r>
-      <w:r>
-        <w:t xml:space="preserve">288, 369, 398 to +30% (A2); 687 and 1002 to no move until they serve, and 296 and 297 dropped (A3); 526’s claim; and 2147 (a budget of $5.37 → $13.05, +143%, while its text says “inside a single +30% step”) capped at $6.98.</w:t>
+        <w:t xml:space="preserve">Four more from the logic: </w:t>
+      </w:r>
+      <w:r>
+        <w:t xml:space="preserve">296 and 297 (base cuts on a campaign with no clicks arriving, §12); 368 (369’s budget already covers its corrected price); 686 (687 is not spending, so a budget raise has nothing to fix, §6).</w:t>
       </w:r>
     </w:p>
     <w:p>
@@ -9226,10 +9551,10 @@
           <w:b/>
           <w:bCs/>
         </w:rPr>
-        <w:t xml:space="preserve">To load by hand: </w:t>
-      </w:r>
-      <w:r>
-        <w:t xml:space="preserve">the four in-focus budget raises the code check held (287, 368, 397, 686). The check failed, not the rows. The three idle pauses (2000, 2254, 2255) are harmless hygiene and can load or wait.</w:t>
+        <w:t xml:space="preserve">Nine to correct, not pull: </w:t>
+      </w:r>
+      <w:r>
+        <w:t xml:space="preserve">288 → 340% ($5.98), 369 down to 150% ($5.74), 398 → 187% ($5.74) (A2); 462 → 255% ($3.51) and 571 → 98% ($3.77) (A4); 293 held at 276% on its $1.02 base, 1002 re-pointed with its claim cut, and 526’s claim (A3); 2147, a budget of $5.37 → $13.05 (+143%) whose text says “inside a single +30% step”, capped at $6.98.</w:t>
       </w:r>
     </w:p>
     <w:p>
@@ -9246,26 +9571,10 @@
           <w:b/>
           <w:bCs/>
         </w:rPr>
-        <w:t xml:space="preserve">The two engine checks are named this time: </w:t>
-      </w:r>
-      <w:r>
-        <w:t xml:space="preserve">check 1 (King swap) is rejected in C3, and check 2 (R14 probes) is covered by the review’s holds.</w:t>
-      </w:r>
-    </w:p>
-    <w:p>
-      <w:pPr>
-        <w:pStyle w:val="Heading1"/>
-      </w:pPr>
-      <w:r>
-        <w:t xml:space="preserve">C8. What the app should change so the next run gets these right</w:t>
-      </w:r>
-    </w:p>
-    <w:p>
-      <w:pPr>
-        <w:spacing w:after="100"/>
-      </w:pPr>
-      <w:r>
-        <w:t xml:space="preserve">Carried over from 21 September and still open:</w:t>
+        <w:t xml:space="preserve">To load by hand: </w:t>
+      </w:r>
+      <w:r>
+        <w:t xml:space="preserve">287 ($13.98) and 397 ($14.21, with 398’s $18.59-a-day shortfall stated). The code check failed on these, not the rows. The three idle pauses (2000, 2254, 2255) are harmless hygiene and can load or wait.</w:t>
       </w:r>
     </w:p>
     <w:p>
@@ -9282,10 +9591,26 @@
           <w:b/>
           <w:bCs/>
         </w:rPr>
-        <w:t xml:space="preserve">See the deal. </w:t>
-      </w:r>
-      <w:r>
-        <w:t xml:space="preserve">engine_read is still null, and the Summary says “No deal in the window” even though the Lightning Deal on 10-26 sits inside the brief’s own 09-28 → 10-28 window. It lands one day before the Queen and Full kill dates (10-27).</w:t>
+        <w:t xml:space="preserve">The two engine checks are named this time: </w:t>
+      </w:r>
+      <w:r>
+        <w:t xml:space="preserve">check 1 (King swap) is rejected in C3, and check 2 (R14 probes) is covered by the review’s holds.</w:t>
+      </w:r>
+    </w:p>
+    <w:p>
+      <w:pPr>
+        <w:pStyle w:val="Heading1"/>
+      </w:pPr>
+      <w:r>
+        <w:t xml:space="preserve">C8. What the app should change so the next run gets these right</w:t>
+      </w:r>
+    </w:p>
+    <w:p>
+      <w:pPr>
+        <w:spacing w:after="100"/>
+      </w:pPr>
+      <w:r>
+        <w:t xml:space="preserve">Carried over from 21 September and still open:</w:t>
       </w:r>
     </w:p>
     <w:p>
@@ -9302,10 +9627,10 @@
           <w:b/>
           <w:bCs/>
         </w:rPr>
-        <w:t xml:space="preserve">Read the right window. </w:t>
-      </w:r>
-      <w:r>
-        <w:t xml:space="preserve">The flagship’s delivery (79 a week) is a 90-day average; in the deal it ran about 331 a week. The B07YKCZHGK cut reads only 90 days.</w:t>
+        <w:t xml:space="preserve">See the deal. </w:t>
+      </w:r>
+      <w:r>
+        <w:t xml:space="preserve">engine_read is still null, and the Summary says “No deal in the window” even though the Lightning Deal on 10-26 sits inside the brief’s own 09-28 → 10-28 window. It lands one day before the Queen and Full kill dates (10-27). Deal-window reads are void under §12, and the engine should say so on every row that uses one.</w:t>
       </w:r>
     </w:p>
     <w:p>
@@ -9322,10 +9647,10 @@
           <w:b/>
           <w:bCs/>
         </w:rPr>
-        <w:t xml:space="preserve">One rank source. </w:t>
-      </w:r>
-      <w:r>
-        <w:t xml:space="preserve">“bamboo sheets” and “bamboo sheets queen size” have no current rank in the brief, and the Bamboo and Bamboo|Queen groups are missing from the Rank tab, while the campaigns claim ranks. Row 571’s “today’s reading” is from 26 June.</w:t>
+        <w:t xml:space="preserve">Read the right window. </w:t>
+      </w:r>
+      <w:r>
+        <w:t xml:space="preserve">The flagship’s delivery (79 a week) is a 90-day average; in the deal it ran about 331 a week. The B07YKCZHGK cut reads only 90 days.</w:t>
       </w:r>
     </w:p>
     <w:p>
@@ -9342,10 +9667,10 @@
           <w:b/>
           <w:bCs/>
         </w:rPr>
-        <w:t xml:space="preserve">Budget moves with the push. </w:t>
-      </w:r>
-      <w:r>
-        <w:t xml:space="preserve">A budget row whose prediction reads “no claim” fails the prediction check and is held automatically, while its price half ships. Fix the check, and load the pair together.</w:t>
+        <w:t xml:space="preserve">One rank source. </w:t>
+      </w:r>
+      <w:r>
+        <w:t xml:space="preserve">“bamboo sheets” and “bamboo sheets queen size” have no current rank in the brief, and the Bamboo and Bamboo|Queen groups are missing from the Rank tab, while the campaigns claim ranks. Row 571’s “today’s reading” is from 26 June.</w:t>
       </w:r>
     </w:p>
     <w:p>
@@ -9362,10 +9687,10 @@
           <w:b/>
           <w:bCs/>
         </w:rPr>
-        <w:t xml:space="preserve">Carry the gate’s verdict into the export. </w:t>
-      </w:r>
-      <w:r>
-        <w:t xml:space="preserve">40 “change → HOLD” rows export as changes (35 last time). Drop no-op rows on paused campaigns, and de-duplicate targets that appear twice (by id and by keyword).</w:t>
+        <w:t xml:space="preserve">Budget moves with the push. </w:t>
+      </w:r>
+      <w:r>
+        <w:t xml:space="preserve">A budget row whose prediction reads “no claim” fails the prediction check and is held automatically, while its price half ships. Fix the check, load the pair together, and size the budget as required clicks × this write’s price (§7).</w:t>
       </w:r>
     </w:p>
     <w:p>
@@ -9382,18 +9707,10 @@
           <w:b/>
           <w:bCs/>
         </w:rPr>
-        <w:t xml:space="preserve">Grade before writing, and cite the record. </w:t>
-      </w:r>
-      <w:r>
-        <w:t xml:space="preserve">91 of the 172 price rows sit on 49 campaigns whose tuner records read behind, stalled or wrong-direction, and none cites its record (42% last time, 53% now).</w:t>
-      </w:r>
-    </w:p>
-    <w:p>
-      <w:pPr>
-        <w:spacing w:after="100"/>
-      </w:pPr>
-      <w:r>
-        <w:t xml:space="preserve">New from this run:</w:t>
+        <w:t xml:space="preserve">Carry the gate’s verdict into the export. </w:t>
+      </w:r>
+      <w:r>
+        <w:t xml:space="preserve">40 “change → HOLD” rows export as changes (35 last time). Drop no-op rows on paused campaigns, and de-duplicate targets that appear twice (by id and by keyword).</w:t>
       </w:r>
     </w:p>
     <w:p>
@@ -9410,10 +9727,18 @@
           <w:b/>
           <w:bCs/>
         </w:rPr>
-        <w:t xml:space="preserve">Verify execution. </w:t>
-      </w:r>
-      <w:r>
-        <w:t xml:space="preserve">Record what loaded from every run, and keep every run in “previous”. Nothing from 09-21 loaded, and the 19 September correction on Cal King did not load either.</w:t>
+        <w:t xml:space="preserve">Grade before writing, and cite the record. </w:t>
+      </w:r>
+      <w:r>
+        <w:t xml:space="preserve">91 of the 172 price rows sit on 49 campaigns whose tuner records read behind, stalled or wrong-direction, and none cites its record (42% last time, 53% now).</w:t>
+      </w:r>
+    </w:p>
+    <w:p>
+      <w:pPr>
+        <w:spacing w:after="100"/>
+      </w:pPr>
+      <w:r>
+        <w:t xml:space="preserve">From the logic:</w:t>
       </w:r>
     </w:p>
     <w:p>
@@ -9430,10 +9755,10 @@
           <w:b/>
           <w:bCs/>
         </w:rPr>
-        <w:t xml:space="preserve">Keep a row’s prose true to its column. </w:t>
-      </w:r>
-      <w:r>
-        <w:t xml:space="preserve">369 says “held to 200%” and “not pushed” while writing 425%. 687 says “no climb” while climbing. 398 quotes a 187% version, and 2147 calls +143% “a single +30% step”.</w:t>
+        <w:t xml:space="preserve">Nothing sets the market bound aside. </w:t>
+      </w:r>
+      <w:r>
+        <w:t xml:space="preserve">The “dose push” overrides the climb cap and the market bound, which the logic does not allow (§6: “never a reason to pay more than the position costs”). Name the binding bound and the loss per order on every priced row (§8).</w:t>
       </w:r>
     </w:p>
     <w:p>
@@ -9450,10 +9775,10 @@
           <w:b/>
           <w:bCs/>
         </w:rPr>
-        <w:t xml:space="preserve">Bind reshape pairs. </w:t>
-      </w:r>
-      <w:r>
-        <w:t xml:space="preserve">A modifier and its base rows load together or not at all.</w:t>
+        <w:t xml:space="preserve">No prediction, no push. </w:t>
+      </w:r>
+      <w:r>
+        <w:t xml:space="preserve">A row without a rank prediction is priced at the ceiling (§11), and a term with no rank on file is ceiling only (§6).</w:t>
       </w:r>
     </w:p>
     <w:p>
@@ -9470,10 +9795,10 @@
           <w:b/>
           <w:bCs/>
         </w:rPr>
-        <w:t xml:space="preserve">Cap predictions at what the budget buys. </w:t>
-      </w:r>
-      <w:r>
-        <w:t xml:space="preserve">Don’t predict clicks for a campaign that is not serving, and don’t price a row above its budget in the outcome.</w:t>
+        <w:t xml:space="preserve">Ceilings from the serving child. </w:t>
+      </w:r>
+      <w:r>
+        <w:t xml:space="preserve">Use the serving child’s contribution and rates, not lane figures, and re-derive them when the ad is re-pointed (§2, §3, §8).</w:t>
       </w:r>
     </w:p>
     <w:p>
@@ -9490,10 +9815,10 @@
           <w:b/>
           <w:bCs/>
         </w:rPr>
-        <w:t xml:space="preserve">A surfaced money decision needs a decision row. </w:t>
-      </w:r>
-      <w:r>
-        <w:t xml:space="preserve">The flagship’s “a human decides” sits in a hold row no one reads.</w:t>
+        <w:t xml:space="preserve">Suppression check. </w:t>
+      </w:r>
+      <w:r>
+        <w:t xml:space="preserve">Check a down-only push that isn’t delivering for suppression before raising it again (§10). Every in-focus push here is down-only.</w:t>
       </w:r>
     </w:p>
     <w:p>
@@ -9510,10 +9835,18 @@
           <w:b/>
           <w:bCs/>
         </w:rPr>
-        <w:t xml:space="preserve">Names follow the child. </w:t>
-      </w:r>
-      <w:r>
-        <w:t xml:space="preserve">Never write a child into a name that isn’t the advertised one.</w:t>
+        <w:t xml:space="preserve">Four conditions before a wide gap is funded. </w:t>
+      </w:r>
+      <w:r>
+        <w:t xml:space="preserve">Read velocity, click-through, conversion and stock (§6), and state a push that can’t be funded as a shortfall (§11).</w:t>
+      </w:r>
+    </w:p>
+    <w:p>
+      <w:pPr>
+        <w:spacing w:after="100"/>
+      </w:pPr>
+      <w:r>
+        <w:t xml:space="preserve">New from this run:</w:t>
       </w:r>
     </w:p>
     <w:p>
@@ -9530,10 +9863,10 @@
           <w:b/>
           <w:bCs/>
         </w:rPr>
-        <w:t xml:space="preserve">Collapse rule in focus. </w:t>
-      </w:r>
-      <w:r>
-        <w:t xml:space="preserve">Name the cause for losses over 10 positions (today the freeze starts at 30), and push the focus terms whose campaigns are tagged to another group.</w:t>
+        <w:t xml:space="preserve">Verify execution. </w:t>
+      </w:r>
+      <w:r>
+        <w:t xml:space="preserve">Record what loaded from every run, and keep every run in “previous”. Nothing from 09-21 loaded, and the 19 September correction on Cal King did not load either.</w:t>
       </w:r>
     </w:p>
     <w:p>
@@ -9550,10 +9883,10 @@
           <w:b/>
           <w:bCs/>
         </w:rPr>
-        <w:t xml:space="preserve">One break-even. </w:t>
-      </w:r>
-      <w:r>
-        <w:t xml:space="preserve">The brief uses 33.3%, the sweep 34.4%, and the lane ceiling $3.51.</w:t>
+        <w:t xml:space="preserve">Keep a row’s prose true to its column. </w:t>
+      </w:r>
+      <w:r>
+        <w:t xml:space="preserve">369 says “held to 200%” and “not pushed” while writing 425%. 687 says “no climb” while climbing. 398 quotes a 187% version, and 2147 calls +143% “a single +30% step”.</w:t>
       </w:r>
     </w:p>
     <w:p>
@@ -9570,34 +9903,10 @@
           <w:b/>
           <w:bCs/>
         </w:rPr>
-        <w:t xml:space="preserve">Complete the campaign list. </w:t>
-      </w:r>
-      <w:r>
-        <w:t xml:space="preserve">22 campaigns that carry decisions are missing from the export’s campaign list, so their arithmetic can’t be recomputed.</w:t>
-      </w:r>
-    </w:p>
-    <w:p>
-      <w:pPr>
-        <w:pStyle w:val="Heading1"/>
-      </w:pPr>
-      <w:r>
-        <w:t xml:space="preserve">Part D — After the deal: is this the right focus?</w:t>
-      </w:r>
-    </w:p>
-    <w:p>
-      <w:pPr>
-        <w:spacing w:after="100"/>
-      </w:pPr>
-      <w:r>
-        <w:t xml:space="preserve">The run takes the Bamboo head term out of focus and pushes California King and Bamboo|Cooling. The engine didn’t choose that; the focus is a setting on the run. What the data says about it:</w:t>
-      </w:r>
-    </w:p>
-    <w:p>
-      <w:pPr>
-        <w:pStyle w:val="Heading1"/>
-      </w:pPr>
-      <w:r>
-        <w:t xml:space="preserve">D1. The answer in one page</w:t>
+        <w:t xml:space="preserve">Bind reshape pairs. </w:t>
+      </w:r>
+      <w:r>
+        <w:t xml:space="preserve">A modifier and its base rows load together or not at all.</w:t>
       </w:r>
     </w:p>
     <w:p>
@@ -9614,10 +9923,10 @@
           <w:b/>
           <w:bCs/>
         </w:rPr>
-        <w:t xml:space="preserve">The deal bought volume, not rank on the head. </w:t>
-      </w:r>
-      <w:r>
-        <w:t xml:space="preserve">Orders rose a third at 44% ACoS against a 33% break-even; Bamboo went 35 → 33. The daily push the 21 September corrections called for never loaded, so whether more top-of-search price buys rank on “bamboo sheets” is still untested.</w:t>
+        <w:t xml:space="preserve">Cap predictions at what the budget buys. </w:t>
+      </w:r>
+      <w:r>
+        <w:t xml:space="preserve">Don’t price a row above its budget in the outcome.</w:t>
       </w:r>
     </w:p>
     <w:p>
@@ -9634,10 +9943,10 @@
           <w:b/>
           <w:bCs/>
         </w:rPr>
-        <w:t xml:space="preserve">The new focus is small. </w:t>
-      </w:r>
-      <w:r>
-        <w:t xml:space="preserve">In the deal, California King spent $16 a day for 4 orders (ACoS 68%) and Bamboo|Cooling $66 a day for 22 orders (53%), against Bamboo’s $937 a day. Together they are about 7% of spend.</w:t>
+        <w:t xml:space="preserve">A surfaced money decision needs a decision row. </w:t>
+      </w:r>
+      <w:r>
+        <w:t xml:space="preserve">The flagship’s “a human decides” sits in a hold row no one reads.</w:t>
       </w:r>
     </w:p>
     <w:p>
@@ -9654,10 +9963,10 @@
           <w:b/>
           <w:bCs/>
         </w:rPr>
-        <w:t xml:space="preserve">California King is the weakest place to push. </w:t>
-      </w:r>
-      <w:r>
-        <w:t xml:space="preserve">The hero has 44 units and nothing inbound; the engine prices the top term’s prize at about 0.4 orders a week; the group is already at 17; and CVR fell to 8% in the deal. The push also moves the ad to a child the tracker may not read (A4).</w:t>
+        <w:t xml:space="preserve">Names follow the child. </w:t>
+      </w:r>
+      <w:r>
+        <w:t xml:space="preserve">Never write a child into a name that isn’t the advertised one.</w:t>
       </w:r>
     </w:p>
     <w:p>
@@ -9674,10 +9983,10 @@
           <w:b/>
           <w:bCs/>
         </w:rPr>
-        <w:t xml:space="preserve">Bamboo|Cooling is the better half. </w:t>
-      </w:r>
-      <w:r>
-        <w:t xml:space="preserve">The cooling groups moved most in the deal (Cooling +16, Cooling|King +21, Cooling|Queen +19), Bamboo|Cooling reached 26 mid-deal, the group converts at 11%, and its head term has 8,166 searches. But its head campaign is held (A5), and 10 of its 19 terms are not pushed.</w:t>
+        <w:t xml:space="preserve">Collapse rule in focus. </w:t>
+      </w:r>
+      <w:r>
+        <w:t xml:space="preserve">Name the cause for losses over 10 positions (§12; today the freeze starts at 30), and push the focus terms whose campaigns are tagged to another group.</w:t>
       </w:r>
     </w:p>
     <w:p>
@@ -9694,10 +10003,10 @@
           <w:b/>
           <w:bCs/>
         </w:rPr>
-        <w:t xml:space="preserve">The taper leaves the money where it was. </w:t>
-      </w:r>
-      <w:r>
-        <w:t xml:space="preserve">The flagship holds $340 a day at 299% after the deal, and the plan’s spend goes up $277 a day, not down. Out of focus should mean no new money, and the head is still being funded at deal level by default.</w:t>
+        <w:t xml:space="preserve">One break-even. </w:t>
+      </w:r>
+      <w:r>
+        <w:t xml:space="preserve">The brief uses 33.3%, the sweep 34.4%, and the lane ceiling $3.51.</w:t>
       </w:r>
     </w:p>
     <w:p>
@@ -9714,10 +10023,174 @@
           <w:b/>
           <w:bCs/>
         </w:rPr>
+        <w:t xml:space="preserve">Complete the campaign list. </w:t>
+      </w:r>
+      <w:r>
+        <w:t xml:space="preserve">22 campaigns that carry decisions are missing from the export’s campaign list, so their arithmetic can’t be recomputed.</w:t>
+      </w:r>
+    </w:p>
+    <w:p>
+      <w:pPr>
+        <w:pStyle w:val="Heading1"/>
+      </w:pPr>
+      <w:r>
+        <w:t xml:space="preserve">Part D — After the deal: is this the right focus?</w:t>
+      </w:r>
+    </w:p>
+    <w:p>
+      <w:pPr>
+        <w:spacing w:after="100"/>
+      </w:pPr>
+      <w:r>
+        <w:t xml:space="preserve">The run takes the Bamboo head term out of focus and pushes California King and Bamboo|Cooling. The engine didn’t choose that; the focus is a setting on the run. What the data and the logic say about it:</w:t>
+      </w:r>
+    </w:p>
+    <w:p>
+      <w:pPr>
+        <w:pStyle w:val="Heading1"/>
+      </w:pPr>
+      <w:r>
+        <w:t xml:space="preserve">D1. The answer in one page</w:t>
+      </w:r>
+    </w:p>
+    <w:p>
+      <w:pPr>
+        <w:pStyle w:val="ListParagraph"/>
+        <w:numPr>
+          <w:ilvl w:val="0"/>
+          <w:numId w:val="2"/>
+        </w:numPr>
+        <w:spacing w:after="60"/>
+      </w:pPr>
+      <w:r>
+        <w:rPr>
+          <w:b/>
+          <w:bCs/>
+        </w:rPr>
+        <w:t xml:space="preserve">The deal bought volume, not rank on the head. </w:t>
+      </w:r>
+      <w:r>
+        <w:t xml:space="preserve">Orders rose a third at 44% ACoS against a 33% break-even; Bamboo went 35 → 33. The daily push the 21 September corrections called for never loaded, so whether more top-of-search price buys rank on “bamboo sheets” is still untested.</w:t>
+      </w:r>
+    </w:p>
+    <w:p>
+      <w:pPr>
+        <w:pStyle w:val="ListParagraph"/>
+        <w:numPr>
+          <w:ilvl w:val="0"/>
+          <w:numId w:val="2"/>
+        </w:numPr>
+        <w:spacing w:after="60"/>
+      </w:pPr>
+      <w:r>
+        <w:rPr>
+          <w:b/>
+          <w:bCs/>
+        </w:rPr>
+        <w:t xml:space="preserve">The new focus is small. </w:t>
+      </w:r>
+      <w:r>
+        <w:t xml:space="preserve">In the deal, California King spent $16 a day for 4 orders (ACoS 68%) and Bamboo|Cooling $66 a day for 22 orders (53%), against Bamboo’s $937 a day. Together they are about 7% of spend.</w:t>
+      </w:r>
+    </w:p>
+    <w:p>
+      <w:pPr>
+        <w:pStyle w:val="ListParagraph"/>
+        <w:numPr>
+          <w:ilvl w:val="0"/>
+          <w:numId w:val="2"/>
+        </w:numPr>
+        <w:spacing w:after="60"/>
+      </w:pPr>
+      <w:r>
+        <w:rPr>
+          <w:b/>
+          <w:bCs/>
+        </w:rPr>
+        <w:t xml:space="preserve">Under the logic, nothing is a funded push until 10-26. </w:t>
+      </w:r>
+      <w:r>
+        <w:t xml:space="preserve">A wide gap is funded only when sales velocity is available in the window (§6), and the next window is the 10-26 Lightning Deal. Until then the focus terms take capped test steps that earn the conversion read (A2), and everything else stays at maintenance: the ceiling, no premium, the 70/20 mix.</w:t>
+      </w:r>
+    </w:p>
+    <w:p>
+      <w:pPr>
+        <w:pStyle w:val="ListParagraph"/>
+        <w:numPr>
+          <w:ilvl w:val="0"/>
+          <w:numId w:val="2"/>
+        </w:numPr>
+        <w:spacing w:after="60"/>
+      </w:pPr>
+      <w:r>
+        <w:rPr>
+          <w:b/>
+          <w:bCs/>
+        </w:rPr>
+        <w:t xml:space="preserve">California King fails a second condition: stock. </w:t>
+      </w:r>
+      <w:r>
+        <w:t xml:space="preserve">The hero has 44 units and nothing inbound. The engine prices the top term’s prize at about 0.4 orders a week, the group is already at 17, and CVR fell to 8% in the deal. It stays at maintenance until White restocks.</w:t>
+      </w:r>
+    </w:p>
+    <w:p>
+      <w:pPr>
+        <w:pStyle w:val="ListParagraph"/>
+        <w:numPr>
+          <w:ilvl w:val="0"/>
+          <w:numId w:val="2"/>
+        </w:numPr>
+        <w:spacing w:after="60"/>
+      </w:pPr>
+      <w:r>
+        <w:rPr>
+          <w:b/>
+          <w:bCs/>
+        </w:rPr>
+        <w:t xml:space="preserve">Bamboo|Cooling is the better half. </w:t>
+      </w:r>
+      <w:r>
+        <w:t xml:space="preserve">The cooling groups moved most in the deal (Cooling +16, Cooling|King +21, Cooling|Queen +19), Bamboo|Cooling reached 26 mid-deal, the group converts at 11%, and its serving children have stock. But its head campaign is held (A5), and 10 of its 19 terms are not pushed.</w:t>
+      </w:r>
+    </w:p>
+    <w:p>
+      <w:pPr>
+        <w:pStyle w:val="ListParagraph"/>
+        <w:numPr>
+          <w:ilvl w:val="0"/>
+          <w:numId w:val="2"/>
+        </w:numPr>
+        <w:spacing w:after="60"/>
+      </w:pPr>
+      <w:r>
+        <w:rPr>
+          <w:b/>
+          <w:bCs/>
+        </w:rPr>
         <w:t xml:space="preserve">Bamboo|King is the candidate the run ignores. </w:t>
       </w:r>
       <w:r>
-        <w:t xml:space="preserve">It moved 31 → 27, and 48 orders came in the deal (ACoS 55%). Its hero is the best King converter, and 606 units land 10-16.</w:t>
+        <w:t xml:space="preserve">It moved 31 → 27 with 48 orders in the deal (ACoS 55%), click-through and conversion above the market, and 606 units landing 10-16, ten days before the next deal.</w:t>
+      </w:r>
+    </w:p>
+    <w:p>
+      <w:pPr>
+        <w:pStyle w:val="ListParagraph"/>
+        <w:numPr>
+          <w:ilvl w:val="0"/>
+          <w:numId w:val="2"/>
+        </w:numPr>
+        <w:spacing w:after="60"/>
+      </w:pPr>
+      <w:r>
+        <w:rPr>
+          <w:b/>
+          <w:bCs/>
+        </w:rPr>
+        <w:t xml:space="preserve">The flagship is a funding decision, not a taper. </w:t>
+      </w:r>
+      <w:r>
+        <w:t xml:space="preserve">The logic keeps it from being cut (§14). Funding it fully costs about $519 a day at today’s price, roughly $300 a day of it deliberate loss (B1).</w:t>
       </w:r>
     </w:p>
     <w:p>
@@ -10962,7 +11435,802 @@
         <w:pStyle w:val="Heading1"/>
       </w:pPr>
       <w:r>
-        <w:t xml:space="preserve">D3. What the owner decides</w:t>
+        <w:t xml:space="preserve">D3. The four conditions (the logic, §6)</w:t>
+      </w:r>
+    </w:p>
+    <w:tbl>
+      <w:tblPr>
+        <w:tblW w:type="dxa" w:w="9972"/>
+        <w:tblBorders>
+          <w:top w:val="single" w:color="auto" w:sz="4"/>
+          <w:left w:val="single" w:color="auto" w:sz="4"/>
+          <w:bottom w:val="single" w:color="auto" w:sz="4"/>
+          <w:right w:val="single" w:color="auto" w:sz="4"/>
+          <w:insideH w:val="single" w:color="auto" w:sz="4"/>
+          <w:insideV w:val="single" w:color="auto" w:sz="4"/>
+        </w:tblBorders>
+      </w:tblPr>
+      <w:tblGrid>
+        <w:gridCol w:w="1891"/>
+        <w:gridCol w:w="1461"/>
+        <w:gridCol w:w="1719"/>
+        <w:gridCol w:w="1891"/>
+        <w:gridCol w:w="1719"/>
+        <w:gridCol w:w="1291"/>
+      </w:tblGrid>
+      <w:tr>
+        <w:trPr>
+          <w:tblHeader/>
+        </w:trPr>
+        <w:tc>
+          <w:tcPr>
+            <w:tcW w:type="dxa" w:w="1891"/>
+            <w:shd w:fill="1F3A5F" w:color="auto" w:val="clear"/>
+            <w:tcMar>
+              <w:top w:type="dxa" w:w="40"/>
+              <w:left w:type="dxa" w:w="70"/>
+              <w:bottom w:type="dxa" w:w="40"/>
+              <w:right w:type="dxa" w:w="70"/>
+            </w:tcMar>
+          </w:tcPr>
+          <w:p>
+            <w:pPr>
+              <w:spacing w:after="0"/>
+            </w:pPr>
+            <w:r>
+              <w:rPr>
+                <w:b/>
+                <w:bCs/>
+                <w:color w:val="FFFFFF"/>
+                <w:sz w:val="17"/>
+                <w:szCs w:val="17"/>
+              </w:rPr>
+              <w:t xml:space="preserve">Group</w:t>
+            </w:r>
+          </w:p>
+        </w:tc>
+        <w:tc>
+          <w:tcPr>
+            <w:tcW w:type="dxa" w:w="1461"/>
+            <w:shd w:fill="1F3A5F" w:color="auto" w:val="clear"/>
+            <w:tcMar>
+              <w:top w:type="dxa" w:w="40"/>
+              <w:left w:type="dxa" w:w="70"/>
+              <w:bottom w:type="dxa" w:w="40"/>
+              <w:right w:type="dxa" w:w="70"/>
+            </w:tcMar>
+          </w:tcPr>
+          <w:p>
+            <w:pPr>
+              <w:spacing w:after="0"/>
+            </w:pPr>
+            <w:r>
+              <w:rPr>
+                <w:b/>
+                <w:bCs/>
+                <w:color w:val="FFFFFF"/>
+                <w:sz w:val="17"/>
+                <w:szCs w:val="17"/>
+              </w:rPr>
+              <w:t xml:space="preserve">Sales velocity in the window</w:t>
+            </w:r>
+          </w:p>
+        </w:tc>
+        <w:tc>
+          <w:tcPr>
+            <w:tcW w:type="dxa" w:w="1719"/>
+            <w:shd w:fill="1F3A5F" w:color="auto" w:val="clear"/>
+            <w:tcMar>
+              <w:top w:type="dxa" w:w="40"/>
+              <w:left w:type="dxa" w:w="70"/>
+              <w:bottom w:type="dxa" w:w="40"/>
+              <w:right w:type="dxa" w:w="70"/>
+            </w:tcMar>
+          </w:tcPr>
+          <w:p>
+            <w:pPr>
+              <w:spacing w:after="0"/>
+            </w:pPr>
+            <w:r>
+              <w:rPr>
+                <w:b/>
+                <w:bCs/>
+                <w:color w:val="FFFFFF"/>
+                <w:sz w:val="17"/>
+                <w:szCs w:val="17"/>
+              </w:rPr>
+              <w:t xml:space="preserve">Click-through above market</w:t>
+            </w:r>
+          </w:p>
+        </w:tc>
+        <w:tc>
+          <w:tcPr>
+            <w:tcW w:type="dxa" w:w="1891"/>
+            <w:shd w:fill="1F3A5F" w:color="auto" w:val="clear"/>
+            <w:tcMar>
+              <w:top w:type="dxa" w:w="40"/>
+              <w:left w:type="dxa" w:w="70"/>
+              <w:bottom w:type="dxa" w:w="40"/>
+              <w:right w:type="dxa" w:w="70"/>
+            </w:tcMar>
+          </w:tcPr>
+          <w:p>
+            <w:pPr>
+              <w:spacing w:after="0"/>
+            </w:pPr>
+            <w:r>
+              <w:rPr>
+                <w:b/>
+                <w:bCs/>
+                <w:color w:val="FFFFFF"/>
+                <w:sz w:val="17"/>
+                <w:szCs w:val="17"/>
+              </w:rPr>
+              <w:t xml:space="preserve">Conversion above market</w:t>
+            </w:r>
+          </w:p>
+        </w:tc>
+        <w:tc>
+          <w:tcPr>
+            <w:tcW w:type="dxa" w:w="1719"/>
+            <w:shd w:fill="1F3A5F" w:color="auto" w:val="clear"/>
+            <w:tcMar>
+              <w:top w:type="dxa" w:w="40"/>
+              <w:left w:type="dxa" w:w="70"/>
+              <w:bottom w:type="dxa" w:w="40"/>
+              <w:right w:type="dxa" w:w="70"/>
+            </w:tcMar>
+          </w:tcPr>
+          <w:p>
+            <w:pPr>
+              <w:spacing w:after="0"/>
+            </w:pPr>
+            <w:r>
+              <w:rPr>
+                <w:b/>
+                <w:bCs/>
+                <w:color w:val="FFFFFF"/>
+                <w:sz w:val="17"/>
+                <w:szCs w:val="17"/>
+              </w:rPr>
+              <w:t xml:space="preserve">Stock to sustain it</w:t>
+            </w:r>
+          </w:p>
+        </w:tc>
+        <w:tc>
+          <w:tcPr>
+            <w:tcW w:type="dxa" w:w="1291"/>
+            <w:shd w:fill="1F3A5F" w:color="auto" w:val="clear"/>
+            <w:tcMar>
+              <w:top w:type="dxa" w:w="40"/>
+              <w:left w:type="dxa" w:w="70"/>
+              <w:bottom w:type="dxa" w:w="40"/>
+              <w:right w:type="dxa" w:w="70"/>
+            </w:tcMar>
+          </w:tcPr>
+          <w:p>
+            <w:pPr>
+              <w:spacing w:after="0"/>
+            </w:pPr>
+            <w:r>
+              <w:rPr>
+                <w:b/>
+                <w:bCs/>
+                <w:color w:val="FFFFFF"/>
+                <w:sz w:val="17"/>
+                <w:szCs w:val="17"/>
+              </w:rPr>
+              <w:t xml:space="preserve">Verdict</w:t>
+            </w:r>
+          </w:p>
+        </w:tc>
+      </w:tr>
+      <w:tr>
+        <w:tc>
+          <w:tcPr>
+            <w:tcW w:type="dxa" w:w="1891"/>
+            <w:shd w:fill="FFFFFF" w:color="auto" w:val="clear"/>
+            <w:tcMar>
+              <w:top w:type="dxa" w:w="40"/>
+              <w:left w:type="dxa" w:w="70"/>
+              <w:bottom w:type="dxa" w:w="40"/>
+              <w:right w:type="dxa" w:w="70"/>
+            </w:tcMar>
+          </w:tcPr>
+          <w:p>
+            <w:pPr>
+              <w:spacing w:after="0"/>
+            </w:pPr>
+            <w:r>
+              <w:rPr>
+                <w:sz w:val="17"/>
+                <w:szCs w:val="17"/>
+              </w:rPr>
+              <w:t xml:space="preserve">Bamboo|California King (focus)</w:t>
+            </w:r>
+          </w:p>
+        </w:tc>
+        <w:tc>
+          <w:tcPr>
+            <w:tcW w:type="dxa" w:w="1461"/>
+            <w:shd w:fill="FFFFFF" w:color="auto" w:val="clear"/>
+            <w:tcMar>
+              <w:top w:type="dxa" w:w="40"/>
+              <w:left w:type="dxa" w:w="70"/>
+              <w:bottom w:type="dxa" w:w="40"/>
+              <w:right w:type="dxa" w:w="70"/>
+            </w:tcMar>
+          </w:tcPr>
+          <w:p>
+            <w:pPr>
+              <w:spacing w:after="0"/>
+            </w:pPr>
+            <w:r>
+              <w:rPr>
+                <w:sz w:val="17"/>
+                <w:szCs w:val="17"/>
+              </w:rPr>
+              <w:t xml:space="preserve">No deal until 10-26</w:t>
+            </w:r>
+          </w:p>
+        </w:tc>
+        <w:tc>
+          <w:tcPr>
+            <w:tcW w:type="dxa" w:w="1719"/>
+            <w:shd w:fill="FFFFFF" w:color="auto" w:val="clear"/>
+            <w:tcMar>
+              <w:top w:type="dxa" w:w="40"/>
+              <w:left w:type="dxa" w:w="70"/>
+              <w:bottom w:type="dxa" w:w="40"/>
+              <w:right w:type="dxa" w:w="70"/>
+            </w:tcMar>
+          </w:tcPr>
+          <w:p>
+            <w:pPr>
+              <w:spacing w:after="0"/>
+            </w:pPr>
+            <w:r>
+              <w:rPr>
+                <w:sz w:val="17"/>
+                <w:szCs w:val="17"/>
+              </w:rPr>
+              <w:t xml:space="preserve">Yes: 7.3% vs 1.9% at top of search on the head term</w:t>
+            </w:r>
+          </w:p>
+        </w:tc>
+        <w:tc>
+          <w:tcPr>
+            <w:tcW w:type="dxa" w:w="1891"/>
+            <w:shd w:fill="FFFFFF" w:color="auto" w:val="clear"/>
+            <w:tcMar>
+              <w:top w:type="dxa" w:w="40"/>
+              <w:left w:type="dxa" w:w="70"/>
+              <w:bottom w:type="dxa" w:w="40"/>
+              <w:right w:type="dxa" w:w="70"/>
+            </w:tcMar>
+          </w:tcPr>
+          <w:p>
+            <w:pPr>
+              <w:spacing w:after="0"/>
+            </w:pPr>
+            <w:r>
+              <w:rPr>
+                <w:sz w:val="17"/>
+                <w:szCs w:val="17"/>
+              </w:rPr>
+              <w:t xml:space="preserve">Not shown: 0 orders on 9 clicks on the head term; group 8.0% in the deal</w:t>
+            </w:r>
+          </w:p>
+        </w:tc>
+        <w:tc>
+          <w:tcPr>
+            <w:tcW w:type="dxa" w:w="1719"/>
+            <w:shd w:fill="FFFFFF" w:color="auto" w:val="clear"/>
+            <w:tcMar>
+              <w:top w:type="dxa" w:w="40"/>
+              <w:left w:type="dxa" w:w="70"/>
+              <w:bottom w:type="dxa" w:w="40"/>
+              <w:right w:type="dxa" w:w="70"/>
+            </w:tcMar>
+          </w:tcPr>
+          <w:p>
+            <w:pPr>
+              <w:spacing w:after="0"/>
+            </w:pPr>
+            <w:r>
+              <w:rPr>
+                <w:sz w:val="17"/>
+                <w:szCs w:val="17"/>
+              </w:rPr>
+              <w:t xml:space="preserve">No: hero 44 units, none inbound; Burgundy-New 76</w:t>
+            </w:r>
+          </w:p>
+        </w:tc>
+        <w:tc>
+          <w:tcPr>
+            <w:tcW w:type="dxa" w:w="1291"/>
+            <w:shd w:fill="FFFFFF" w:color="auto" w:val="clear"/>
+            <w:tcMar>
+              <w:top w:type="dxa" w:w="40"/>
+              <w:left w:type="dxa" w:w="70"/>
+              <w:bottom w:type="dxa" w:w="40"/>
+              <w:right w:type="dxa" w:w="70"/>
+            </w:tcMar>
+          </w:tcPr>
+          <w:p>
+            <w:pPr>
+              <w:spacing w:after="0"/>
+            </w:pPr>
+            <w:r>
+              <w:rPr>
+                <w:sz w:val="17"/>
+                <w:szCs w:val="17"/>
+              </w:rPr>
+              <w:t xml:space="preserve">Maintenance</w:t>
+            </w:r>
+          </w:p>
+        </w:tc>
+      </w:tr>
+      <w:tr>
+        <w:tc>
+          <w:tcPr>
+            <w:tcW w:type="dxa" w:w="1891"/>
+            <w:shd w:fill="F2F5F9" w:color="auto" w:val="clear"/>
+            <w:tcMar>
+              <w:top w:type="dxa" w:w="40"/>
+              <w:left w:type="dxa" w:w="70"/>
+              <w:bottom w:type="dxa" w:w="40"/>
+              <w:right w:type="dxa" w:w="70"/>
+            </w:tcMar>
+          </w:tcPr>
+          <w:p>
+            <w:pPr>
+              <w:spacing w:after="0"/>
+            </w:pPr>
+            <w:r>
+              <w:rPr>
+                <w:sz w:val="17"/>
+                <w:szCs w:val="17"/>
+              </w:rPr>
+              <w:t xml:space="preserve">Bamboo|Cooling (focus)</w:t>
+            </w:r>
+          </w:p>
+        </w:tc>
+        <w:tc>
+          <w:tcPr>
+            <w:tcW w:type="dxa" w:w="1461"/>
+            <w:shd w:fill="F2F5F9" w:color="auto" w:val="clear"/>
+            <w:tcMar>
+              <w:top w:type="dxa" w:w="40"/>
+              <w:left w:type="dxa" w:w="70"/>
+              <w:bottom w:type="dxa" w:w="40"/>
+              <w:right w:type="dxa" w:w="70"/>
+            </w:tcMar>
+          </w:tcPr>
+          <w:p>
+            <w:pPr>
+              <w:spacing w:after="0"/>
+            </w:pPr>
+            <w:r>
+              <w:rPr>
+                <w:sz w:val="17"/>
+                <w:szCs w:val="17"/>
+              </w:rPr>
+              <w:t xml:space="preserve">No deal until 10-26</w:t>
+            </w:r>
+          </w:p>
+        </w:tc>
+        <w:tc>
+          <w:tcPr>
+            <w:tcW w:type="dxa" w:w="1719"/>
+            <w:shd w:fill="F2F5F9" w:color="auto" w:val="clear"/>
+            <w:tcMar>
+              <w:top w:type="dxa" w:w="40"/>
+              <w:left w:type="dxa" w:w="70"/>
+              <w:bottom w:type="dxa" w:w="40"/>
+              <w:right w:type="dxa" w:w="70"/>
+            </w:tcMar>
+          </w:tcPr>
+          <w:p>
+            <w:pPr>
+              <w:spacing w:after="0"/>
+            </w:pPr>
+            <w:r>
+              <w:rPr>
+                <w:sz w:val="17"/>
+                <w:szCs w:val="17"/>
+              </w:rPr>
+              <w:t xml:space="preserve">Yes: 5.6% vs 1.8% on “cooling bamboo sheets”</w:t>
+            </w:r>
+          </w:p>
+        </w:tc>
+        <w:tc>
+          <w:tcPr>
+            <w:tcW w:type="dxa" w:w="1891"/>
+            <w:shd w:fill="F2F5F9" w:color="auto" w:val="clear"/>
+            <w:tcMar>
+              <w:top w:type="dxa" w:w="40"/>
+              <w:left w:type="dxa" w:w="70"/>
+              <w:bottom w:type="dxa" w:w="40"/>
+              <w:right w:type="dxa" w:w="70"/>
+            </w:tcMar>
+          </w:tcPr>
+          <w:p>
+            <w:pPr>
+              <w:spacing w:after="0"/>
+            </w:pPr>
+            <w:r>
+              <w:rPr>
+                <w:sz w:val="17"/>
+                <w:szCs w:val="17"/>
+              </w:rPr>
+              <w:t xml:space="preserve">Group 11.1% in the deal; the pushed terms have no orders yet</w:t>
+            </w:r>
+          </w:p>
+        </w:tc>
+        <w:tc>
+          <w:tcPr>
+            <w:tcW w:type="dxa" w:w="1719"/>
+            <w:shd w:fill="F2F5F9" w:color="auto" w:val="clear"/>
+            <w:tcMar>
+              <w:top w:type="dxa" w:w="40"/>
+              <w:left w:type="dxa" w:w="70"/>
+              <w:bottom w:type="dxa" w:w="40"/>
+              <w:right w:type="dxa" w:w="70"/>
+            </w:tcMar>
+          </w:tcPr>
+          <w:p>
+            <w:pPr>
+              <w:spacing w:after="0"/>
+            </w:pPr>
+            <w:r>
+              <w:rPr>
+                <w:sz w:val="17"/>
+                <w:szCs w:val="17"/>
+              </w:rPr>
+              <w:t xml:space="preserve">Yes on serving children (King Creme 504, Queen Olive 325)</w:t>
+            </w:r>
+          </w:p>
+        </w:tc>
+        <w:tc>
+          <w:tcPr>
+            <w:tcW w:type="dxa" w:w="1291"/>
+            <w:shd w:fill="F2F5F9" w:color="auto" w:val="clear"/>
+            <w:tcMar>
+              <w:top w:type="dxa" w:w="40"/>
+              <w:left w:type="dxa" w:w="70"/>
+              <w:bottom w:type="dxa" w:w="40"/>
+              <w:right w:type="dxa" w:w="70"/>
+            </w:tcMar>
+          </w:tcPr>
+          <w:p>
+            <w:pPr>
+              <w:spacing w:after="0"/>
+            </w:pPr>
+            <w:r>
+              <w:rPr>
+                <w:sz w:val="17"/>
+                <w:szCs w:val="17"/>
+              </w:rPr>
+              <w:t xml:space="preserve">Test now, fund for 10-26</w:t>
+            </w:r>
+          </w:p>
+        </w:tc>
+      </w:tr>
+      <w:tr>
+        <w:tc>
+          <w:tcPr>
+            <w:tcW w:type="dxa" w:w="1891"/>
+            <w:shd w:fill="FFFFFF" w:color="auto" w:val="clear"/>
+            <w:tcMar>
+              <w:top w:type="dxa" w:w="40"/>
+              <w:left w:type="dxa" w:w="70"/>
+              <w:bottom w:type="dxa" w:w="40"/>
+              <w:right w:type="dxa" w:w="70"/>
+            </w:tcMar>
+          </w:tcPr>
+          <w:p>
+            <w:pPr>
+              <w:spacing w:after="0"/>
+            </w:pPr>
+            <w:r>
+              <w:rPr>
+                <w:sz w:val="17"/>
+                <w:szCs w:val="17"/>
+              </w:rPr>
+              <w:t xml:space="preserve">Bamboo|King (out)</w:t>
+            </w:r>
+          </w:p>
+        </w:tc>
+        <w:tc>
+          <w:tcPr>
+            <w:tcW w:type="dxa" w:w="1461"/>
+            <w:shd w:fill="FFFFFF" w:color="auto" w:val="clear"/>
+            <w:tcMar>
+              <w:top w:type="dxa" w:w="40"/>
+              <w:left w:type="dxa" w:w="70"/>
+              <w:bottom w:type="dxa" w:w="40"/>
+              <w:right w:type="dxa" w:w="70"/>
+            </w:tcMar>
+          </w:tcPr>
+          <w:p>
+            <w:pPr>
+              <w:spacing w:after="0"/>
+            </w:pPr>
+            <w:r>
+              <w:rPr>
+                <w:sz w:val="17"/>
+                <w:szCs w:val="17"/>
+              </w:rPr>
+              <w:t xml:space="preserve">No deal until 10-26</w:t>
+            </w:r>
+          </w:p>
+        </w:tc>
+        <w:tc>
+          <w:tcPr>
+            <w:tcW w:type="dxa" w:w="1719"/>
+            <w:shd w:fill="FFFFFF" w:color="auto" w:val="clear"/>
+            <w:tcMar>
+              <w:top w:type="dxa" w:w="40"/>
+              <w:left w:type="dxa" w:w="70"/>
+              <w:bottom w:type="dxa" w:w="40"/>
+              <w:right w:type="dxa" w:w="70"/>
+            </w:tcMar>
+          </w:tcPr>
+          <w:p>
+            <w:pPr>
+              <w:spacing w:after="0"/>
+            </w:pPr>
+            <w:r>
+              <w:rPr>
+                <w:sz w:val="17"/>
+                <w:szCs w:val="17"/>
+              </w:rPr>
+              <w:t xml:space="preserve">Yes: 6.7% vs 1.9% (21 Sep D5)</w:t>
+            </w:r>
+          </w:p>
+        </w:tc>
+        <w:tc>
+          <w:tcPr>
+            <w:tcW w:type="dxa" w:w="1891"/>
+            <w:shd w:fill="FFFFFF" w:color="auto" w:val="clear"/>
+            <w:tcMar>
+              <w:top w:type="dxa" w:w="40"/>
+              <w:left w:type="dxa" w:w="70"/>
+              <w:bottom w:type="dxa" w:w="40"/>
+              <w:right w:type="dxa" w:w="70"/>
+            </w:tcMar>
+          </w:tcPr>
+          <w:p>
+            <w:pPr>
+              <w:spacing w:after="0"/>
+            </w:pPr>
+            <w:r>
+              <w:rPr>
+                <w:sz w:val="17"/>
+                <w:szCs w:val="17"/>
+              </w:rPr>
+              <w:t xml:space="preserve">Yes: 16.5% vs a 10.8% bar (21 Sep D5)</w:t>
+            </w:r>
+          </w:p>
+        </w:tc>
+        <w:tc>
+          <w:tcPr>
+            <w:tcW w:type="dxa" w:w="1719"/>
+            <w:shd w:fill="FFFFFF" w:color="auto" w:val="clear"/>
+            <w:tcMar>
+              <w:top w:type="dxa" w:w="40"/>
+              <w:left w:type="dxa" w:w="70"/>
+              <w:bottom w:type="dxa" w:w="40"/>
+              <w:right w:type="dxa" w:w="70"/>
+            </w:tcMar>
+          </w:tcPr>
+          <w:p>
+            <w:pPr>
+              <w:spacing w:after="0"/>
+            </w:pPr>
+            <w:r>
+              <w:rPr>
+                <w:sz w:val="17"/>
+                <w:szCs w:val="17"/>
+              </w:rPr>
+              <w:t xml:space="preserve">From 10-16 (606 King White)</w:t>
+            </w:r>
+          </w:p>
+        </w:tc>
+        <w:tc>
+          <w:tcPr>
+            <w:tcW w:type="dxa" w:w="1291"/>
+            <w:shd w:fill="FFFFFF" w:color="auto" w:val="clear"/>
+            <w:tcMar>
+              <w:top w:type="dxa" w:w="40"/>
+              <w:left w:type="dxa" w:w="70"/>
+              <w:bottom w:type="dxa" w:w="40"/>
+              <w:right w:type="dxa" w:w="70"/>
+            </w:tcMar>
+          </w:tcPr>
+          <w:p>
+            <w:pPr>
+              <w:spacing w:after="0"/>
+            </w:pPr>
+            <w:r>
+              <w:rPr>
+                <w:sz w:val="17"/>
+                <w:szCs w:val="17"/>
+              </w:rPr>
+              <w:t xml:space="preserve">Fund for 10-26</w:t>
+            </w:r>
+          </w:p>
+        </w:tc>
+      </w:tr>
+      <w:tr>
+        <w:tc>
+          <w:tcPr>
+            <w:tcW w:type="dxa" w:w="1891"/>
+            <w:shd w:fill="F2F5F9" w:color="auto" w:val="clear"/>
+            <w:tcMar>
+              <w:top w:type="dxa" w:w="40"/>
+              <w:left w:type="dxa" w:w="70"/>
+              <w:bottom w:type="dxa" w:w="40"/>
+              <w:right w:type="dxa" w:w="70"/>
+            </w:tcMar>
+          </w:tcPr>
+          <w:p>
+            <w:pPr>
+              <w:spacing w:after="0"/>
+            </w:pPr>
+            <w:r>
+              <w:rPr>
+                <w:sz w:val="17"/>
+                <w:szCs w:val="17"/>
+              </w:rPr>
+              <w:t xml:space="preserve">Bamboo (out)</w:t>
+            </w:r>
+          </w:p>
+        </w:tc>
+        <w:tc>
+          <w:tcPr>
+            <w:tcW w:type="dxa" w:w="1461"/>
+            <w:shd w:fill="F2F5F9" w:color="auto" w:val="clear"/>
+            <w:tcMar>
+              <w:top w:type="dxa" w:w="40"/>
+              <w:left w:type="dxa" w:w="70"/>
+              <w:bottom w:type="dxa" w:w="40"/>
+              <w:right w:type="dxa" w:w="70"/>
+            </w:tcMar>
+          </w:tcPr>
+          <w:p>
+            <w:pPr>
+              <w:spacing w:after="0"/>
+            </w:pPr>
+            <w:r>
+              <w:rPr>
+                <w:sz w:val="17"/>
+                <w:szCs w:val="17"/>
+              </w:rPr>
+              <w:t xml:space="preserve">No deal until 10-26</w:t>
+            </w:r>
+          </w:p>
+        </w:tc>
+        <w:tc>
+          <w:tcPr>
+            <w:tcW w:type="dxa" w:w="1719"/>
+            <w:shd w:fill="F2F5F9" w:color="auto" w:val="clear"/>
+            <w:tcMar>
+              <w:top w:type="dxa" w:w="40"/>
+              <w:left w:type="dxa" w:w="70"/>
+              <w:bottom w:type="dxa" w:w="40"/>
+              <w:right w:type="dxa" w:w="70"/>
+            </w:tcMar>
+          </w:tcPr>
+          <w:p>
+            <w:pPr>
+              <w:spacing w:after="0"/>
+            </w:pPr>
+            <w:r>
+              <w:rPr>
+                <w:sz w:val="17"/>
+                <w:szCs w:val="17"/>
+              </w:rPr>
+              <w:t xml:space="preserve">Yes: 3.4% vs 1.9%</w:t>
+            </w:r>
+          </w:p>
+        </w:tc>
+        <w:tc>
+          <w:tcPr>
+            <w:tcW w:type="dxa" w:w="1891"/>
+            <w:shd w:fill="F2F5F9" w:color="auto" w:val="clear"/>
+            <w:tcMar>
+              <w:top w:type="dxa" w:w="40"/>
+              <w:left w:type="dxa" w:w="70"/>
+              <w:bottom w:type="dxa" w:w="40"/>
+              <w:right w:type="dxa" w:w="70"/>
+            </w:tcMar>
+          </w:tcPr>
+          <w:p>
+            <w:pPr>
+              <w:spacing w:after="0"/>
+            </w:pPr>
+            <w:r>
+              <w:rPr>
+                <w:sz w:val="17"/>
+                <w:szCs w:val="17"/>
+              </w:rPr>
+              <w:t xml:space="preserve">Yes: 12.7% vs an 8.3% bar</w:t>
+            </w:r>
+          </w:p>
+        </w:tc>
+        <w:tc>
+          <w:tcPr>
+            <w:tcW w:type="dxa" w:w="1719"/>
+            <w:shd w:fill="F2F5F9" w:color="auto" w:val="clear"/>
+            <w:tcMar>
+              <w:top w:type="dxa" w:w="40"/>
+              <w:left w:type="dxa" w:w="70"/>
+              <w:bottom w:type="dxa" w:w="40"/>
+              <w:right w:type="dxa" w:w="70"/>
+            </w:tcMar>
+          </w:tcPr>
+          <w:p>
+            <w:pPr>
+              <w:spacing w:after="0"/>
+            </w:pPr>
+            <w:r>
+              <w:rPr>
+                <w:sz w:val="17"/>
+                <w:szCs w:val="17"/>
+              </w:rPr>
+              <w:t xml:space="preserve">King from 10-16; Queen White 82 until 10-27</w:t>
+            </w:r>
+          </w:p>
+        </w:tc>
+        <w:tc>
+          <w:tcPr>
+            <w:tcW w:type="dxa" w:w="1291"/>
+            <w:shd w:fill="F2F5F9" w:color="auto" w:val="clear"/>
+            <w:tcMar>
+              <w:top w:type="dxa" w:w="40"/>
+              <w:left w:type="dxa" w:w="70"/>
+              <w:bottom w:type="dxa" w:w="40"/>
+              <w:right w:type="dxa" w:w="70"/>
+            </w:tcMar>
+          </w:tcPr>
+          <w:p>
+            <w:pPr>
+              <w:spacing w:after="0"/>
+            </w:pPr>
+            <w:r>
+              <w:rPr>
+                <w:sz w:val="17"/>
+                <w:szCs w:val="17"/>
+              </w:rPr>
+              <w:t xml:space="preserve">Owner decides (B1)</w:t>
+            </w:r>
+          </w:p>
+        </w:tc>
+      </w:tr>
+    </w:tbl>
+    <w:p>
+      <w:pPr>
+        <w:spacing w:after="120"/>
+      </w:pPr>
+      <w:r>
+        <w:rPr>
+          <w:i/>
+          <w:iCs/>
+          <w:color w:val="555555"/>
+          <w:sz w:val="17"/>
+          <w:szCs w:val="17"/>
+        </w:rPr>
+        <w:t xml:space="preserve">Click-through and conversion from this run’s rows and the 21 September document’s D5 (both read on the deal window, so re-confirm on clean days). The 21 September bars were 1.1× market CTR and 3× market CVR, so “above the bar” is above the market.</w:t>
+      </w:r>
+    </w:p>
+    <w:p>
+      <w:pPr>
+        <w:pStyle w:val="Heading1"/>
+      </w:pPr>
+      <w:r>
+        <w:t xml:space="preserve">D4. What the owner decides</w:t>
       </w:r>
     </w:p>
     <w:p>
@@ -10990,7 +12258,7 @@
         <w:t xml:space="preserve">Keep the focus as set. </w:t>
       </w:r>
       <w:r>
-        <w:t xml:space="preserve">Then the flagship tapers now (B1: $7.42 → $6.68, then −10% a run), the California King push runs at +30% steps on the child the tracker reads, and the cooling head campaign is re-pointed and re-read at 10-02. Expect little rank movement from California King on its stock.</w:t>
+        <w:t xml:space="preserve">California King stays at maintenance anyway (stock), so in practice this is Bamboo|Cooling alone: capped test steps now and a funded push sized for 10-26. The flagship still needs its funding decision.</w:t>
       </w:r>
     </w:p>
     <w:p>
@@ -11010,7 +12278,7 @@
         <w:t xml:space="preserve">Keep Bamboo|Cooling; swap California King for Bamboo|King from 10-16. </w:t>
       </w:r>
       <w:r>
-        <w:t xml:space="preserve">The King arrival lands that day, the hero converts best, and the group moved in the deal. California King holds at today’s prices until White restocks (PO 11-05).</w:t>
+        <w:t xml:space="preserve">Both groups meet three of the four conditions today, and the fourth (velocity) arrives with the 10-26 Lightning Deal. Size both pushes now (§7: required clicks × price, with the loss ceiling named, §11) and run them in that window. California King holds at its ceiling until White restocks (PO 11-05).</w:t>
       </w:r>
     </w:p>
     <w:p>
@@ -11027,10 +12295,10 @@
           <w:b/>
           <w:bCs/>
         </w:rPr>
-        <w:t xml:space="preserve">Put Bamboo back in focus as a funded test. </w:t>
-      </w:r>
-      <w:r>
-        <w:t xml:space="preserve">Run the daily push the 21 September corrections designed (never loaded) for 14 days, graded on impression share and top-of-search clicks, inside the $73.47 loss stop, and taper it if share does not rise with price. This is the only way to learn whether the head is buyable.</w:t>
+        <w:t xml:space="preserve">Put Bamboo back in focus as a funded push. </w:t>
+      </w:r>
+      <w:r>
+        <w:t xml:space="preserve">Fund the flagship at $519 a day at today’s price (B1) and run it into 10-26, graded on impression share and top-of-search clicks, inside the market bound, with the loss per order named. This is the only way to learn whether the head is buyable, and it is the most expensive choice.</w:t>
       </w:r>
     </w:p>
     <w:p>
@@ -11038,7 +12306,7 @@
         <w:spacing w:after="100"/>
       </w:pPr>
       <w:r>
-        <w:t xml:space="preserve">Our recommendation is 2, with the flagship taper from B1 and a dated re-read of the Bamboo head at the 10-26 Lightning Deal, which is the next velocity window.</w:t>
+        <w:t xml:space="preserve">Our recommendation is 2. The flagship stays held at 299% and $340 until the owner answers B1, and the Bamboo head is re-read at the 10-26 window.</w:t>
       </w:r>
     </w:p>
     <w:p>
@@ -11046,7 +12314,15 @@
         <w:pStyle w:val="Heading1"/>
       </w:pPr>
       <w:r>
-        <w:t xml:space="preserve">In order, starting 09-29</w:t>
+        <w:t xml:space="preserve">Part E — The logic document: where it contradicts itself</w:t>
+      </w:r>
+    </w:p>
+    <w:p>
+      <w:pPr>
+        <w:spacing w:after="100"/>
+      </w:pPr>
+      <w:r>
+        <w:t xml:space="preserve">The arithmetic checks: every worked figure (the placement ceilings, the blends, the four-write ladder, the premium table, the required clicks and budgets) re-derives to the cent. What follows is where two rules conflict, or where a gap in the logic leaves the engine to fill it on its own. The engine fills several of these gaps in this run.</w:t>
       </w:r>
     </w:p>
     <w:p>
@@ -11059,7 +12335,14 @@
         <w:spacing w:after="60"/>
       </w:pPr>
       <w:r>
-        <w:t xml:space="preserve">Verify execution: diff the rows approved on 19 and 21 September against the account and log what loaded. None of the 09-24 push is live.</w:t>
+        <w:rPr>
+          <w:b/>
+          <w:bCs/>
+        </w:rPr>
+        <w:t xml:space="preserve">The base-cut cap and its own examples. </w:t>
+      </w:r>
+      <w:r>
+        <w:t xml:space="preserve">§10 caps a base cut at 25% where the row has real sales. §9’s distribution fix cuts 50% on a 1,240-click campaign “with the conversion to justify” its price, which means real sales. The descent example cuts 50% because “the six orders came at product pages, not at the price being removed”. But the base is the product-page price, so those six orders are exactly what the cut removes. By §10 both are the 25% case.</w:t>
       </w:r>
     </w:p>
     <w:p>
@@ -11072,7 +12355,14 @@
         <w:spacing w:after="60"/>
       </w:pPr>
       <w:r>
-        <w:t xml:space="preserve">The owner chooses the focus (D3) and the flagship option (B1) by 09-30. Until then, the flagship holds at 299% and $340.</w:t>
+        <w:rPr>
+          <w:b/>
+          <w:bCs/>
+        </w:rPr>
+        <w:t xml:space="preserve">Ratio against positions. </w:t>
+      </w:r>
+      <w:r>
+        <w:t xml:space="preserve">§6 says distance is counted in positions, “not multiples, wherever it is used”, yet the premium is sized on the ratio. With a target of 1 the ratio is the rank itself: rank 24 → 1 gives a lift of 11.5, and the row lands on the market bound. 11 of this product’s 40 plan targets are rank 1, so on those the bound, not the gap, sets the price. That is the flat premium §6 says is not sizing. Size the lift on positions, or cap the ratio.</w:t>
       </w:r>
     </w:p>
     <w:p>
@@ -11085,7 +12375,14 @@
         <w:spacing w:after="60"/>
       </w:pPr>
       <w:r>
-        <w:t xml:space="preserve">Pull the rows in C7: the 40 gated to HOLD, the 17 on paused campaigns, the duplicates and folded-broad rows, the 25 sweep cuts, the 17 KING-CREME renames, and the conquest until it is re-pointed to Queen Olive.</w:t>
+        <w:rPr>
+          <w:b/>
+          <w:bCs/>
+        </w:rPr>
+        <w:t xml:space="preserve">The loss ceiling is spend, not loss. </w:t>
+      </w:r>
+      <w:r>
+        <w:t xml:space="preserve">§7 defines it as “that week’s spend at risk” ($286 a week) and §11 shows $41 a day. At the example’s numbers the loss is 3.0 orders × $6.99 = $21 a day, and the other $20 buys contribution back. Call it spend at risk, or compute the loss.</w:t>
       </w:r>
     </w:p>
     <w:p>
@@ -11098,7 +12395,14 @@
         <w:spacing w:after="60"/>
       </w:pPr>
       <w:r>
-        <w:t xml:space="preserve">Load the four in-focus budget raises the code check held (287, 368, 397, 686), and write the dose rows at +30%: 288 → 340% ($5.98), 369 → 290% ($8.97), 398 → 199% ($5.98).</w:t>
+        <w:rPr>
+          <w:b/>
+          <w:bCs/>
+        </w:rPr>
+        <w:t xml:space="preserve">Which window each test reads. </w:t>
+      </w:r>
+      <w:r>
+        <w:t xml:space="preserve">§12’s “no clicks arriving” and its “top of search under 30%” can describe the same campaign and prescribe opposite base moves: 293 has 91% product pages over 90 days and no clicks in 14. The logic should say which window each test reads. The engine used the 90-day mix and cut the base.</w:t>
       </w:r>
     </w:p>
     <w:p>
@@ -11111,7 +12415,14 @@
         <w:spacing w:after="60"/>
       </w:pPr>
       <w:r>
-        <w:t xml:space="preserve">Same day: find why 687, 293 and 1002 stopped serving (the ad, the child, eligibility). No price moves on them, and drop 296 and 297. Re-point 1002 and 31 to a serving child.</w:t>
+        <w:rPr>
+          <w:b/>
+          <w:bCs/>
+        </w:rPr>
+        <w:t xml:space="preserve">Deal windows. </w:t>
+      </w:r>
+      <w:r>
+        <w:t xml:space="preserve">§12 voids every read with a deal week in its window. But it gives no procedure for the weeks after (with 7-day attribution, at least seven settled days before a read counts), and no rule for pushing inside a deal: velocity is the reason §6 funds a climb, yet every rate in that window is void. The 21 September document had to write both.</w:t>
       </w:r>
     </w:p>
     <w:p>
@@ -11124,7 +12435,14 @@
         <w:spacing w:after="60"/>
       </w:pPr>
       <w:r>
-        <w:t xml:space="preserve">California King: confirm which child the tracker reads before the 15 re-points load, and name the cause of the fall from 4 to 16 on “bamboo sheets california king”.</w:t>
+        <w:rPr>
+          <w:b/>
+          <w:bCs/>
+        </w:rPr>
+        <w:t xml:space="preserve">The market bound. </w:t>
+      </w:r>
+      <w:r>
+        <w:t xml:space="preserve">The logic states it as an account-wide $2.80 + 15% stand-in. The engine uses group and lane clearing prices ($4.99, $5.76) with the same tolerance, and its “dose” rule sets the bound aside entirely. The logic should name which input is live and say that nothing overrides it.</w:t>
       </w:r>
     </w:p>
     <w:p>
@@ -11137,7 +12455,14 @@
         <w:spacing w:after="60"/>
       </w:pPr>
       <w:r>
-        <w:t xml:space="preserve">Name the causes on the nine in-focus rank falls and the seven frozen collapses. Load the Twin swap (2155) first; hold 2209 until its cause is named.</w:t>
+        <w:rPr>
+          <w:b/>
+          <w:bCs/>
+        </w:rPr>
+        <w:t xml:space="preserve">Re-pointing mid-push. </w:t>
+      </w:r>
+      <w:r>
+        <w:t xml:space="preserve">§3 prices a campaign on its earned rate and §8 derives the base from the serving child. Nothing says what happens to an earned rate, or its blend weight, when the ad moves to another child. In this run that is 15 California King and 33 Queen campaigns.</w:t>
       </w:r>
     </w:p>
     <w:p>
@@ -11150,7 +12475,22 @@
         <w:spacing w:after="60"/>
       </w:pPr>
       <w:r>
-        <w:t xml:space="preserve">Keep King on White: reject engine check 1’s swap, and rename the 17 KING-CREME rows to the advertised child if they go ahead.</w:t>
+        <w:rPr>
+          <w:b/>
+          <w:bCs/>
+        </w:rPr>
+        <w:t xml:space="preserve">Two requirement figures. </w:t>
+      </w:r>
+      <w:r>
+        <w:t xml:space="preserve">§7 derives required clicks from market units at the target rank. This product carries two such figures for the same term: 490 a week on “bamboo sheets” in the brief and 1,285 a week on the campaign. The logic should name the figure of record.</w:t>
+      </w:r>
+    </w:p>
+    <w:p>
+      <w:pPr>
+        <w:pStyle w:val="Heading1"/>
+      </w:pPr>
+      <w:r>
+        <w:t xml:space="preserve">In order, starting 09-29</w:t>
       </w:r>
     </w:p>
     <w:p>
@@ -11158,12 +12498,12 @@
         <w:pStyle w:val="ListParagraph"/>
         <w:numPr>
           <w:ilvl w:val="0"/>
-          <w:numId w:val="4"/>
+          <w:numId w:val="5"/>
         </w:numPr>
         <w:spacing w:after="60"/>
       </w:pPr>
       <w:r>
-        <w:t xml:space="preserve">Put the 10-26 Lightning Deal into the engine’s deal read and re-check the 10-16 and 10-27 kill dates against it.</w:t>
+        <w:t xml:space="preserve">Verify execution: diff the rows approved on 19 and 21 September against the account and log what loaded. None of the 09-24 push is live.</w:t>
       </w:r>
     </w:p>
     <w:p>
@@ -11171,12 +12511,116 @@
         <w:pStyle w:val="ListParagraph"/>
         <w:numPr>
           <w:ilvl w:val="0"/>
-          <w:numId w:val="4"/>
+          <w:numId w:val="5"/>
         </w:numPr>
         <w:spacing w:after="60"/>
       </w:pPr>
       <w:r>
-        <w:t xml:space="preserve">10-02 checkpoint: read records 2150 and 2863 on “bamboo cooling sheets”. 10-05 day-7: read the dose rows on clicks and impression share, and step again where share rose. Grade every write on the child its sales land on.</w:t>
+        <w:t xml:space="preserve">The owner decides the focus (D4) and the flagship funding row (B1) by 09-30. Until then the flagship holds at 299% and $340, as §14 requires.</w:t>
+      </w:r>
+    </w:p>
+    <w:p>
+      <w:pPr>
+        <w:pStyle w:val="ListParagraph"/>
+        <w:numPr>
+          <w:ilvl w:val="0"/>
+          <w:numId w:val="5"/>
+        </w:numPr>
+        <w:spacing w:after="60"/>
+      </w:pPr>
+      <w:r>
+        <w:t xml:space="preserve">Pull the 105 rows in C7.</w:t>
+      </w:r>
+    </w:p>
+    <w:p>
+      <w:pPr>
+        <w:pStyle w:val="ListParagraph"/>
+        <w:numPr>
+          <w:ilvl w:val="0"/>
+          <w:numId w:val="5"/>
+        </w:numPr>
+        <w:spacing w:after="60"/>
+      </w:pPr>
+      <w:r>
+        <w:t xml:space="preserve">Write the capped test steps, each with its bound, loss per order and a rank prediction: 288 → 340% ($5.98), 398 → 187% ($5.74), and 369 down to 150% ($5.74). Load budgets 287 ($13.98) and 397 ($14.21, with the $18.59-a-day shortfall stated). Bring 462 to 255% and 571 to 98% (the ceiling).</w:t>
+      </w:r>
+    </w:p>
+    <w:p>
+      <w:pPr>
+        <w:pStyle w:val="ListParagraph"/>
+        <w:numPr>
+          <w:ilvl w:val="0"/>
+          <w:numId w:val="5"/>
+        </w:numPr>
+        <w:spacing w:after="60"/>
+      </w:pPr>
+      <w:r>
+        <w:t xml:space="preserve">Same day: run the §10 suppression check on every in-focus down-only push, starting with 687, 293 and 1002. Where it is clear, load the modifier-only steps on 687 and 1002; where it is suppressed, switch to fixed bids at today’s price, stated as a trade. Hold 293’s base, and re-point 1002 and 31 to a serving child.</w:t>
+      </w:r>
+    </w:p>
+    <w:p>
+      <w:pPr>
+        <w:pStyle w:val="ListParagraph"/>
+        <w:numPr>
+          <w:ilvl w:val="0"/>
+          <w:numId w:val="5"/>
+        </w:numPr>
+        <w:spacing w:after="60"/>
+      </w:pPr>
+      <w:r>
+        <w:t xml:space="preserve">California King: confirm which child the tracker reads before the 15 re-points load, re-derive the bases from Burgundy-New, and name the cause of the fall from 4 to 16 on “bamboo sheets california king”.</w:t>
+      </w:r>
+    </w:p>
+    <w:p>
+      <w:pPr>
+        <w:pStyle w:val="ListParagraph"/>
+        <w:numPr>
+          <w:ilvl w:val="0"/>
+          <w:numId w:val="5"/>
+        </w:numPr>
+        <w:spacing w:after="60"/>
+      </w:pPr>
+      <w:r>
+        <w:t xml:space="preserve">Name the causes on the nine in-focus rank falls and the seven frozen collapses. Load the Twin swap (2155) first; hold 2209 until its cause is named.</w:t>
+      </w:r>
+    </w:p>
+    <w:p>
+      <w:pPr>
+        <w:pStyle w:val="ListParagraph"/>
+        <w:numPr>
+          <w:ilvl w:val="0"/>
+          <w:numId w:val="5"/>
+        </w:numPr>
+        <w:spacing w:after="60"/>
+      </w:pPr>
+      <w:r>
+        <w:t xml:space="preserve">Keep King on White: reject engine check 1’s swap, and rename the 17 KING-CREME rows to the advertised child if they go ahead.</w:t>
+      </w:r>
+    </w:p>
+    <w:p>
+      <w:pPr>
+        <w:pStyle w:val="ListParagraph"/>
+        <w:numPr>
+          <w:ilvl w:val="0"/>
+          <w:numId w:val="5"/>
+        </w:numPr>
+        <w:spacing w:after="60"/>
+      </w:pPr>
+      <w:r>
+        <w:t xml:space="preserve">Put the 10-26 Lightning Deal into the engine’s deal read, re-check the 10-16 and 10-27 kill dates against it, and size the 10-26 pushes now (§7, §11).</w:t>
+      </w:r>
+    </w:p>
+    <w:p>
+      <w:pPr>
+        <w:pStyle w:val="ListParagraph"/>
+        <w:numPr>
+          <w:ilvl w:val="0"/>
+          <w:numId w:val="5"/>
+        </w:numPr>
+        <w:spacing w:after="60"/>
+      </w:pPr>
+      <w:r>
+        <w:t xml:space="preserve">Re-read the price rows on the first seven settled post-deal days. 10-02: read records 2150 and 2863 on “bamboo cooling sheets”. 10-05: read the test steps on clicks, impression share and conversion. Grade every write on the child its sales land on.</w:t>
       </w:r>
     </w:p>
     <w:sectPr>
@@ -11374,6 +12818,18 @@
     </w:lvl>
   </w:abstractNum>
   <w:abstractNum w:abstractNumId="4" w15:restartNumberingAfterBreak="0">
+    <w:multiLevelType w:val="hybridMultilevel"/>
+    <w:lvl w:ilvl="0" w:tentative="1">
+      <w:start w:val="1"/>
+      <w:numFmt w:val="decimal"/>
+      <w:lvlText w:val="%1."/>
+      <w:lvlJc w:val="left"/>
+      <w:pPr>
+        <w:ind w:left="360" w:hanging="300"/>
+      </w:pPr>
+    </w:lvl>
+  </w:abstractNum>
+  <w:abstractNum w:abstractNumId="5" w15:restartNumberingAfterBreak="0">
     <w:multiLevelType w:val="hybridMultilevel"/>
     <w:lvl w:ilvl="0" w:tentative="1">
       <w:start w:val="1"/>
@@ -11405,6 +12861,12 @@
   </w:num>
   <w:num w:numId="4">
     <w:abstractNumId w:val="4"/>
+    <w:lvlOverride w:ilvl="0">
+      <w:startOverride w:val="1"/>
+    </w:lvlOverride>
+  </w:num>
+  <w:num w:numId="5">
+    <w:abstractNumId w:val="5"/>
     <w:lvlOverride w:ilvl="0">
       <w:startOverride w:val="1"/>
     </w:lvlOverride>

</xml_diff>

<commit_message>
Account for the second Best Deal (26-30 September) in the 28 September corrections
Seller Central shows a second Best Deal on 51 ASINs running to 30
September that the engine's deal calendar does not carry. Deal rules
hold through 30 September, price descents move to 1 October, and the
clean read window moves to 10-01 to 10-07.

Co-Authored-By: Claude Opus 5.5 <noreply@anthropic.com>
Claude-Session: https://claude.ai/code/session_01LY7A1KPDoE1cQtWdmceR2R
</commit_message>
<xml_diff>
--- a/docs/DBS4_Corrections_by_Situation_20260928.docx
+++ b/docs/DBS4_Corrections_by_Situation_20260928.docx
@@ -22,7 +22,7 @@
         <w:spacing w:after="100"/>
       </w:pPr>
       <w:r>
-        <w:t xml:space="preserve">The Best Deal ends today. This run (20260928-9e6e6bb5) moves the focus to Bamboo|California King and Bamboo|Cooling, pushes those two groups on top of search — three terms with a +75% “dose” step — and tapers everything else one −10% rung per run, modifiers first. Out-of-focus campaigns take no new money; what the taper releases is meant to fund the focus. The agent review endorsed the direction and passed 324 of the 343 rows (17 held, 2 corrected).</w:t>
+        <w:t xml:space="preserve">The first Best Deal (39 ASINs, 15–28 September) ends today. A second Best Deal on 51 ASINs runs 26–30 September, and neither the engine nor its deal calendar knows about it (see “Two Best Deals, not one” below). This run (20260928-9e6e6bb5) moves the focus to Bamboo|California King and Bamboo|Cooling, pushes those two groups on top of search — three terms with a +75% “dose” step — and tapers everything else one −10% rung per run, modifiers first. Out-of-focus campaigns take no new money; what the taper releases is meant to fund the focus. The agent review endorsed the direction and passed 324 of the 343 rows (17 held, 2 corrected).</w:t>
       </w:r>
     </w:p>
     <w:p>
@@ -38,7 +38,7 @@
         <w:spacing w:after="100"/>
       </w:pPr>
       <w:r>
-        <w:t xml:space="preserve">Every exact-campaign price correction here is checked against “Bids and placements on Exact campaigns” (cited as “the logic”, with its section number). Where the logic and the 21 September deal rules differ, the logic governs now that the deal is over. Part E lists the places where the logic document contradicts itself.</w:t>
+        <w:t xml:space="preserve">Every exact-campaign price correction here is checked against “Bids and placements on Exact campaigns” (cited as “the logic”, with its section number). Where the logic and the 21 September deal rules differ, the 21 September deal rules still apply while the second deal runs (29–30 September), and the logic governs from 1 October. Part E lists the places where the logic document contradicts itself.</w:t>
       </w:r>
     </w:p>
     <w:p>
@@ -54,7 +54,7 @@
         <w:t xml:space="preserve">In short. </w:t>
       </w:r>
       <w:r>
-        <w:t xml:space="preserve">The direction holds for Bamboo|Cooling and is weak for California King. About 110 rows should not load as written (105 to pull, 9 to correct), most of them the same engine faults the 21 September document named: rows the engine itself marks HOLD, no-op and duplicate rows, and predictions no budget can buy. Checked against the logic, the three dose pushes are capped by the market bound, so 369 comes down rather than up, and two pushed terms with no rank on file drop to the ceiling. Every 14-day read in this run falls inside a deal window, which the logic treats as void. Two decisions need the owner before anything loads. The first is the flagship “Bamboo Sheets” campaign: the logic says its hold is right, but it has to be written as a funding decision. The second is the California King push on a hero with 44 units.</w:t>
+        <w:t xml:space="preserve">The direction holds for Bamboo|Cooling and is weak for California King. About 110 rows should not load as written (105 to pull, 9 to correct), most of them the same engine faults the 21 September document named: rows the engine itself marks HOLD, no-op and duplicate rows, and predictions no budget can buy. Checked against the logic, the three dose pushes are capped by the market bound, so 369 comes down rather than up, and two pushed terms with no rank on file drop to the ceiling. Every 14-day read in this run falls inside a deal window, which the logic treats as void. The deal doesn’t end today for every ASIN: a second Best Deal runs to 30 September on 51 ASINs, so no in-focus price comes down before 1 October. Two decisions need the owner before anything loads. The first is the flagship “Bamboo Sheets” campaign: the logic says its hold is right, but it has to be written as a funding decision. The second is the California King push on a hero with 44 units.</w:t>
       </w:r>
     </w:p>
     <w:p>
@@ -869,7 +869,7 @@
                 <w:sz w:val="17"/>
                 <w:szCs w:val="17"/>
               </w:rPr>
-              <w:t xml:space="preserve">Deal, second week (09-22 → 09-27)</w:t>
+              <w:t xml:space="preserve">Deal, second week (09-22 → 09-27; second deal from 09-26)</w:t>
             </w:r>
           </w:p>
         </w:tc>
@@ -1902,6 +1902,737 @@
         <w:pStyle w:val="Heading2"/>
       </w:pPr>
       <w:r>
+        <w:t xml:space="preserve">Two Best Deals, not one</w:t>
+      </w:r>
+    </w:p>
+    <w:tbl>
+      <w:tblPr>
+        <w:tblW w:type="dxa" w:w="9972"/>
+        <w:tblBorders>
+          <w:top w:val="single" w:color="auto" w:sz="4"/>
+          <w:left w:val="single" w:color="auto" w:sz="4"/>
+          <w:bottom w:val="single" w:color="auto" w:sz="4"/>
+          <w:right w:val="single" w:color="auto" w:sz="4"/>
+          <w:insideH w:val="single" w:color="auto" w:sz="4"/>
+          <w:insideV w:val="single" w:color="auto" w:sz="4"/>
+        </w:tblBorders>
+      </w:tblPr>
+      <w:tblGrid>
+        <w:gridCol w:w="2600"/>
+        <w:gridCol w:w="1300"/>
+        <w:gridCol w:w="700"/>
+        <w:gridCol w:w="1200"/>
+        <w:gridCol w:w="800"/>
+        <w:gridCol w:w="1100"/>
+        <w:gridCol w:w="1000"/>
+        <w:gridCol w:w="1272"/>
+      </w:tblGrid>
+      <w:tr>
+        <w:trPr>
+          <w:tblHeader/>
+        </w:trPr>
+        <w:tc>
+          <w:tcPr>
+            <w:tcW w:type="dxa" w:w="2600"/>
+            <w:shd w:fill="1F3A5F" w:color="auto" w:val="clear"/>
+            <w:tcMar>
+              <w:top w:type="dxa" w:w="40"/>
+              <w:left w:type="dxa" w:w="70"/>
+              <w:bottom w:type="dxa" w:w="40"/>
+              <w:right w:type="dxa" w:w="70"/>
+            </w:tcMar>
+          </w:tcPr>
+          <w:p>
+            <w:pPr>
+              <w:spacing w:after="0"/>
+            </w:pPr>
+            <w:r>
+              <w:rPr>
+                <w:b/>
+                <w:bCs/>
+                <w:color w:val="FFFFFF"/>
+                <w:sz w:val="17"/>
+                <w:szCs w:val="17"/>
+              </w:rPr>
+              <w:t xml:space="preserve">Promotion (Seller Central)</w:t>
+            </w:r>
+          </w:p>
+        </w:tc>
+        <w:tc>
+          <w:tcPr>
+            <w:tcW w:type="dxa" w:w="1300"/>
+            <w:shd w:fill="1F3A5F" w:color="auto" w:val="clear"/>
+            <w:tcMar>
+              <w:top w:type="dxa" w:w="40"/>
+              <w:left w:type="dxa" w:w="70"/>
+              <w:bottom w:type="dxa" w:w="40"/>
+              <w:right w:type="dxa" w:w="70"/>
+            </w:tcMar>
+          </w:tcPr>
+          <w:p>
+            <w:pPr>
+              <w:spacing w:after="0"/>
+            </w:pPr>
+            <w:r>
+              <w:rPr>
+                <w:b/>
+                <w:bCs/>
+                <w:color w:val="FFFFFF"/>
+                <w:sz w:val="17"/>
+                <w:szCs w:val="17"/>
+              </w:rPr>
+              <w:t xml:space="preserve">Schedule</w:t>
+            </w:r>
+          </w:p>
+        </w:tc>
+        <w:tc>
+          <w:tcPr>
+            <w:tcW w:type="dxa" w:w="700"/>
+            <w:shd w:fill="1F3A5F" w:color="auto" w:val="clear"/>
+            <w:tcMar>
+              <w:top w:type="dxa" w:w="40"/>
+              <w:left w:type="dxa" w:w="70"/>
+              <w:bottom w:type="dxa" w:w="40"/>
+              <w:right w:type="dxa" w:w="70"/>
+            </w:tcMar>
+          </w:tcPr>
+          <w:p>
+            <w:pPr>
+              <w:spacing w:after="0"/>
+            </w:pPr>
+            <w:r>
+              <w:rPr>
+                <w:b/>
+                <w:bCs/>
+                <w:color w:val="FFFFFF"/>
+                <w:sz w:val="17"/>
+                <w:szCs w:val="17"/>
+              </w:rPr>
+              <w:t xml:space="preserve">ASINs</w:t>
+            </w:r>
+          </w:p>
+        </w:tc>
+        <w:tc>
+          <w:tcPr>
+            <w:tcW w:type="dxa" w:w="1200"/>
+            <w:shd w:fill="1F3A5F" w:color="auto" w:val="clear"/>
+            <w:tcMar>
+              <w:top w:type="dxa" w:w="40"/>
+              <w:left w:type="dxa" w:w="70"/>
+              <w:bottom w:type="dxa" w:w="40"/>
+              <w:right w:type="dxa" w:w="70"/>
+            </w:tcMar>
+          </w:tcPr>
+          <w:p>
+            <w:pPr>
+              <w:spacing w:after="0"/>
+            </w:pPr>
+            <w:r>
+              <w:rPr>
+                <w:b/>
+                <w:bCs/>
+                <w:color w:val="FFFFFF"/>
+                <w:sz w:val="17"/>
+                <w:szCs w:val="17"/>
+              </w:rPr>
+              <w:t xml:space="preserve">Sales</w:t>
+            </w:r>
+          </w:p>
+        </w:tc>
+        <w:tc>
+          <w:tcPr>
+            <w:tcW w:type="dxa" w:w="800"/>
+            <w:shd w:fill="1F3A5F" w:color="auto" w:val="clear"/>
+            <w:tcMar>
+              <w:top w:type="dxa" w:w="40"/>
+              <w:left w:type="dxa" w:w="70"/>
+              <w:bottom w:type="dxa" w:w="40"/>
+              <w:right w:type="dxa" w:w="70"/>
+            </w:tcMar>
+          </w:tcPr>
+          <w:p>
+            <w:pPr>
+              <w:spacing w:after="0"/>
+            </w:pPr>
+            <w:r>
+              <w:rPr>
+                <w:b/>
+                <w:bCs/>
+                <w:color w:val="FFFFFF"/>
+                <w:sz w:val="17"/>
+                <w:szCs w:val="17"/>
+              </w:rPr>
+              <w:t xml:space="preserve">Units</w:t>
+            </w:r>
+          </w:p>
+        </w:tc>
+        <w:tc>
+          <w:tcPr>
+            <w:tcW w:type="dxa" w:w="1100"/>
+            <w:shd w:fill="1F3A5F" w:color="auto" w:val="clear"/>
+            <w:tcMar>
+              <w:top w:type="dxa" w:w="40"/>
+              <w:left w:type="dxa" w:w="70"/>
+              <w:bottom w:type="dxa" w:w="40"/>
+              <w:right w:type="dxa" w:w="70"/>
+            </w:tcMar>
+          </w:tcPr>
+          <w:p>
+            <w:pPr>
+              <w:spacing w:after="0"/>
+            </w:pPr>
+            <w:r>
+              <w:rPr>
+                <w:b/>
+                <w:bCs/>
+                <w:color w:val="FFFFFF"/>
+                <w:sz w:val="17"/>
+                <w:szCs w:val="17"/>
+              </w:rPr>
+              <w:t xml:space="preserve">Glance views</w:t>
+            </w:r>
+          </w:p>
+        </w:tc>
+        <w:tc>
+          <w:tcPr>
+            <w:tcW w:type="dxa" w:w="1000"/>
+            <w:shd w:fill="1F3A5F" w:color="auto" w:val="clear"/>
+            <w:tcMar>
+              <w:top w:type="dxa" w:w="40"/>
+              <w:left w:type="dxa" w:w="70"/>
+              <w:bottom w:type="dxa" w:w="40"/>
+              <w:right w:type="dxa" w:w="70"/>
+            </w:tcMar>
+          </w:tcPr>
+          <w:p>
+            <w:pPr>
+              <w:spacing w:after="0"/>
+            </w:pPr>
+            <w:r>
+              <w:rPr>
+                <w:b/>
+                <w:bCs/>
+                <w:color w:val="FFFFFF"/>
+                <w:sz w:val="17"/>
+                <w:szCs w:val="17"/>
+              </w:rPr>
+              <w:t xml:space="preserve">Conversion</w:t>
+            </w:r>
+          </w:p>
+        </w:tc>
+        <w:tc>
+          <w:tcPr>
+            <w:tcW w:type="dxa" w:w="1272"/>
+            <w:shd w:fill="1F3A5F" w:color="auto" w:val="clear"/>
+            <w:tcMar>
+              <w:top w:type="dxa" w:w="40"/>
+              <w:left w:type="dxa" w:w="70"/>
+              <w:bottom w:type="dxa" w:w="40"/>
+              <w:right w:type="dxa" w:w="70"/>
+            </w:tcMar>
+          </w:tcPr>
+          <w:p>
+            <w:pPr>
+              <w:spacing w:after="0"/>
+            </w:pPr>
+            <w:r>
+              <w:rPr>
+                <w:b/>
+                <w:bCs/>
+                <w:color w:val="FFFFFF"/>
+                <w:sz w:val="17"/>
+                <w:szCs w:val="17"/>
+              </w:rPr>
+              <w:t xml:space="preserve">Status 09-28</w:t>
+            </w:r>
+          </w:p>
+        </w:tc>
+      </w:tr>
+      <w:tr>
+        <w:tc>
+          <w:tcPr>
+            <w:tcW w:type="dxa" w:w="2600"/>
+            <w:shd w:fill="FFFFFF" w:color="auto" w:val="clear"/>
+            <w:tcMar>
+              <w:top w:type="dxa" w:w="40"/>
+              <w:left w:type="dxa" w:w="70"/>
+              <w:bottom w:type="dxa" w:w="40"/>
+              <w:right w:type="dxa" w:w="70"/>
+            </w:tcMar>
+          </w:tcPr>
+          <w:p>
+            <w:pPr>
+              <w:spacing w:after="0"/>
+            </w:pPr>
+            <w:r>
+              <w:rPr>
+                <w:sz w:val="17"/>
+                <w:szCs w:val="17"/>
+              </w:rPr>
+              <w:t xml:space="preserve">Best Deal · Deals-2026/09/04 18-32-34-622</w:t>
+            </w:r>
+          </w:p>
+        </w:tc>
+        <w:tc>
+          <w:tcPr>
+            <w:tcW w:type="dxa" w:w="1300"/>
+            <w:shd w:fill="FFFFFF" w:color="auto" w:val="clear"/>
+            <w:tcMar>
+              <w:top w:type="dxa" w:w="40"/>
+              <w:left w:type="dxa" w:w="70"/>
+              <w:bottom w:type="dxa" w:w="40"/>
+              <w:right w:type="dxa" w:w="70"/>
+            </w:tcMar>
+          </w:tcPr>
+          <w:p>
+            <w:pPr>
+              <w:spacing w:after="0"/>
+            </w:pPr>
+            <w:r>
+              <w:rPr>
+                <w:sz w:val="17"/>
+                <w:szCs w:val="17"/>
+              </w:rPr>
+              <w:t xml:space="preserve">15–28 Sep</w:t>
+            </w:r>
+          </w:p>
+        </w:tc>
+        <w:tc>
+          <w:tcPr>
+            <w:tcW w:type="dxa" w:w="700"/>
+            <w:shd w:fill="FFFFFF" w:color="auto" w:val="clear"/>
+            <w:tcMar>
+              <w:top w:type="dxa" w:w="40"/>
+              <w:left w:type="dxa" w:w="70"/>
+              <w:bottom w:type="dxa" w:w="40"/>
+              <w:right w:type="dxa" w:w="70"/>
+            </w:tcMar>
+          </w:tcPr>
+          <w:p>
+            <w:pPr>
+              <w:spacing w:after="0"/>
+            </w:pPr>
+            <w:r>
+              <w:rPr>
+                <w:sz w:val="17"/>
+                <w:szCs w:val="17"/>
+              </w:rPr>
+              <w:t xml:space="preserve">39</w:t>
+            </w:r>
+          </w:p>
+        </w:tc>
+        <w:tc>
+          <w:tcPr>
+            <w:tcW w:type="dxa" w:w="1200"/>
+            <w:shd w:fill="FFFFFF" w:color="auto" w:val="clear"/>
+            <w:tcMar>
+              <w:top w:type="dxa" w:w="40"/>
+              <w:left w:type="dxa" w:w="70"/>
+              <w:bottom w:type="dxa" w:w="40"/>
+              <w:right w:type="dxa" w:w="70"/>
+            </w:tcMar>
+          </w:tcPr>
+          <w:p>
+            <w:pPr>
+              <w:spacing w:after="0"/>
+            </w:pPr>
+            <w:r>
+              <w:rPr>
+                <w:sz w:val="17"/>
+                <w:szCs w:val="17"/>
+              </w:rPr>
+              <w:t xml:space="preserve">$53,568.03</w:t>
+            </w:r>
+          </w:p>
+        </w:tc>
+        <w:tc>
+          <w:tcPr>
+            <w:tcW w:type="dxa" w:w="800"/>
+            <w:shd w:fill="FFFFFF" w:color="auto" w:val="clear"/>
+            <w:tcMar>
+              <w:top w:type="dxa" w:w="40"/>
+              <w:left w:type="dxa" w:w="70"/>
+              <w:bottom w:type="dxa" w:w="40"/>
+              <w:right w:type="dxa" w:w="70"/>
+            </w:tcMar>
+          </w:tcPr>
+          <w:p>
+            <w:pPr>
+              <w:spacing w:after="0"/>
+            </w:pPr>
+            <w:r>
+              <w:rPr>
+                <w:sz w:val="17"/>
+                <w:szCs w:val="17"/>
+              </w:rPr>
+              <w:t xml:space="preserve">752</w:t>
+            </w:r>
+          </w:p>
+        </w:tc>
+        <w:tc>
+          <w:tcPr>
+            <w:tcW w:type="dxa" w:w="1100"/>
+            <w:shd w:fill="FFFFFF" w:color="auto" w:val="clear"/>
+            <w:tcMar>
+              <w:top w:type="dxa" w:w="40"/>
+              <w:left w:type="dxa" w:w="70"/>
+              <w:bottom w:type="dxa" w:w="40"/>
+              <w:right w:type="dxa" w:w="70"/>
+            </w:tcMar>
+          </w:tcPr>
+          <w:p>
+            <w:pPr>
+              <w:spacing w:after="0"/>
+            </w:pPr>
+            <w:r>
+              <w:rPr>
+                <w:sz w:val="17"/>
+                <w:szCs w:val="17"/>
+              </w:rPr>
+              <w:t xml:space="preserve">20,992</w:t>
+            </w:r>
+          </w:p>
+        </w:tc>
+        <w:tc>
+          <w:tcPr>
+            <w:tcW w:type="dxa" w:w="1000"/>
+            <w:shd w:fill="FFFFFF" w:color="auto" w:val="clear"/>
+            <w:tcMar>
+              <w:top w:type="dxa" w:w="40"/>
+              <w:left w:type="dxa" w:w="70"/>
+              <w:bottom w:type="dxa" w:w="40"/>
+              <w:right w:type="dxa" w:w="70"/>
+            </w:tcMar>
+          </w:tcPr>
+          <w:p>
+            <w:pPr>
+              <w:spacing w:after="0"/>
+            </w:pPr>
+            <w:r>
+              <w:rPr>
+                <w:sz w:val="17"/>
+                <w:szCs w:val="17"/>
+              </w:rPr>
+              <w:t xml:space="preserve">3.6%</w:t>
+            </w:r>
+          </w:p>
+        </w:tc>
+        <w:tc>
+          <w:tcPr>
+            <w:tcW w:type="dxa" w:w="1272"/>
+            <w:shd w:fill="FFFFFF" w:color="auto" w:val="clear"/>
+            <w:tcMar>
+              <w:top w:type="dxa" w:w="40"/>
+              <w:left w:type="dxa" w:w="70"/>
+              <w:bottom w:type="dxa" w:w="40"/>
+              <w:right w:type="dxa" w:w="70"/>
+            </w:tcMar>
+          </w:tcPr>
+          <w:p>
+            <w:pPr>
+              <w:spacing w:after="0"/>
+            </w:pPr>
+            <w:r>
+              <w:rPr>
+                <w:sz w:val="17"/>
+                <w:szCs w:val="17"/>
+              </w:rPr>
+              <w:t xml:space="preserve">Running, ends today</w:t>
+            </w:r>
+          </w:p>
+        </w:tc>
+      </w:tr>
+      <w:tr>
+        <w:tc>
+          <w:tcPr>
+            <w:tcW w:type="dxa" w:w="2600"/>
+            <w:shd w:fill="F2F5F9" w:color="auto" w:val="clear"/>
+            <w:tcMar>
+              <w:top w:type="dxa" w:w="40"/>
+              <w:left w:type="dxa" w:w="70"/>
+              <w:bottom w:type="dxa" w:w="40"/>
+              <w:right w:type="dxa" w:w="70"/>
+            </w:tcMar>
+          </w:tcPr>
+          <w:p>
+            <w:pPr>
+              <w:spacing w:after="0"/>
+            </w:pPr>
+            <w:r>
+              <w:rPr>
+                <w:sz w:val="17"/>
+                <w:szCs w:val="17"/>
+              </w:rPr>
+              <w:t xml:space="preserve">Best Deal · Deals-2026/09/04 18-34-39-334</w:t>
+            </w:r>
+          </w:p>
+        </w:tc>
+        <w:tc>
+          <w:tcPr>
+            <w:tcW w:type="dxa" w:w="1300"/>
+            <w:shd w:fill="F2F5F9" w:color="auto" w:val="clear"/>
+            <w:tcMar>
+              <w:top w:type="dxa" w:w="40"/>
+              <w:left w:type="dxa" w:w="70"/>
+              <w:bottom w:type="dxa" w:w="40"/>
+              <w:right w:type="dxa" w:w="70"/>
+            </w:tcMar>
+          </w:tcPr>
+          <w:p>
+            <w:pPr>
+              <w:spacing w:after="0"/>
+            </w:pPr>
+            <w:r>
+              <w:rPr>
+                <w:sz w:val="17"/>
+                <w:szCs w:val="17"/>
+              </w:rPr>
+              <w:t xml:space="preserve">26–30 Sep</w:t>
+            </w:r>
+          </w:p>
+        </w:tc>
+        <w:tc>
+          <w:tcPr>
+            <w:tcW w:type="dxa" w:w="700"/>
+            <w:shd w:fill="F2F5F9" w:color="auto" w:val="clear"/>
+            <w:tcMar>
+              <w:top w:type="dxa" w:w="40"/>
+              <w:left w:type="dxa" w:w="70"/>
+              <w:bottom w:type="dxa" w:w="40"/>
+              <w:right w:type="dxa" w:w="70"/>
+            </w:tcMar>
+          </w:tcPr>
+          <w:p>
+            <w:pPr>
+              <w:spacing w:after="0"/>
+            </w:pPr>
+            <w:r>
+              <w:rPr>
+                <w:sz w:val="17"/>
+                <w:szCs w:val="17"/>
+              </w:rPr>
+              <w:t xml:space="preserve">51</w:t>
+            </w:r>
+          </w:p>
+        </w:tc>
+        <w:tc>
+          <w:tcPr>
+            <w:tcW w:type="dxa" w:w="1200"/>
+            <w:shd w:fill="F2F5F9" w:color="auto" w:val="clear"/>
+            <w:tcMar>
+              <w:top w:type="dxa" w:w="40"/>
+              <w:left w:type="dxa" w:w="70"/>
+              <w:bottom w:type="dxa" w:w="40"/>
+              <w:right w:type="dxa" w:w="70"/>
+            </w:tcMar>
+          </w:tcPr>
+          <w:p>
+            <w:pPr>
+              <w:spacing w:after="0"/>
+            </w:pPr>
+            <w:r>
+              <w:rPr>
+                <w:sz w:val="17"/>
+                <w:szCs w:val="17"/>
+              </w:rPr>
+              <w:t xml:space="preserve">$6,912.18</w:t>
+            </w:r>
+          </w:p>
+        </w:tc>
+        <w:tc>
+          <w:tcPr>
+            <w:tcW w:type="dxa" w:w="800"/>
+            <w:shd w:fill="F2F5F9" w:color="auto" w:val="clear"/>
+            <w:tcMar>
+              <w:top w:type="dxa" w:w="40"/>
+              <w:left w:type="dxa" w:w="70"/>
+              <w:bottom w:type="dxa" w:w="40"/>
+              <w:right w:type="dxa" w:w="70"/>
+            </w:tcMar>
+          </w:tcPr>
+          <w:p>
+            <w:pPr>
+              <w:spacing w:after="0"/>
+            </w:pPr>
+            <w:r>
+              <w:rPr>
+                <w:sz w:val="17"/>
+                <w:szCs w:val="17"/>
+              </w:rPr>
+              <w:t xml:space="preserve">98</w:t>
+            </w:r>
+          </w:p>
+        </w:tc>
+        <w:tc>
+          <w:tcPr>
+            <w:tcW w:type="dxa" w:w="1100"/>
+            <w:shd w:fill="F2F5F9" w:color="auto" w:val="clear"/>
+            <w:tcMar>
+              <w:top w:type="dxa" w:w="40"/>
+              <w:left w:type="dxa" w:w="70"/>
+              <w:bottom w:type="dxa" w:w="40"/>
+              <w:right w:type="dxa" w:w="70"/>
+            </w:tcMar>
+          </w:tcPr>
+          <w:p>
+            <w:pPr>
+              <w:spacing w:after="0"/>
+            </w:pPr>
+            <w:r>
+              <w:rPr>
+                <w:sz w:val="17"/>
+                <w:szCs w:val="17"/>
+              </w:rPr>
+              <w:t xml:space="preserve">2,073</w:t>
+            </w:r>
+          </w:p>
+        </w:tc>
+        <w:tc>
+          <w:tcPr>
+            <w:tcW w:type="dxa" w:w="1000"/>
+            <w:shd w:fill="F2F5F9" w:color="auto" w:val="clear"/>
+            <w:tcMar>
+              <w:top w:type="dxa" w:w="40"/>
+              <w:left w:type="dxa" w:w="70"/>
+              <w:bottom w:type="dxa" w:w="40"/>
+              <w:right w:type="dxa" w:w="70"/>
+            </w:tcMar>
+          </w:tcPr>
+          <w:p>
+            <w:pPr>
+              <w:spacing w:after="0"/>
+            </w:pPr>
+            <w:r>
+              <w:rPr>
+                <w:sz w:val="17"/>
+                <w:szCs w:val="17"/>
+              </w:rPr>
+              <w:t xml:space="preserve">4.7%</w:t>
+            </w:r>
+          </w:p>
+        </w:tc>
+        <w:tc>
+          <w:tcPr>
+            <w:tcW w:type="dxa" w:w="1272"/>
+            <w:shd w:fill="F2F5F9" w:color="auto" w:val="clear"/>
+            <w:tcMar>
+              <w:top w:type="dxa" w:w="40"/>
+              <w:left w:type="dxa" w:w="70"/>
+              <w:bottom w:type="dxa" w:w="40"/>
+              <w:right w:type="dxa" w:w="70"/>
+            </w:tcMar>
+          </w:tcPr>
+          <w:p>
+            <w:pPr>
+              <w:spacing w:after="0"/>
+            </w:pPr>
+            <w:r>
+              <w:rPr>
+                <w:sz w:val="17"/>
+                <w:szCs w:val="17"/>
+              </w:rPr>
+              <w:t xml:space="preserve">Running, two days left</w:t>
+            </w:r>
+          </w:p>
+        </w:tc>
+      </w:tr>
+    </w:tbl>
+    <w:p>
+      <w:pPr>
+        <w:spacing w:after="120"/>
+      </w:pPr>
+      <w:r>
+        <w:rPr>
+          <w:i/>
+          <w:iCs/>
+          <w:color w:val="555555"/>
+          <w:sz w:val="17"/>
+          <w:szCs w:val="17"/>
+        </w:rPr>
+        <w:t xml:space="preserve">Seller Central promotions page, read 09-28. Both deals cost $70 a day plus 1% of sales.</w:t>
+      </w:r>
+    </w:p>
+    <w:p>
+      <w:pPr>
+        <w:spacing w:after="100"/>
+      </w:pPr>
+      <w:r>
+        <w:t xml:space="preserve">The engine’s calendar carries only the first deal (“Best Deal [deal-calendar-csv:D130]”, 09-15 → 09-28). The second deal is on no calendar the engine reads. So this run, its review, and the first two versions of this document all treated 28 September as the end of the deal. It isn’t. Three things follow:</w:t>
+      </w:r>
+    </w:p>
+    <w:p>
+      <w:pPr>
+        <w:pStyle w:val="ListParagraph"/>
+        <w:numPr>
+          <w:ilvl w:val="0"/>
+          <w:numId w:val="2"/>
+        </w:numPr>
+        <w:spacing w:after="60"/>
+      </w:pPr>
+      <w:r>
+        <w:rPr>
+          <w:b/>
+          <w:bCs/>
+        </w:rPr>
+        <w:t xml:space="preserve">Two more deal days. </w:t>
+      </w:r>
+      <w:r>
+        <w:t xml:space="preserve">For 29–30 September the 21 September deal rules still apply: the daily push inside the 3× contribution loss stop, with the market limit off. No in-focus price comes down before 1 October, so 369’s descent to its bound and the ceiling moves on 462 and 571 wait until then (A2, A4).</w:t>
+      </w:r>
+    </w:p>
+    <w:p>
+      <w:pPr>
+        <w:pStyle w:val="ListParagraph"/>
+        <w:numPr>
+          <w:ilvl w:val="0"/>
+          <w:numId w:val="2"/>
+        </w:numPr>
+        <w:spacing w:after="60"/>
+      </w:pPr>
+      <w:r>
+        <w:rPr>
+          <w:b/>
+          <w:bCs/>
+        </w:rPr>
+        <w:t xml:space="preserve">The clean read starts later. </w:t>
+      </w:r>
+      <w:r>
+        <w:t xml:space="preserve">Post-deal starts 1 October, so the first clean seven days are 10-01 → 10-07, with attribution complete by 10-14 (C1b).</w:t>
+      </w:r>
+    </w:p>
+    <w:p>
+      <w:pPr>
+        <w:pStyle w:val="ListParagraph"/>
+        <w:numPr>
+          <w:ilvl w:val="0"/>
+          <w:numId w:val="2"/>
+        </w:numPr>
+        <w:spacing w:after="60"/>
+      </w:pPr>
+      <w:r>
+        <w:rPr>
+          <w:b/>
+          <w:bCs/>
+        </w:rPr>
+        <w:t xml:space="preserve">The 09-27 jump is the second deal. </w:t>
+      </w:r>
+      <w:r>
+        <w:t xml:space="preserve">The 516 clicks that day, 199 of them on product pages, fall on the second deal’s first full day. They are not a result of anything the run changed.</w:t>
+      </w:r>
+    </w:p>
+    <w:p>
+      <w:pPr>
+        <w:spacing w:after="100"/>
+      </w:pPr>
+      <w:r>
+        <w:t xml:space="preserve">Which children the 51 ASINs cover matters. If they include the serving children this run re-points to (California King Burgundy-New, Queen Olive, King Creme), the in-focus steps sell at deal prices for their first two days. Their first reads are then deal reads.</w:t>
+      </w:r>
+    </w:p>
+    <w:p>
+      <w:pPr>
+        <w:pStyle w:val="Heading2"/>
+      </w:pPr>
+      <w:r>
         <w:t xml:space="preserve">Windows and sources</w:t>
       </w:r>
     </w:p>
@@ -2062,7 +2793,7 @@
         <w:spacing w:after="100"/>
       </w:pPr>
       <w:r>
-        <w:t xml:space="preserve">The 21 September loss stop (3× contribution per order) was a deal rule and lapsed with the deal. The deal is over, so the push now sells at list price, and the logic (§6) asks for sales velocity in the window before a wide gap is funded. The next velocity window is the 10-26 Lightning Deal.</w:t>
+        <w:t xml:space="preserve">The 21 September loss stop (3× contribution per order) is a deal rule. It still applies on 29–30 September while the second deal runs, and it lapses on 1 October. From then the push sells at list price, and the logic (§6) asks for sales velocity in the window before a wide gap is funded. The next velocity window after 30 September is the 10-26 Lightning Deal.</w:t>
       </w:r>
     </w:p>
     <w:p>
@@ -4880,7 +5611,7 @@
         <w:t xml:space="preserve">Correction. </w:t>
       </w:r>
       <w:r>
-        <w:t xml:space="preserve">Write 288 at 340% ($5.98), 369 down to 150% ($5.74) and 398 at 187% ($5.74), each with its bound, its loss per order and a rank prediction. Two of the four §6 conditions are not yet shown on these terms. Conversion is unread (0 orders on 7–9 clicks), and there is no sales-velocity window until the 10-26 Lightning Deal. So these steps are tests that earn the conversion read, not a funded climb. Read them at 10-05, and size the funded push for the 10-26 window with §7’s budget.</w:t>
+        <w:t xml:space="preserve">Write 288 at 340% ($5.98), 369 down to 150% ($5.74) and 398 at 187% ($5.74), each with its bound, its loss per order and a rank prediction. Two of the four §6 conditions are not yet shown on these terms. Conversion is unread (0 orders on 7–9 clicks), and there is no sales-velocity window until the 10-26 Lightning Deal. So these steps are tests that earn the conversion read, not a funded climb. 288 and 398 fit both the deal rules and the logic, so they can load now. 369’s descent waits until 10-01, because the deal rules keep the market limit off until then. Read the steps at 10-07 on the first clean week, and size the funded push for the 10-26 window with §7’s budget.</w:t>
       </w:r>
     </w:p>
     <w:p>
@@ -5101,7 +5832,7 @@
         <w:t xml:space="preserve">Two pushed terms have no rank on file. </w:t>
       </w:r>
       <w:r>
-        <w:t xml:space="preserve">“bamboo cal king sheets” (462) is unranked, and “california king sheets bamboo” (571) has only a 26 June reading. The engine gates both to “change → HOLD” and still writes +25%. The logic (§6, fourth row of its table) says a term with no rank on file is “enabled at the ceiling with no premium” and becomes a push candidate once a rank read exists. Both sit above their ceilings today ($4.82 against $3.51, and $4.75 against $3.77) with almost no delivery. §10 allows “any size, straight to the derived price” for a row with no delivery. Correction: 462 → $3.51 (modifier 255% on $0.99); 571 → $3.77 (modifier 98% on $1.90).</w:t>
+        <w:t xml:space="preserve">“bamboo cal king sheets” (462) is unranked, and “california king sheets bamboo” (571) has only a 26 June reading. The engine gates both to “change → HOLD” and still writes +25%. The logic (§6, fourth row of its table) says a term with no rank on file is “enabled at the ceiling with no premium” and becomes a push candidate once a rank read exists. Both sit above their ceilings today ($4.82 against $3.51, and $4.75 against $3.77) with almost no delivery. §10 allows “any size, straight to the derived price” for a row with no delivery. Correction, from 1 October once the second deal ends: 462 → $3.51 (modifier 255% on $0.99); 571 → $3.77 (modifier 98% on $1.90). Until then, pull the +25% raises.</w:t>
       </w:r>
     </w:p>
     <w:p>
@@ -6654,7 +7385,7 @@
         <w:spacing w:after="100"/>
       </w:pPr>
       <w:r>
-        <w:t xml:space="preserve">The 15/16 September round is the only price move that shows in the account. The effective top-of-search bid went from about $4.40 to $5.50, and top-of-search clicks from 94 to about 150 a day. Nothing moved after that. The second week had the same bid ($5.40) and slightly fewer top-of-search clicks, and product pages grew to match top of search.</w:t>
+        <w:t xml:space="preserve">The 15/16 September round is the only price move that shows in the account. The effective top-of-search bid went from about $4.40 to $5.50, and top-of-search clicks from 94 to about 150 a day. Nothing moved after that. The second week had the same bid ($5.40) and slightly fewer top-of-search clicks, and product pages grew to match top of search. The jump on 09-27 is the second deal (26–30 September) starting, not a price move.</w:t>
       </w:r>
     </w:p>
     <w:p>
@@ -8871,7 +9602,7 @@
           <w:sz w:val="17"/>
           <w:szCs w:val="17"/>
         </w:rPr>
-        <w:t xml:space="preserve">B4, all campaigns, 01–27 September: estimated top-of-search and product-page clicks a day, the spend-weighted effective top-of-search bid, and group rank (daily median). Dashed lines: the 10 September round, the 15/16 September round, and 24 September, when the corrected daily push was due. Shaded: the Best Deal.</w:t>
+        <w:t xml:space="preserve">B4, all campaigns, 01–27 September: estimated top-of-search and product-page clicks a day, the spend-weighted effective top-of-search bid, and group rank (daily median). Dashed lines: the 10 September round, the 15/16 September round, and 24 September, when the corrected daily push was due. Shaded: the first Best Deal (15–28 September). The second Best Deal (26–30 September, 51 ASINs) overlaps its last three days.</w:t>
       </w:r>
     </w:p>
     <w:p>
@@ -8951,7 +9682,7 @@
         <w:t xml:space="preserve">Correction. </w:t>
       </w:r>
       <w:r>
-        <w:t xml:space="preserve">Treat every row sized on a 14-day read as provisional. Load the stock and hygiene rows now: re-points to serving children, pauses, walls, and renames that match the child. Re-read the price rows on the first seven post-deal days as they settle (09-29 → 10-05, attribution complete by 10-12). The capped steps in A2 go ahead because they are tests of a condition, not reads of one.</w:t>
+        <w:t xml:space="preserve">Treat every row sized on a 14-day read as provisional. Load the stock and hygiene rows now: re-points to serving children, pauses, walls, and renames that match the child. Re-read the price rows on the first seven post-deal days as they settle (10-01 → 10-07, attribution complete by 10-14). 29 and 30 September are deal days too. The capped steps in A2 go ahead because they are tests of a condition, not reads of one.</w:t>
       </w:r>
     </w:p>
     <w:p>
@@ -9630,7 +10361,7 @@
         <w:t xml:space="preserve">See the deal. </w:t>
       </w:r>
       <w:r>
-        <w:t xml:space="preserve">engine_read is still null, and the Summary says “No deal in the window” even though the Lightning Deal on 10-26 sits inside the brief’s own 09-28 → 10-28 window. It lands one day before the Queen and Full kill dates (10-27). Deal-window reads are void under §12, and the engine should say so on every row that uses one.</w:t>
+        <w:t xml:space="preserve">engine_read is still null. The engine’s calendar misses the second Best Deal (51 ASINs, 26–30 September) entirely, and the Summary says “No deal in the window” even though the Lightning Deal on 10-26 sits inside the brief’s own 09-28 → 10-28 window. It lands one day before the Queen and Full kill dates (10-27). Deal-window reads are void under §12, and the engine should say so on every row that uses one.</w:t>
       </w:r>
     </w:p>
     <w:p>
@@ -10110,7 +10841,7 @@
         <w:t xml:space="preserve">Under the logic, nothing is a funded push until 10-26. </w:t>
       </w:r>
       <w:r>
-        <w:t xml:space="preserve">A wide gap is funded only when sales velocity is available in the window (§6), and the next window is the 10-26 Lightning Deal. Until then the focus terms take capped test steps that earn the conversion read (A2), and everything else stays at maintenance: the ceiling, no premium, the 70/20 mix.</w:t>
+        <w:t xml:space="preserve">A wide gap is funded only when sales velocity is available in the window (§6). The second deal gives two more days on its 51 ASINs, too short to fund a climb from today’s reads. After 30 September the next window is the 10-26 Lightning Deal. Until then the focus terms take capped test steps that earn the conversion read (A2), and everything else stays at maintenance: the ceiling, no premium, the 70/20 mix.</w:t>
       </w:r>
     </w:p>
     <w:p>
@@ -11670,7 +12401,7 @@
                 <w:sz w:val="17"/>
                 <w:szCs w:val="17"/>
               </w:rPr>
-              <w:t xml:space="preserve">No deal until 10-26</w:t>
+              <w:t xml:space="preserve">Second deal to 09-30, then none until 10-26</w:t>
             </w:r>
           </w:p>
         </w:tc>
@@ -11816,7 +12547,7 @@
                 <w:sz w:val="17"/>
                 <w:szCs w:val="17"/>
               </w:rPr>
-              <w:t xml:space="preserve">No deal until 10-26</w:t>
+              <w:t xml:space="preserve">Second deal to 09-30, then none until 10-26</w:t>
             </w:r>
           </w:p>
         </w:tc>
@@ -11962,7 +12693,7 @@
                 <w:sz w:val="17"/>
                 <w:szCs w:val="17"/>
               </w:rPr>
-              <w:t xml:space="preserve">No deal until 10-26</w:t>
+              <w:t xml:space="preserve">Second deal to 09-30, then none until 10-26</w:t>
             </w:r>
           </w:p>
         </w:tc>
@@ -12108,7 +12839,7 @@
                 <w:sz w:val="17"/>
                 <w:szCs w:val="17"/>
               </w:rPr>
-              <w:t xml:space="preserve">No deal until 10-26</w:t>
+              <w:t xml:space="preserve">Second deal to 09-30, then none until 10-26</w:t>
             </w:r>
           </w:p>
         </w:tc>
@@ -12529,7 +13260,7 @@
         <w:spacing w:after="60"/>
       </w:pPr>
       <w:r>
-        <w:t xml:space="preserve">Pull the 105 rows in C7.</w:t>
+        <w:t xml:space="preserve">Confirm which children the second Best Deal’s 51 ASINs cover. Until 30 September its deal rules apply, and no in-focus price comes down.</w:t>
       </w:r>
     </w:p>
     <w:p>
@@ -12542,7 +13273,7 @@
         <w:spacing w:after="60"/>
       </w:pPr>
       <w:r>
-        <w:t xml:space="preserve">Write the capped test steps, each with its bound, loss per order and a rank prediction: 288 → 340% ($5.98), 398 → 187% ($5.74), and 369 down to 150% ($5.74). Load budgets 287 ($13.98) and 397 ($14.21, with the $18.59-a-day shortfall stated). Bring 462 to 255% and 571 to 98% (the ceiling).</w:t>
+        <w:t xml:space="preserve">Pull the 105 rows in C7.</w:t>
       </w:r>
     </w:p>
     <w:p>
@@ -12555,7 +13286,7 @@
         <w:spacing w:after="60"/>
       </w:pPr>
       <w:r>
-        <w:t xml:space="preserve">Same day: run the §10 suppression check on every in-focus down-only push, starting with 687, 293 and 1002. Where it is clear, load the modifier-only steps on 687 and 1002; where it is suppressed, switch to fixed bids at today’s price, stated as a trade. Hold 293’s base, and re-point 1002 and 31 to a serving child.</w:t>
+        <w:t xml:space="preserve">Write the capped test steps now, each with its bound, loss per order and a rank prediction: 288 → 340% ($5.98) and 398 → 187% ($5.74). Load budgets 287 ($13.98) and 397 ($14.21, with the $18.59-a-day shortfall stated). On 1 October, once the second deal ends, bring 369 down to 150% ($5.74), 462 to 255% and 571 to 98% (the ceiling).</w:t>
       </w:r>
     </w:p>
     <w:p>
@@ -12568,7 +13299,7 @@
         <w:spacing w:after="60"/>
       </w:pPr>
       <w:r>
-        <w:t xml:space="preserve">California King: confirm which child the tracker reads before the 15 re-points load, re-derive the bases from Burgundy-New, and name the cause of the fall from 4 to 16 on “bamboo sheets california king”.</w:t>
+        <w:t xml:space="preserve">Same day: run the §10 suppression check on every in-focus down-only push, starting with 687, 293 and 1002. Where it is clear, load the modifier-only steps on 687 and 1002; where it is suppressed, switch to fixed bids at today’s price, stated as a trade. Hold 293’s base, and re-point 1002 and 31 to a serving child.</w:t>
       </w:r>
     </w:p>
     <w:p>
@@ -12581,7 +13312,7 @@
         <w:spacing w:after="60"/>
       </w:pPr>
       <w:r>
-        <w:t xml:space="preserve">Name the causes on the nine in-focus rank falls and the seven frozen collapses. Load the Twin swap (2155) first; hold 2209 until its cause is named.</w:t>
+        <w:t xml:space="preserve">California King: confirm which child the tracker reads before the 15 re-points load, re-derive the bases from Burgundy-New, and name the cause of the fall from 4 to 16 on “bamboo sheets california king”.</w:t>
       </w:r>
     </w:p>
     <w:p>
@@ -12594,7 +13325,7 @@
         <w:spacing w:after="60"/>
       </w:pPr>
       <w:r>
-        <w:t xml:space="preserve">Keep King on White: reject engine check 1’s swap, and rename the 17 KING-CREME rows to the advertised child if they go ahead.</w:t>
+        <w:t xml:space="preserve">Name the causes on the nine in-focus rank falls and the seven frozen collapses. Load the Twin swap (2155) first; hold 2209 until its cause is named.</w:t>
       </w:r>
     </w:p>
     <w:p>
@@ -12607,7 +13338,7 @@
         <w:spacing w:after="60"/>
       </w:pPr>
       <w:r>
-        <w:t xml:space="preserve">Put the 10-26 Lightning Deal into the engine’s deal read, re-check the 10-16 and 10-27 kill dates against it, and size the 10-26 pushes now (§7, §11).</w:t>
+        <w:t xml:space="preserve">Keep King on White: reject engine check 1’s swap, and rename the 17 KING-CREME rows to the advertised child if they go ahead.</w:t>
       </w:r>
     </w:p>
     <w:p>
@@ -12620,7 +13351,20 @@
         <w:spacing w:after="60"/>
       </w:pPr>
       <w:r>
-        <w:t xml:space="preserve">Re-read the price rows on the first seven settled post-deal days. 10-02: read records 2150 and 2863 on “bamboo cooling sheets”. 10-05: read the test steps on clicks, impression share and conversion. Grade every write on the child its sales land on.</w:t>
+        <w:t xml:space="preserve">Put the 10-26 Lightning Deal into the engine’s deal read, re-check the 10-16 and 10-27 kill dates against it, and size the 10-26 pushes now (§7, §11).</w:t>
+      </w:r>
+    </w:p>
+    <w:p>
+      <w:pPr>
+        <w:pStyle w:val="ListParagraph"/>
+        <w:numPr>
+          <w:ilvl w:val="0"/>
+          <w:numId w:val="5"/>
+        </w:numPr>
+        <w:spacing w:after="60"/>
+      </w:pPr>
+      <w:r>
+        <w:t xml:space="preserve">Re-read the price rows on the first seven settled post-deal days (10-01 → 10-07). 10-02: read records 2150 and 2863 on “bamboo cooling sheets”, remembering that 29–30 September are deal days. 10-07: read the test steps on clicks, impression share and conversion. Grade every write on the child its sales land on.</w:t>
       </w:r>
     </w:p>
     <w:sectPr>

</xml_diff>

<commit_message>
Revert the second-deal changes: B4's Best Deal ends 28 September
The 26-30 September Best Deal is on another product, so the 877574b
version of the corrections document stands for B4.

Co-Authored-By: Claude Opus 5.5 <noreply@anthropic.com>
Claude-Session: https://claude.ai/code/session_01LY7A1KPDoE1cQtWdmceR2R
</commit_message>
<xml_diff>
--- a/docs/DBS4_Corrections_by_Situation_20260928.docx
+++ b/docs/DBS4_Corrections_by_Situation_20260928.docx
@@ -22,7 +22,7 @@
         <w:spacing w:after="100"/>
       </w:pPr>
       <w:r>
-        <w:t xml:space="preserve">The first Best Deal (39 ASINs, 15–28 September) ends today. A second Best Deal on 51 ASINs runs 26–30 September, and neither the engine nor its deal calendar knows about it (see “Two Best Deals, not one” below). This run (20260928-9e6e6bb5) moves the focus to Bamboo|California King and Bamboo|Cooling, pushes those two groups on top of search — three terms with a +75% “dose” step — and tapers everything else one −10% rung per run, modifiers first. Out-of-focus campaigns take no new money; what the taper releases is meant to fund the focus. The agent review endorsed the direction and passed 324 of the 343 rows (17 held, 2 corrected).</w:t>
+        <w:t xml:space="preserve">The Best Deal ends today. This run (20260928-9e6e6bb5) moves the focus to Bamboo|California King and Bamboo|Cooling, pushes those two groups on top of search — three terms with a +75% “dose” step — and tapers everything else one −10% rung per run, modifiers first. Out-of-focus campaigns take no new money; what the taper releases is meant to fund the focus. The agent review endorsed the direction and passed 324 of the 343 rows (17 held, 2 corrected).</w:t>
       </w:r>
     </w:p>
     <w:p>
@@ -38,7 +38,7 @@
         <w:spacing w:after="100"/>
       </w:pPr>
       <w:r>
-        <w:t xml:space="preserve">Every exact-campaign price correction here is checked against “Bids and placements on Exact campaigns” (cited as “the logic”, with its section number). Where the logic and the 21 September deal rules differ, the 21 September deal rules still apply while the second deal runs (29–30 September), and the logic governs from 1 October. Part E lists the places where the logic document contradicts itself.</w:t>
+        <w:t xml:space="preserve">Every exact-campaign price correction here is checked against “Bids and placements on Exact campaigns” (cited as “the logic”, with its section number). Where the logic and the 21 September deal rules differ, the logic governs now that the deal is over. Part E lists the places where the logic document contradicts itself.</w:t>
       </w:r>
     </w:p>
     <w:p>
@@ -54,7 +54,7 @@
         <w:t xml:space="preserve">In short. </w:t>
       </w:r>
       <w:r>
-        <w:t xml:space="preserve">The direction holds for Bamboo|Cooling and is weak for California King. About 110 rows should not load as written (105 to pull, 9 to correct), most of them the same engine faults the 21 September document named: rows the engine itself marks HOLD, no-op and duplicate rows, and predictions no budget can buy. Checked against the logic, the three dose pushes are capped by the market bound, so 369 comes down rather than up, and two pushed terms with no rank on file drop to the ceiling. Every 14-day read in this run falls inside a deal window, which the logic treats as void. The deal doesn’t end today for every ASIN: a second Best Deal runs to 30 September on 51 ASINs, so no in-focus price comes down before 1 October. Two decisions need the owner before anything loads. The first is the flagship “Bamboo Sheets” campaign: the logic says its hold is right, but it has to be written as a funding decision. The second is the California King push on a hero with 44 units.</w:t>
+        <w:t xml:space="preserve">The direction holds for Bamboo|Cooling and is weak for California King. About 110 rows should not load as written (105 to pull, 9 to correct), most of them the same engine faults the 21 September document named: rows the engine itself marks HOLD, no-op and duplicate rows, and predictions no budget can buy. Checked against the logic, the three dose pushes are capped by the market bound, so 369 comes down rather than up, and two pushed terms with no rank on file drop to the ceiling. Every 14-day read in this run falls inside a deal window, which the logic treats as void. Two decisions need the owner before anything loads. The first is the flagship “Bamboo Sheets” campaign: the logic says its hold is right, but it has to be written as a funding decision. The second is the California King push on a hero with 44 units.</w:t>
       </w:r>
     </w:p>
     <w:p>
@@ -869,7 +869,7 @@
                 <w:sz w:val="17"/>
                 <w:szCs w:val="17"/>
               </w:rPr>
-              <w:t xml:space="preserve">Deal, second week (09-22 → 09-27; second deal from 09-26)</w:t>
+              <w:t xml:space="preserve">Deal, second week (09-22 → 09-27)</w:t>
             </w:r>
           </w:p>
         </w:tc>
@@ -1902,662 +1902,39 @@
         <w:pStyle w:val="Heading2"/>
       </w:pPr>
       <w:r>
-        <w:t xml:space="preserve">Two Best Deals, not one</w:t>
-      </w:r>
-    </w:p>
-    <w:tbl>
-      <w:tblPr>
-        <w:tblW w:type="dxa" w:w="9972"/>
-        <w:tblBorders>
-          <w:top w:val="single" w:color="auto" w:sz="4"/>
-          <w:left w:val="single" w:color="auto" w:sz="4"/>
-          <w:bottom w:val="single" w:color="auto" w:sz="4"/>
-          <w:right w:val="single" w:color="auto" w:sz="4"/>
-          <w:insideH w:val="single" w:color="auto" w:sz="4"/>
-          <w:insideV w:val="single" w:color="auto" w:sz="4"/>
-        </w:tblBorders>
-      </w:tblPr>
-      <w:tblGrid>
-        <w:gridCol w:w="2600"/>
-        <w:gridCol w:w="1300"/>
-        <w:gridCol w:w="700"/>
-        <w:gridCol w:w="1200"/>
-        <w:gridCol w:w="800"/>
-        <w:gridCol w:w="1100"/>
-        <w:gridCol w:w="1000"/>
-        <w:gridCol w:w="1272"/>
-      </w:tblGrid>
-      <w:tr>
-        <w:trPr>
-          <w:tblHeader/>
-        </w:trPr>
-        <w:tc>
-          <w:tcPr>
-            <w:tcW w:type="dxa" w:w="2600"/>
-            <w:shd w:fill="1F3A5F" w:color="auto" w:val="clear"/>
-            <w:tcMar>
-              <w:top w:type="dxa" w:w="40"/>
-              <w:left w:type="dxa" w:w="70"/>
-              <w:bottom w:type="dxa" w:w="40"/>
-              <w:right w:type="dxa" w:w="70"/>
-            </w:tcMar>
-          </w:tcPr>
-          <w:p>
-            <w:pPr>
-              <w:spacing w:after="0"/>
-            </w:pPr>
-            <w:r>
-              <w:rPr>
-                <w:b/>
-                <w:bCs/>
-                <w:color w:val="FFFFFF"/>
-                <w:sz w:val="17"/>
-                <w:szCs w:val="17"/>
-              </w:rPr>
-              <w:t xml:space="preserve">Promotion (Seller Central)</w:t>
-            </w:r>
-          </w:p>
-        </w:tc>
-        <w:tc>
-          <w:tcPr>
-            <w:tcW w:type="dxa" w:w="1300"/>
-            <w:shd w:fill="1F3A5F" w:color="auto" w:val="clear"/>
-            <w:tcMar>
-              <w:top w:type="dxa" w:w="40"/>
-              <w:left w:type="dxa" w:w="70"/>
-              <w:bottom w:type="dxa" w:w="40"/>
-              <w:right w:type="dxa" w:w="70"/>
-            </w:tcMar>
-          </w:tcPr>
-          <w:p>
-            <w:pPr>
-              <w:spacing w:after="0"/>
-            </w:pPr>
-            <w:r>
-              <w:rPr>
-                <w:b/>
-                <w:bCs/>
-                <w:color w:val="FFFFFF"/>
-                <w:sz w:val="17"/>
-                <w:szCs w:val="17"/>
-              </w:rPr>
-              <w:t xml:space="preserve">Schedule</w:t>
-            </w:r>
-          </w:p>
-        </w:tc>
-        <w:tc>
-          <w:tcPr>
-            <w:tcW w:type="dxa" w:w="700"/>
-            <w:shd w:fill="1F3A5F" w:color="auto" w:val="clear"/>
-            <w:tcMar>
-              <w:top w:type="dxa" w:w="40"/>
-              <w:left w:type="dxa" w:w="70"/>
-              <w:bottom w:type="dxa" w:w="40"/>
-              <w:right w:type="dxa" w:w="70"/>
-            </w:tcMar>
-          </w:tcPr>
-          <w:p>
-            <w:pPr>
-              <w:spacing w:after="0"/>
-            </w:pPr>
-            <w:r>
-              <w:rPr>
-                <w:b/>
-                <w:bCs/>
-                <w:color w:val="FFFFFF"/>
-                <w:sz w:val="17"/>
-                <w:szCs w:val="17"/>
-              </w:rPr>
-              <w:t xml:space="preserve">ASINs</w:t>
-            </w:r>
-          </w:p>
-        </w:tc>
-        <w:tc>
-          <w:tcPr>
-            <w:tcW w:type="dxa" w:w="1200"/>
-            <w:shd w:fill="1F3A5F" w:color="auto" w:val="clear"/>
-            <w:tcMar>
-              <w:top w:type="dxa" w:w="40"/>
-              <w:left w:type="dxa" w:w="70"/>
-              <w:bottom w:type="dxa" w:w="40"/>
-              <w:right w:type="dxa" w:w="70"/>
-            </w:tcMar>
-          </w:tcPr>
-          <w:p>
-            <w:pPr>
-              <w:spacing w:after="0"/>
-            </w:pPr>
-            <w:r>
-              <w:rPr>
-                <w:b/>
-                <w:bCs/>
-                <w:color w:val="FFFFFF"/>
-                <w:sz w:val="17"/>
-                <w:szCs w:val="17"/>
-              </w:rPr>
-              <w:t xml:space="preserve">Sales</w:t>
-            </w:r>
-          </w:p>
-        </w:tc>
-        <w:tc>
-          <w:tcPr>
-            <w:tcW w:type="dxa" w:w="800"/>
-            <w:shd w:fill="1F3A5F" w:color="auto" w:val="clear"/>
-            <w:tcMar>
-              <w:top w:type="dxa" w:w="40"/>
-              <w:left w:type="dxa" w:w="70"/>
-              <w:bottom w:type="dxa" w:w="40"/>
-              <w:right w:type="dxa" w:w="70"/>
-            </w:tcMar>
-          </w:tcPr>
-          <w:p>
-            <w:pPr>
-              <w:spacing w:after="0"/>
-            </w:pPr>
-            <w:r>
-              <w:rPr>
-                <w:b/>
-                <w:bCs/>
-                <w:color w:val="FFFFFF"/>
-                <w:sz w:val="17"/>
-                <w:szCs w:val="17"/>
-              </w:rPr>
-              <w:t xml:space="preserve">Units</w:t>
-            </w:r>
-          </w:p>
-        </w:tc>
-        <w:tc>
-          <w:tcPr>
-            <w:tcW w:type="dxa" w:w="1100"/>
-            <w:shd w:fill="1F3A5F" w:color="auto" w:val="clear"/>
-            <w:tcMar>
-              <w:top w:type="dxa" w:w="40"/>
-              <w:left w:type="dxa" w:w="70"/>
-              <w:bottom w:type="dxa" w:w="40"/>
-              <w:right w:type="dxa" w:w="70"/>
-            </w:tcMar>
-          </w:tcPr>
-          <w:p>
-            <w:pPr>
-              <w:spacing w:after="0"/>
-            </w:pPr>
-            <w:r>
-              <w:rPr>
-                <w:b/>
-                <w:bCs/>
-                <w:color w:val="FFFFFF"/>
-                <w:sz w:val="17"/>
-                <w:szCs w:val="17"/>
-              </w:rPr>
-              <w:t xml:space="preserve">Glance views</w:t>
-            </w:r>
-          </w:p>
-        </w:tc>
-        <w:tc>
-          <w:tcPr>
-            <w:tcW w:type="dxa" w:w="1000"/>
-            <w:shd w:fill="1F3A5F" w:color="auto" w:val="clear"/>
-            <w:tcMar>
-              <w:top w:type="dxa" w:w="40"/>
-              <w:left w:type="dxa" w:w="70"/>
-              <w:bottom w:type="dxa" w:w="40"/>
-              <w:right w:type="dxa" w:w="70"/>
-            </w:tcMar>
-          </w:tcPr>
-          <w:p>
-            <w:pPr>
-              <w:spacing w:after="0"/>
-            </w:pPr>
-            <w:r>
-              <w:rPr>
-                <w:b/>
-                <w:bCs/>
-                <w:color w:val="FFFFFF"/>
-                <w:sz w:val="17"/>
-                <w:szCs w:val="17"/>
-              </w:rPr>
-              <w:t xml:space="preserve">Conversion</w:t>
-            </w:r>
-          </w:p>
-        </w:tc>
-        <w:tc>
-          <w:tcPr>
-            <w:tcW w:type="dxa" w:w="1272"/>
-            <w:shd w:fill="1F3A5F" w:color="auto" w:val="clear"/>
-            <w:tcMar>
-              <w:top w:type="dxa" w:w="40"/>
-              <w:left w:type="dxa" w:w="70"/>
-              <w:bottom w:type="dxa" w:w="40"/>
-              <w:right w:type="dxa" w:w="70"/>
-            </w:tcMar>
-          </w:tcPr>
-          <w:p>
-            <w:pPr>
-              <w:spacing w:after="0"/>
-            </w:pPr>
-            <w:r>
-              <w:rPr>
-                <w:b/>
-                <w:bCs/>
-                <w:color w:val="FFFFFF"/>
-                <w:sz w:val="17"/>
-                <w:szCs w:val="17"/>
-              </w:rPr>
-              <w:t xml:space="preserve">Status 09-28</w:t>
-            </w:r>
-          </w:p>
-        </w:tc>
-      </w:tr>
-      <w:tr>
-        <w:tc>
-          <w:tcPr>
-            <w:tcW w:type="dxa" w:w="2600"/>
-            <w:shd w:fill="FFFFFF" w:color="auto" w:val="clear"/>
-            <w:tcMar>
-              <w:top w:type="dxa" w:w="40"/>
-              <w:left w:type="dxa" w:w="70"/>
-              <w:bottom w:type="dxa" w:w="40"/>
-              <w:right w:type="dxa" w:w="70"/>
-            </w:tcMar>
-          </w:tcPr>
-          <w:p>
-            <w:pPr>
-              <w:spacing w:after="0"/>
-            </w:pPr>
-            <w:r>
-              <w:rPr>
-                <w:sz w:val="17"/>
-                <w:szCs w:val="17"/>
-              </w:rPr>
-              <w:t xml:space="preserve">Best Deal · Deals-2026/09/04 18-32-34-622</w:t>
-            </w:r>
-          </w:p>
-        </w:tc>
-        <w:tc>
-          <w:tcPr>
-            <w:tcW w:type="dxa" w:w="1300"/>
-            <w:shd w:fill="FFFFFF" w:color="auto" w:val="clear"/>
-            <w:tcMar>
-              <w:top w:type="dxa" w:w="40"/>
-              <w:left w:type="dxa" w:w="70"/>
-              <w:bottom w:type="dxa" w:w="40"/>
-              <w:right w:type="dxa" w:w="70"/>
-            </w:tcMar>
-          </w:tcPr>
-          <w:p>
-            <w:pPr>
-              <w:spacing w:after="0"/>
-            </w:pPr>
-            <w:r>
-              <w:rPr>
-                <w:sz w:val="17"/>
-                <w:szCs w:val="17"/>
-              </w:rPr>
-              <w:t xml:space="preserve">15–28 Sep</w:t>
-            </w:r>
-          </w:p>
-        </w:tc>
-        <w:tc>
-          <w:tcPr>
-            <w:tcW w:type="dxa" w:w="700"/>
-            <w:shd w:fill="FFFFFF" w:color="auto" w:val="clear"/>
-            <w:tcMar>
-              <w:top w:type="dxa" w:w="40"/>
-              <w:left w:type="dxa" w:w="70"/>
-              <w:bottom w:type="dxa" w:w="40"/>
-              <w:right w:type="dxa" w:w="70"/>
-            </w:tcMar>
-          </w:tcPr>
-          <w:p>
-            <w:pPr>
-              <w:spacing w:after="0"/>
-            </w:pPr>
-            <w:r>
-              <w:rPr>
-                <w:sz w:val="17"/>
-                <w:szCs w:val="17"/>
-              </w:rPr>
-              <w:t xml:space="preserve">39</w:t>
-            </w:r>
-          </w:p>
-        </w:tc>
-        <w:tc>
-          <w:tcPr>
-            <w:tcW w:type="dxa" w:w="1200"/>
-            <w:shd w:fill="FFFFFF" w:color="auto" w:val="clear"/>
-            <w:tcMar>
-              <w:top w:type="dxa" w:w="40"/>
-              <w:left w:type="dxa" w:w="70"/>
-              <w:bottom w:type="dxa" w:w="40"/>
-              <w:right w:type="dxa" w:w="70"/>
-            </w:tcMar>
-          </w:tcPr>
-          <w:p>
-            <w:pPr>
-              <w:spacing w:after="0"/>
-            </w:pPr>
-            <w:r>
-              <w:rPr>
-                <w:sz w:val="17"/>
-                <w:szCs w:val="17"/>
-              </w:rPr>
-              <w:t xml:space="preserve">$53,568.03</w:t>
-            </w:r>
-          </w:p>
-        </w:tc>
-        <w:tc>
-          <w:tcPr>
-            <w:tcW w:type="dxa" w:w="800"/>
-            <w:shd w:fill="FFFFFF" w:color="auto" w:val="clear"/>
-            <w:tcMar>
-              <w:top w:type="dxa" w:w="40"/>
-              <w:left w:type="dxa" w:w="70"/>
-              <w:bottom w:type="dxa" w:w="40"/>
-              <w:right w:type="dxa" w:w="70"/>
-            </w:tcMar>
-          </w:tcPr>
-          <w:p>
-            <w:pPr>
-              <w:spacing w:after="0"/>
-            </w:pPr>
-            <w:r>
-              <w:rPr>
-                <w:sz w:val="17"/>
-                <w:szCs w:val="17"/>
-              </w:rPr>
-              <w:t xml:space="preserve">752</w:t>
-            </w:r>
-          </w:p>
-        </w:tc>
-        <w:tc>
-          <w:tcPr>
-            <w:tcW w:type="dxa" w:w="1100"/>
-            <w:shd w:fill="FFFFFF" w:color="auto" w:val="clear"/>
-            <w:tcMar>
-              <w:top w:type="dxa" w:w="40"/>
-              <w:left w:type="dxa" w:w="70"/>
-              <w:bottom w:type="dxa" w:w="40"/>
-              <w:right w:type="dxa" w:w="70"/>
-            </w:tcMar>
-          </w:tcPr>
-          <w:p>
-            <w:pPr>
-              <w:spacing w:after="0"/>
-            </w:pPr>
-            <w:r>
-              <w:rPr>
-                <w:sz w:val="17"/>
-                <w:szCs w:val="17"/>
-              </w:rPr>
-              <w:t xml:space="preserve">20,992</w:t>
-            </w:r>
-          </w:p>
-        </w:tc>
-        <w:tc>
-          <w:tcPr>
-            <w:tcW w:type="dxa" w:w="1000"/>
-            <w:shd w:fill="FFFFFF" w:color="auto" w:val="clear"/>
-            <w:tcMar>
-              <w:top w:type="dxa" w:w="40"/>
-              <w:left w:type="dxa" w:w="70"/>
-              <w:bottom w:type="dxa" w:w="40"/>
-              <w:right w:type="dxa" w:w="70"/>
-            </w:tcMar>
-          </w:tcPr>
-          <w:p>
-            <w:pPr>
-              <w:spacing w:after="0"/>
-            </w:pPr>
-            <w:r>
-              <w:rPr>
-                <w:sz w:val="17"/>
-                <w:szCs w:val="17"/>
-              </w:rPr>
-              <w:t xml:space="preserve">3.6%</w:t>
-            </w:r>
-          </w:p>
-        </w:tc>
-        <w:tc>
-          <w:tcPr>
-            <w:tcW w:type="dxa" w:w="1272"/>
-            <w:shd w:fill="FFFFFF" w:color="auto" w:val="clear"/>
-            <w:tcMar>
-              <w:top w:type="dxa" w:w="40"/>
-              <w:left w:type="dxa" w:w="70"/>
-              <w:bottom w:type="dxa" w:w="40"/>
-              <w:right w:type="dxa" w:w="70"/>
-            </w:tcMar>
-          </w:tcPr>
-          <w:p>
-            <w:pPr>
-              <w:spacing w:after="0"/>
-            </w:pPr>
-            <w:r>
-              <w:rPr>
-                <w:sz w:val="17"/>
-                <w:szCs w:val="17"/>
-              </w:rPr>
-              <w:t xml:space="preserve">Running, ends today</w:t>
-            </w:r>
-          </w:p>
-        </w:tc>
-      </w:tr>
-      <w:tr>
-        <w:tc>
-          <w:tcPr>
-            <w:tcW w:type="dxa" w:w="2600"/>
-            <w:shd w:fill="F2F5F9" w:color="auto" w:val="clear"/>
-            <w:tcMar>
-              <w:top w:type="dxa" w:w="40"/>
-              <w:left w:type="dxa" w:w="70"/>
-              <w:bottom w:type="dxa" w:w="40"/>
-              <w:right w:type="dxa" w:w="70"/>
-            </w:tcMar>
-          </w:tcPr>
-          <w:p>
-            <w:pPr>
-              <w:spacing w:after="0"/>
-            </w:pPr>
-            <w:r>
-              <w:rPr>
-                <w:sz w:val="17"/>
-                <w:szCs w:val="17"/>
-              </w:rPr>
-              <w:t xml:space="preserve">Best Deal · Deals-2026/09/04 18-34-39-334</w:t>
-            </w:r>
-          </w:p>
-        </w:tc>
-        <w:tc>
-          <w:tcPr>
-            <w:tcW w:type="dxa" w:w="1300"/>
-            <w:shd w:fill="F2F5F9" w:color="auto" w:val="clear"/>
-            <w:tcMar>
-              <w:top w:type="dxa" w:w="40"/>
-              <w:left w:type="dxa" w:w="70"/>
-              <w:bottom w:type="dxa" w:w="40"/>
-              <w:right w:type="dxa" w:w="70"/>
-            </w:tcMar>
-          </w:tcPr>
-          <w:p>
-            <w:pPr>
-              <w:spacing w:after="0"/>
-            </w:pPr>
-            <w:r>
-              <w:rPr>
-                <w:sz w:val="17"/>
-                <w:szCs w:val="17"/>
-              </w:rPr>
-              <w:t xml:space="preserve">26–30 Sep</w:t>
-            </w:r>
-          </w:p>
-        </w:tc>
-        <w:tc>
-          <w:tcPr>
-            <w:tcW w:type="dxa" w:w="700"/>
-            <w:shd w:fill="F2F5F9" w:color="auto" w:val="clear"/>
-            <w:tcMar>
-              <w:top w:type="dxa" w:w="40"/>
-              <w:left w:type="dxa" w:w="70"/>
-              <w:bottom w:type="dxa" w:w="40"/>
-              <w:right w:type="dxa" w:w="70"/>
-            </w:tcMar>
-          </w:tcPr>
-          <w:p>
-            <w:pPr>
-              <w:spacing w:after="0"/>
-            </w:pPr>
-            <w:r>
-              <w:rPr>
-                <w:sz w:val="17"/>
-                <w:szCs w:val="17"/>
-              </w:rPr>
-              <w:t xml:space="preserve">51</w:t>
-            </w:r>
-          </w:p>
-        </w:tc>
-        <w:tc>
-          <w:tcPr>
-            <w:tcW w:type="dxa" w:w="1200"/>
-            <w:shd w:fill="F2F5F9" w:color="auto" w:val="clear"/>
-            <w:tcMar>
-              <w:top w:type="dxa" w:w="40"/>
-              <w:left w:type="dxa" w:w="70"/>
-              <w:bottom w:type="dxa" w:w="40"/>
-              <w:right w:type="dxa" w:w="70"/>
-            </w:tcMar>
-          </w:tcPr>
-          <w:p>
-            <w:pPr>
-              <w:spacing w:after="0"/>
-            </w:pPr>
-            <w:r>
-              <w:rPr>
-                <w:sz w:val="17"/>
-                <w:szCs w:val="17"/>
-              </w:rPr>
-              <w:t xml:space="preserve">$6,912.18</w:t>
-            </w:r>
-          </w:p>
-        </w:tc>
-        <w:tc>
-          <w:tcPr>
-            <w:tcW w:type="dxa" w:w="800"/>
-            <w:shd w:fill="F2F5F9" w:color="auto" w:val="clear"/>
-            <w:tcMar>
-              <w:top w:type="dxa" w:w="40"/>
-              <w:left w:type="dxa" w:w="70"/>
-              <w:bottom w:type="dxa" w:w="40"/>
-              <w:right w:type="dxa" w:w="70"/>
-            </w:tcMar>
-          </w:tcPr>
-          <w:p>
-            <w:pPr>
-              <w:spacing w:after="0"/>
-            </w:pPr>
-            <w:r>
-              <w:rPr>
-                <w:sz w:val="17"/>
-                <w:szCs w:val="17"/>
-              </w:rPr>
-              <w:t xml:space="preserve">98</w:t>
-            </w:r>
-          </w:p>
-        </w:tc>
-        <w:tc>
-          <w:tcPr>
-            <w:tcW w:type="dxa" w:w="1100"/>
-            <w:shd w:fill="F2F5F9" w:color="auto" w:val="clear"/>
-            <w:tcMar>
-              <w:top w:type="dxa" w:w="40"/>
-              <w:left w:type="dxa" w:w="70"/>
-              <w:bottom w:type="dxa" w:w="40"/>
-              <w:right w:type="dxa" w:w="70"/>
-            </w:tcMar>
-          </w:tcPr>
-          <w:p>
-            <w:pPr>
-              <w:spacing w:after="0"/>
-            </w:pPr>
-            <w:r>
-              <w:rPr>
-                <w:sz w:val="17"/>
-                <w:szCs w:val="17"/>
-              </w:rPr>
-              <w:t xml:space="preserve">2,073</w:t>
-            </w:r>
-          </w:p>
-        </w:tc>
-        <w:tc>
-          <w:tcPr>
-            <w:tcW w:type="dxa" w:w="1000"/>
-            <w:shd w:fill="F2F5F9" w:color="auto" w:val="clear"/>
-            <w:tcMar>
-              <w:top w:type="dxa" w:w="40"/>
-              <w:left w:type="dxa" w:w="70"/>
-              <w:bottom w:type="dxa" w:w="40"/>
-              <w:right w:type="dxa" w:w="70"/>
-            </w:tcMar>
-          </w:tcPr>
-          <w:p>
-            <w:pPr>
-              <w:spacing w:after="0"/>
-            </w:pPr>
-            <w:r>
-              <w:rPr>
-                <w:sz w:val="17"/>
-                <w:szCs w:val="17"/>
-              </w:rPr>
-              <w:t xml:space="preserve">4.7%</w:t>
-            </w:r>
-          </w:p>
-        </w:tc>
-        <w:tc>
-          <w:tcPr>
-            <w:tcW w:type="dxa" w:w="1272"/>
-            <w:shd w:fill="F2F5F9" w:color="auto" w:val="clear"/>
-            <w:tcMar>
-              <w:top w:type="dxa" w:w="40"/>
-              <w:left w:type="dxa" w:w="70"/>
-              <w:bottom w:type="dxa" w:w="40"/>
-              <w:right w:type="dxa" w:w="70"/>
-            </w:tcMar>
-          </w:tcPr>
-          <w:p>
-            <w:pPr>
-              <w:spacing w:after="0"/>
-            </w:pPr>
-            <w:r>
-              <w:rPr>
-                <w:sz w:val="17"/>
-                <w:szCs w:val="17"/>
-              </w:rPr>
-              <w:t xml:space="preserve">Running, two days left</w:t>
-            </w:r>
-          </w:p>
-        </w:tc>
-      </w:tr>
-    </w:tbl>
-    <w:p>
-      <w:pPr>
-        <w:spacing w:after="120"/>
+        <w:t xml:space="preserve">Windows and sources</w:t>
+      </w:r>
+    </w:p>
+    <w:p>
+      <w:pPr>
+        <w:spacing w:after="100"/>
+      </w:pPr>
+      <w:r>
+        <w:t xml:space="preserve">The audit export (JSON and workbook) for run 20260928-9e6e6bb5: 343 decisions, 2,106 considered rows, the brief and review 22. Engine figures are as of the audit. Campaign 14-day spend covers 09-14 → 09-27, all of them deal days; clicks and orders are 90 days; keyword ranks are single tracker readings. From Command Center: product and syntax-group summaries for 09-15 → 09-27 against 09-02 → 09-14, the daily placement split for all keywords, and group ranks as 7-day medians of the daily crawl. Orders in the last seven days are still filling in (7-day attribution). The logic (§12) voids any read with a deal week inside its window. Every 14-day figure in this run is a deal figure, and the 90-day figures carry 13 deal days (C1b).</w:t>
+      </w:r>
+    </w:p>
+    <w:p>
+      <w:pPr>
+        <w:pStyle w:val="Heading1"/>
+      </w:pPr>
+      <w:r>
+        <w:t xml:space="preserve">Part A — In focus: Bamboo|California King and Bamboo|Cooling</w:t>
+      </w:r>
+    </w:p>
+    <w:p>
+      <w:pPr>
+        <w:spacing w:after="100"/>
       </w:pPr>
       <w:r>
         <w:rPr>
-          <w:i/>
-          <w:iCs/>
-          <w:color w:val="555555"/>
-          <w:sz w:val="17"/>
-          <w:szCs w:val="17"/>
+          <w:b/>
+          <w:bCs/>
+          <w:color w:val="1F3A5F"/>
         </w:rPr>
-        <w:t xml:space="preserve">Seller Central promotions page, read 09-28. Both deals cost $70 a day plus 1% of sales.</w:t>
-      </w:r>
-    </w:p>
-    <w:p>
-      <w:pPr>
-        <w:spacing w:after="100"/>
-      </w:pPr>
-      <w:r>
-        <w:t xml:space="preserve">The engine’s calendar carries only the first deal (“Best Deal [deal-calendar-csv:D130]”, 09-15 → 09-28). The second deal is on no calendar the engine reads. So this run, its review, and the first two versions of this document all treated 28 September as the end of the deal. It isn’t. Three things follow:</w:t>
+        <w:t xml:space="preserve">The rule (the logic, §4–§11). </w:t>
+      </w:r>
+      <w:r>
+        <w:t xml:space="preserve">Each in-focus row decides one top-of-search price, and the modifier is divided out from it.</w:t>
       </w:r>
     </w:p>
     <w:p>
@@ -2574,10 +1951,10 @@
           <w:b/>
           <w:bCs/>
         </w:rPr>
-        <w:t xml:space="preserve">Two more deal days. </w:t>
-      </w:r>
-      <w:r>
-        <w:t xml:space="preserve">For 29–30 September the 21 September deal rules still apply: the daily push inside the 3× contribution loss stop, with the market limit off. No in-focus price comes down before 1 October, so 369’s descent to its bound and the ceiling moves on 462 and 571 wait until then (A2, A4).</w:t>
+        <w:t xml:space="preserve">Target. </w:t>
+      </w:r>
+      <w:r>
+        <w:t xml:space="preserve">The ceiling (contribution × top-of-search conversion) lifted by the binding gap. A gap up to 1.5× lifts it 0.25; beyond that, the lift is (ratio − 1) × 0.5.</w:t>
       </w:r>
     </w:p>
     <w:p>
@@ -2594,10 +1971,10 @@
           <w:b/>
           <w:bCs/>
         </w:rPr>
-        <w:t xml:space="preserve">The clean read starts later. </w:t>
-      </w:r>
-      <w:r>
-        <w:t xml:space="preserve">Post-deal starts 1 October, so the first clean seven days are 10-01 → 10-07, with attribution complete by 10-14 (C1b).</w:t>
+        <w:t xml:space="preserve">Bound. </w:t>
+      </w:r>
+      <w:r>
+        <w:t xml:space="preserve">The target is held to the market bound: what the position clears at, plus 15%.</w:t>
       </w:r>
     </w:p>
     <w:p>
@@ -2614,58 +1991,10 @@
           <w:b/>
           <w:bCs/>
         </w:rPr>
-        <w:t xml:space="preserve">The 09-27 jump is the second deal. </w:t>
-      </w:r>
-      <w:r>
-        <w:t xml:space="preserve">The 516 clicks that day, 199 of them on product pages, fall on the second deal’s first full day. They are not a result of anything the run changed.</w:t>
-      </w:r>
-    </w:p>
-    <w:p>
-      <w:pPr>
-        <w:spacing w:after="100"/>
-      </w:pPr>
-      <w:r>
-        <w:t xml:space="preserve">Which children the 51 ASINs cover matters. If they include the serving children this run re-points to (California King Burgundy-New, Queen Olive, King Creme), the in-focus steps sell at deal prices for their first two days. Their first reads are then deal reads.</w:t>
-      </w:r>
-    </w:p>
-    <w:p>
-      <w:pPr>
-        <w:pStyle w:val="Heading2"/>
-      </w:pPr>
-      <w:r>
-        <w:t xml:space="preserve">Windows and sources</w:t>
-      </w:r>
-    </w:p>
-    <w:p>
-      <w:pPr>
-        <w:spacing w:after="100"/>
-      </w:pPr>
-      <w:r>
-        <w:t xml:space="preserve">The audit export (JSON and workbook) for run 20260928-9e6e6bb5: 343 decisions, 2,106 considered rows, the brief and review 22. Engine figures are as of the audit. Campaign 14-day spend covers 09-14 → 09-27, all of them deal days; clicks and orders are 90 days; keyword ranks are single tracker readings. From Command Center: product and syntax-group summaries for 09-15 → 09-27 against 09-02 → 09-14, the daily placement split for all keywords, and group ranks as 7-day medians of the daily crawl. Orders in the last seven days are still filling in (7-day attribution). The logic (§12) voids any read with a deal week inside its window. Every 14-day figure in this run is a deal figure, and the 90-day figures carry 13 deal days (C1b).</w:t>
-      </w:r>
-    </w:p>
-    <w:p>
-      <w:pPr>
-        <w:pStyle w:val="Heading1"/>
-      </w:pPr>
-      <w:r>
-        <w:t xml:space="preserve">Part A — In focus: Bamboo|California King and Bamboo|Cooling</w:t>
-      </w:r>
-    </w:p>
-    <w:p>
-      <w:pPr>
-        <w:spacing w:after="100"/>
-      </w:pPr>
-      <w:r>
-        <w:rPr>
-          <w:b/>
-          <w:bCs/>
-          <w:color w:val="1F3A5F"/>
-        </w:rPr>
-        <w:t xml:space="preserve">The rule (the logic, §4–§11). </w:t>
-      </w:r>
-      <w:r>
-        <w:t xml:space="preserve">Each in-focus row decides one top-of-search price, and the modifier is divided out from it.</w:t>
+        <w:t xml:space="preserve">Step. </w:t>
+      </w:r>
+      <w:r>
+        <w:t xml:space="preserve">Each write climbs at most 20–30% of the current price toward the target.</w:t>
       </w:r>
     </w:p>
     <w:p>
@@ -2682,10 +2011,10 @@
           <w:b/>
           <w:bCs/>
         </w:rPr>
-        <w:t xml:space="preserve">Target. </w:t>
-      </w:r>
-      <w:r>
-        <w:t xml:space="preserve">The ceiling (contribution × top-of-search conversion) lifted by the binding gap. A gap up to 1.5× lifts it 0.25; beyond that, the lift is (ratio − 1) × 0.5.</w:t>
+        <w:t xml:space="preserve">Budget. </w:t>
+      </w:r>
+      <w:r>
+        <w:t xml:space="preserve">Required clicks × this write’s price (§7).</w:t>
       </w:r>
     </w:p>
     <w:p>
@@ -2702,10 +2031,10 @@
           <w:b/>
           <w:bCs/>
         </w:rPr>
-        <w:t xml:space="preserve">Bound. </w:t>
-      </w:r>
-      <w:r>
-        <w:t xml:space="preserve">The target is held to the market bound: what the position clears at, plus 15%.</w:t>
+        <w:t xml:space="preserve">What a push must carry. </w:t>
+      </w:r>
+      <w:r>
+        <w:t xml:space="preserve">A rank prediction (§11); without one it is priced at the ceiling. A term with no rank on file is ceiling only (§6). The delivery gap lifts the price only when the budget is intact and impression share is low (§6).</w:t>
       </w:r>
     </w:p>
     <w:p>
@@ -2722,66 +2051,6 @@
           <w:b/>
           <w:bCs/>
         </w:rPr>
-        <w:t xml:space="preserve">Step. </w:t>
-      </w:r>
-      <w:r>
-        <w:t xml:space="preserve">Each write climbs at most 20–30% of the current price toward the target.</w:t>
-      </w:r>
-    </w:p>
-    <w:p>
-      <w:pPr>
-        <w:pStyle w:val="ListParagraph"/>
-        <w:numPr>
-          <w:ilvl w:val="0"/>
-          <w:numId w:val="2"/>
-        </w:numPr>
-        <w:spacing w:after="60"/>
-      </w:pPr>
-      <w:r>
-        <w:rPr>
-          <w:b/>
-          <w:bCs/>
-        </w:rPr>
-        <w:t xml:space="preserve">Budget. </w:t>
-      </w:r>
-      <w:r>
-        <w:t xml:space="preserve">Required clicks × this write’s price (§7).</w:t>
-      </w:r>
-    </w:p>
-    <w:p>
-      <w:pPr>
-        <w:pStyle w:val="ListParagraph"/>
-        <w:numPr>
-          <w:ilvl w:val="0"/>
-          <w:numId w:val="2"/>
-        </w:numPr>
-        <w:spacing w:after="60"/>
-      </w:pPr>
-      <w:r>
-        <w:rPr>
-          <w:b/>
-          <w:bCs/>
-        </w:rPr>
-        <w:t xml:space="preserve">What a push must carry. </w:t>
-      </w:r>
-      <w:r>
-        <w:t xml:space="preserve">A rank prediction (§11); without one it is priced at the ceiling. A term with no rank on file is ceiling only (§6). The delivery gap lifts the price only when the budget is intact and impression share is low (§6).</w:t>
-      </w:r>
-    </w:p>
-    <w:p>
-      <w:pPr>
-        <w:pStyle w:val="ListParagraph"/>
-        <w:numPr>
-          <w:ilvl w:val="0"/>
-          <w:numId w:val="2"/>
-        </w:numPr>
-        <w:spacing w:after="60"/>
-      </w:pPr>
-      <w:r>
-        <w:rPr>
-          <w:b/>
-          <w:bCs/>
-        </w:rPr>
         <w:t xml:space="preserve">Rows not delivering. </w:t>
       </w:r>
       <w:r>
@@ -2793,7 +2062,7 @@
         <w:spacing w:after="100"/>
       </w:pPr>
       <w:r>
-        <w:t xml:space="preserve">The 21 September loss stop (3× contribution per order) is a deal rule. It still applies on 29–30 September while the second deal runs, and it lapses on 1 October. From then the push sells at list price, and the logic (§6) asks for sales velocity in the window before a wide gap is funded. The next velocity window after 30 September is the 10-26 Lightning Deal.</w:t>
+        <w:t xml:space="preserve">The 21 September loss stop (3× contribution per order) was a deal rule and lapsed with the deal. The deal is over, so the push now sells at list price, and the logic (§6) asks for sales velocity in the window before a wide gap is funded. The next velocity window is the 10-26 Lightning Deal.</w:t>
       </w:r>
     </w:p>
     <w:p>
@@ -5611,7 +4880,7 @@
         <w:t xml:space="preserve">Correction. </w:t>
       </w:r>
       <w:r>
-        <w:t xml:space="preserve">Write 288 at 340% ($5.98), 369 down to 150% ($5.74) and 398 at 187% ($5.74), each with its bound, its loss per order and a rank prediction. Two of the four §6 conditions are not yet shown on these terms. Conversion is unread (0 orders on 7–9 clicks), and there is no sales-velocity window until the 10-26 Lightning Deal. So these steps are tests that earn the conversion read, not a funded climb. 288 and 398 fit both the deal rules and the logic, so they can load now. 369’s descent waits until 10-01, because the deal rules keep the market limit off until then. Read the steps at 10-07 on the first clean week, and size the funded push for the 10-26 window with §7’s budget.</w:t>
+        <w:t xml:space="preserve">Write 288 at 340% ($5.98), 369 down to 150% ($5.74) and 398 at 187% ($5.74), each with its bound, its loss per order and a rank prediction. Two of the four §6 conditions are not yet shown on these terms. Conversion is unread (0 orders on 7–9 clicks), and there is no sales-velocity window until the 10-26 Lightning Deal. So these steps are tests that earn the conversion read, not a funded climb. Read them at 10-05, and size the funded push for the 10-26 window with §7’s budget.</w:t>
       </w:r>
     </w:p>
     <w:p>
@@ -5832,7 +5101,7 @@
         <w:t xml:space="preserve">Two pushed terms have no rank on file. </w:t>
       </w:r>
       <w:r>
-        <w:t xml:space="preserve">“bamboo cal king sheets” (462) is unranked, and “california king sheets bamboo” (571) has only a 26 June reading. The engine gates both to “change → HOLD” and still writes +25%. The logic (§6, fourth row of its table) says a term with no rank on file is “enabled at the ceiling with no premium” and becomes a push candidate once a rank read exists. Both sit above their ceilings today ($4.82 against $3.51, and $4.75 against $3.77) with almost no delivery. §10 allows “any size, straight to the derived price” for a row with no delivery. Correction, from 1 October once the second deal ends: 462 → $3.51 (modifier 255% on $0.99); 571 → $3.77 (modifier 98% on $1.90). Until then, pull the +25% raises.</w:t>
+        <w:t xml:space="preserve">“bamboo cal king sheets” (462) is unranked, and “california king sheets bamboo” (571) has only a 26 June reading. The engine gates both to “change → HOLD” and still writes +25%. The logic (§6, fourth row of its table) says a term with no rank on file is “enabled at the ceiling with no premium” and becomes a push candidate once a rank read exists. Both sit above their ceilings today ($4.82 against $3.51, and $4.75 against $3.77) with almost no delivery. §10 allows “any size, straight to the derived price” for a row with no delivery. Correction: 462 → $3.51 (modifier 255% on $0.99); 571 → $3.77 (modifier 98% on $1.90).</w:t>
       </w:r>
     </w:p>
     <w:p>
@@ -7385,7 +6654,7 @@
         <w:spacing w:after="100"/>
       </w:pPr>
       <w:r>
-        <w:t xml:space="preserve">The 15/16 September round is the only price move that shows in the account. The effective top-of-search bid went from about $4.40 to $5.50, and top-of-search clicks from 94 to about 150 a day. Nothing moved after that. The second week had the same bid ($5.40) and slightly fewer top-of-search clicks, and product pages grew to match top of search. The jump on 09-27 is the second deal (26–30 September) starting, not a price move.</w:t>
+        <w:t xml:space="preserve">The 15/16 September round is the only price move that shows in the account. The effective top-of-search bid went from about $4.40 to $5.50, and top-of-search clicks from 94 to about 150 a day. Nothing moved after that. The second week had the same bid ($5.40) and slightly fewer top-of-search clicks, and product pages grew to match top of search.</w:t>
       </w:r>
     </w:p>
     <w:p>
@@ -9602,7 +8871,7 @@
           <w:sz w:val="17"/>
           <w:szCs w:val="17"/>
         </w:rPr>
-        <w:t xml:space="preserve">B4, all campaigns, 01–27 September: estimated top-of-search and product-page clicks a day, the spend-weighted effective top-of-search bid, and group rank (daily median). Dashed lines: the 10 September round, the 15/16 September round, and 24 September, when the corrected daily push was due. Shaded: the first Best Deal (15–28 September). The second Best Deal (26–30 September, 51 ASINs) overlaps its last three days.</w:t>
+        <w:t xml:space="preserve">B4, all campaigns, 01–27 September: estimated top-of-search and product-page clicks a day, the spend-weighted effective top-of-search bid, and group rank (daily median). Dashed lines: the 10 September round, the 15/16 September round, and 24 September, when the corrected daily push was due. Shaded: the Best Deal.</w:t>
       </w:r>
     </w:p>
     <w:p>
@@ -9682,7 +8951,7 @@
         <w:t xml:space="preserve">Correction. </w:t>
       </w:r>
       <w:r>
-        <w:t xml:space="preserve">Treat every row sized on a 14-day read as provisional. Load the stock and hygiene rows now: re-points to serving children, pauses, walls, and renames that match the child. Re-read the price rows on the first seven post-deal days as they settle (10-01 → 10-07, attribution complete by 10-14). 29 and 30 September are deal days too. The capped steps in A2 go ahead because they are tests of a condition, not reads of one.</w:t>
+        <w:t xml:space="preserve">Treat every row sized on a 14-day read as provisional. Load the stock and hygiene rows now: re-points to serving children, pauses, walls, and renames that match the child. Re-read the price rows on the first seven post-deal days as they settle (09-29 → 10-05, attribution complete by 10-12). The capped steps in A2 go ahead because they are tests of a condition, not reads of one.</w:t>
       </w:r>
     </w:p>
     <w:p>
@@ -10361,7 +9630,7 @@
         <w:t xml:space="preserve">See the deal. </w:t>
       </w:r>
       <w:r>
-        <w:t xml:space="preserve">engine_read is still null. The engine’s calendar misses the second Best Deal (51 ASINs, 26–30 September) entirely, and the Summary says “No deal in the window” even though the Lightning Deal on 10-26 sits inside the brief’s own 09-28 → 10-28 window. It lands one day before the Queen and Full kill dates (10-27). Deal-window reads are void under §12, and the engine should say so on every row that uses one.</w:t>
+        <w:t xml:space="preserve">engine_read is still null, and the Summary says “No deal in the window” even though the Lightning Deal on 10-26 sits inside the brief’s own 09-28 → 10-28 window. It lands one day before the Queen and Full kill dates (10-27). Deal-window reads are void under §12, and the engine should say so on every row that uses one.</w:t>
       </w:r>
     </w:p>
     <w:p>
@@ -10841,7 +10110,7 @@
         <w:t xml:space="preserve">Under the logic, nothing is a funded push until 10-26. </w:t>
       </w:r>
       <w:r>
-        <w:t xml:space="preserve">A wide gap is funded only when sales velocity is available in the window (§6). The second deal gives two more days on its 51 ASINs, too short to fund a climb from today’s reads. After 30 September the next window is the 10-26 Lightning Deal. Until then the focus terms take capped test steps that earn the conversion read (A2), and everything else stays at maintenance: the ceiling, no premium, the 70/20 mix.</w:t>
+        <w:t xml:space="preserve">A wide gap is funded only when sales velocity is available in the window (§6), and the next window is the 10-26 Lightning Deal. Until then the focus terms take capped test steps that earn the conversion read (A2), and everything else stays at maintenance: the ceiling, no premium, the 70/20 mix.</w:t>
       </w:r>
     </w:p>
     <w:p>
@@ -12401,7 +11670,7 @@
                 <w:sz w:val="17"/>
                 <w:szCs w:val="17"/>
               </w:rPr>
-              <w:t xml:space="preserve">Second deal to 09-30, then none until 10-26</w:t>
+              <w:t xml:space="preserve">No deal until 10-26</w:t>
             </w:r>
           </w:p>
         </w:tc>
@@ -12547,7 +11816,7 @@
                 <w:sz w:val="17"/>
                 <w:szCs w:val="17"/>
               </w:rPr>
-              <w:t xml:space="preserve">Second deal to 09-30, then none until 10-26</w:t>
+              <w:t xml:space="preserve">No deal until 10-26</w:t>
             </w:r>
           </w:p>
         </w:tc>
@@ -12693,7 +11962,7 @@
                 <w:sz w:val="17"/>
                 <w:szCs w:val="17"/>
               </w:rPr>
-              <w:t xml:space="preserve">Second deal to 09-30, then none until 10-26</w:t>
+              <w:t xml:space="preserve">No deal until 10-26</w:t>
             </w:r>
           </w:p>
         </w:tc>
@@ -12839,7 +12108,7 @@
                 <w:sz w:val="17"/>
                 <w:szCs w:val="17"/>
               </w:rPr>
-              <w:t xml:space="preserve">Second deal to 09-30, then none until 10-26</w:t>
+              <w:t xml:space="preserve">No deal until 10-26</w:t>
             </w:r>
           </w:p>
         </w:tc>
@@ -13260,7 +12529,7 @@
         <w:spacing w:after="60"/>
       </w:pPr>
       <w:r>
-        <w:t xml:space="preserve">Confirm which children the second Best Deal’s 51 ASINs cover. Until 30 September its deal rules apply, and no in-focus price comes down.</w:t>
+        <w:t xml:space="preserve">Pull the 105 rows in C7.</w:t>
       </w:r>
     </w:p>
     <w:p>
@@ -13273,7 +12542,7 @@
         <w:spacing w:after="60"/>
       </w:pPr>
       <w:r>
-        <w:t xml:space="preserve">Pull the 105 rows in C7.</w:t>
+        <w:t xml:space="preserve">Write the capped test steps, each with its bound, loss per order and a rank prediction: 288 → 340% ($5.98), 398 → 187% ($5.74), and 369 down to 150% ($5.74). Load budgets 287 ($13.98) and 397 ($14.21, with the $18.59-a-day shortfall stated). Bring 462 to 255% and 571 to 98% (the ceiling).</w:t>
       </w:r>
     </w:p>
     <w:p>
@@ -13286,7 +12555,7 @@
         <w:spacing w:after="60"/>
       </w:pPr>
       <w:r>
-        <w:t xml:space="preserve">Write the capped test steps now, each with its bound, loss per order and a rank prediction: 288 → 340% ($5.98) and 398 → 187% ($5.74). Load budgets 287 ($13.98) and 397 ($14.21, with the $18.59-a-day shortfall stated). On 1 October, once the second deal ends, bring 369 down to 150% ($5.74), 462 to 255% and 571 to 98% (the ceiling).</w:t>
+        <w:t xml:space="preserve">Same day: run the §10 suppression check on every in-focus down-only push, starting with 687, 293 and 1002. Where it is clear, load the modifier-only steps on 687 and 1002; where it is suppressed, switch to fixed bids at today’s price, stated as a trade. Hold 293’s base, and re-point 1002 and 31 to a serving child.</w:t>
       </w:r>
     </w:p>
     <w:p>
@@ -13299,7 +12568,7 @@
         <w:spacing w:after="60"/>
       </w:pPr>
       <w:r>
-        <w:t xml:space="preserve">Same day: run the §10 suppression check on every in-focus down-only push, starting with 687, 293 and 1002. Where it is clear, load the modifier-only steps on 687 and 1002; where it is suppressed, switch to fixed bids at today’s price, stated as a trade. Hold 293’s base, and re-point 1002 and 31 to a serving child.</w:t>
+        <w:t xml:space="preserve">California King: confirm which child the tracker reads before the 15 re-points load, re-derive the bases from Burgundy-New, and name the cause of the fall from 4 to 16 on “bamboo sheets california king”.</w:t>
       </w:r>
     </w:p>
     <w:p>
@@ -13312,7 +12581,7 @@
         <w:spacing w:after="60"/>
       </w:pPr>
       <w:r>
-        <w:t xml:space="preserve">California King: confirm which child the tracker reads before the 15 re-points load, re-derive the bases from Burgundy-New, and name the cause of the fall from 4 to 16 on “bamboo sheets california king”.</w:t>
+        <w:t xml:space="preserve">Name the causes on the nine in-focus rank falls and the seven frozen collapses. Load the Twin swap (2155) first; hold 2209 until its cause is named.</w:t>
       </w:r>
     </w:p>
     <w:p>
@@ -13325,7 +12594,7 @@
         <w:spacing w:after="60"/>
       </w:pPr>
       <w:r>
-        <w:t xml:space="preserve">Name the causes on the nine in-focus rank falls and the seven frozen collapses. Load the Twin swap (2155) first; hold 2209 until its cause is named.</w:t>
+        <w:t xml:space="preserve">Keep King on White: reject engine check 1’s swap, and rename the 17 KING-CREME rows to the advertised child if they go ahead.</w:t>
       </w:r>
     </w:p>
     <w:p>
@@ -13338,7 +12607,7 @@
         <w:spacing w:after="60"/>
       </w:pPr>
       <w:r>
-        <w:t xml:space="preserve">Keep King on White: reject engine check 1’s swap, and rename the 17 KING-CREME rows to the advertised child if they go ahead.</w:t>
+        <w:t xml:space="preserve">Put the 10-26 Lightning Deal into the engine’s deal read, re-check the 10-16 and 10-27 kill dates against it, and size the 10-26 pushes now (§7, §11).</w:t>
       </w:r>
     </w:p>
     <w:p>
@@ -13351,20 +12620,7 @@
         <w:spacing w:after="60"/>
       </w:pPr>
       <w:r>
-        <w:t xml:space="preserve">Put the 10-26 Lightning Deal into the engine’s deal read, re-check the 10-16 and 10-27 kill dates against it, and size the 10-26 pushes now (§7, §11).</w:t>
-      </w:r>
-    </w:p>
-    <w:p>
-      <w:pPr>
-        <w:pStyle w:val="ListParagraph"/>
-        <w:numPr>
-          <w:ilvl w:val="0"/>
-          <w:numId w:val="5"/>
-        </w:numPr>
-        <w:spacing w:after="60"/>
-      </w:pPr>
-      <w:r>
-        <w:t xml:space="preserve">Re-read the price rows on the first seven settled post-deal days (10-01 → 10-07). 10-02: read records 2150 and 2863 on “bamboo cooling sheets”, remembering that 29–30 September are deal days. 10-07: read the test steps on clicks, impression share and conversion. Grade every write on the child its sales land on.</w:t>
+        <w:t xml:space="preserve">Re-read the price rows on the first seven settled post-deal days. 10-02: read records 2150 and 2863 on “bamboo cooling sheets”. 10-05: read the test steps on clicks, impression share and conversion. Grade every write on the child its sales land on.</w:t>
       </w:r>
     </w:p>
     <w:sectPr>

</xml_diff>

<commit_message>
Keep the 28 September corrections to this run only
Removes every reference to earlier runs, reviews and correction
documents. Figures that came from them are re-sourced from this run's
export or Command Center: flagship deal delivery and top-of-search
conversion, and the Bamboo and Bamboo|King click-through and conversion
reads. The chart drops the change-round markers.

Co-Authored-By: Claude Opus 5.5 <noreply@anthropic.com>
Claude-Session: https://claude.ai/code/session_01LY7A1KPDoE1cQtWdmceR2R
</commit_message>
<xml_diff>
--- a/docs/DBS4_Corrections_by_Situation_20260928.docx
+++ b/docs/DBS4_Corrections_by_Situation_20260928.docx
@@ -30,7 +30,7 @@
         <w:spacing w:after="100"/>
       </w:pPr>
       <w:r>
-        <w:t xml:space="preserve">This document goes over the run the way the 21 September corrections did: each section gives the rule, what the run did, two or three campaigns where the run’s action is the problem, and the correction. Group ranks are Command Center’s 7-day medians; keyword ranks are the tracker readings the engine used (09-28 against 08-29) and are marked as such. Part C checks what the deal and the last corrections actually did. Part D answers the question the run leaves open: after the deal, is this the right focus, and what happens to the head term the run takes out of it?</w:t>
+        <w:t xml:space="preserve">Each section gives the rule, what the run did, two or three campaigns where the run’s action is the problem, and the correction. Group ranks are Command Center’s 7-day medians; keyword ranks are the tracker readings the engine used (09-28 against 08-29) and are marked as such. Part C checks what the deal actually did and what runs across the whole file. Part D answers the question the run leaves open: after the deal, is this the right focus, and what happens to the head term the run takes out of it?</w:t>
       </w:r>
     </w:p>
     <w:p>
@@ -38,7 +38,7 @@
         <w:spacing w:after="100"/>
       </w:pPr>
       <w:r>
-        <w:t xml:space="preserve">Every exact-campaign price correction here is checked against “Bids and placements on Exact campaigns” (cited as “the logic”, with its section number). Where the logic and the 21 September deal rules differ, the logic governs now that the deal is over. Part E lists the places where the logic document contradicts itself.</w:t>
+        <w:t xml:space="preserve">Every exact-campaign price correction here is checked against “Bids and placements on Exact campaigns” (cited as “the logic”, with its section number). The deal is over, so the logic governs. Part E lists the places where the logic document contradicts itself.</w:t>
       </w:r>
     </w:p>
     <w:p>
@@ -54,7 +54,7 @@
         <w:t xml:space="preserve">In short. </w:t>
       </w:r>
       <w:r>
-        <w:t xml:space="preserve">The direction holds for Bamboo|Cooling and is weak for California King. About 110 rows should not load as written (105 to pull, 9 to correct), most of them the same engine faults the 21 September document named: rows the engine itself marks HOLD, no-op and duplicate rows, and predictions no budget can buy. Checked against the logic, the three dose pushes are capped by the market bound, so 369 comes down rather than up, and two pushed terms with no rank on file drop to the ceiling. Every 14-day read in this run falls inside a deal window, which the logic treats as void. Two decisions need the owner before anything loads. The first is the flagship “Bamboo Sheets” campaign: the logic says its hold is right, but it has to be written as a funding decision. The second is the California King push on a hero with 44 units.</w:t>
+        <w:t xml:space="preserve">The direction holds for Bamboo|Cooling and is weak for California King. About 110 rows should not load as written (105 to pull, 9 to correct). Most of them are engine faults: rows the engine itself marks HOLD, no-op and duplicate rows, and predictions no budget can buy. Checked against the logic, the three dose pushes are capped by the market bound, so 369 comes down rather than up, and two pushed terms with no rank on file drop to the ceiling. Every 14-day read in this run falls inside a deal window, which the logic treats as void. Two decisions need the owner before anything loads. The first is the flagship “Bamboo Sheets” campaign: the logic says its hold is right, but it has to be written as a funding decision. The second is the California King push on a hero with 44 units.</w:t>
       </w:r>
     </w:p>
     <w:p>
@@ -1111,7 +1111,7 @@
         <w:spacing w:after="100"/>
       </w:pPr>
       <w:r>
-        <w:t xml:space="preserve">The deal raised spend 76% and ad sales 26% (13 days against the 13 before): orders went up a third, ACoS went from 31.5% to 44.1% against a 33.3% break-even, and CVR fell from 12.5% to 10.2%. Top of search went from 94 to about 150 clicks a day, but product pages grew almost as much, so top of search stayed near 40% of clicks. The only price move that shows is the 15/16 September round. In the second week the bid did not move, which means the daily push the 21 September corrections called for from 09-24 was never loaded (Part C1).</w:t>
+        <w:t xml:space="preserve">The deal raised spend 76% and ad sales 26% (13 days against the 13 before): orders went up a third, ACoS went from 31.5% to 44.1% against a 33.3% break-even, and CVR fell from 12.5% to 10.2%. Top of search went from 94 to about 150 clicks a day, but product pages grew almost as much, so top of search stayed near 40% of clicks. The effective top-of-search bid rose once, at the start of the deal, and did not move again (Part C1).</w:t>
       </w:r>
     </w:p>
     <w:p>
@@ -2062,7 +2062,7 @@
         <w:spacing w:after="100"/>
       </w:pPr>
       <w:r>
-        <w:t xml:space="preserve">The 21 September loss stop (3× contribution per order) was a deal rule and lapsed with the deal. The deal is over, so the push now sells at list price, and the logic (§6) asks for sales velocity in the window before a wide gap is funded. The next velocity window is the 10-26 Lightning Deal.</w:t>
+        <w:t xml:space="preserve">The deal is over, so the push now sells at list price, and the logic (§6) asks for sales velocity in the window before a wide gap is funded. The next velocity window is the 10-26 Lightning Deal.</w:t>
       </w:r>
     </w:p>
     <w:p>
@@ -6231,7 +6231,7 @@
         <w:t xml:space="preserve">Bamboo Cooling Sheets-(MSV)-Exact-(Ranking)-DO-BAMBOO-QUEEN-WHITE</w:t>
       </w:r>
       <w:r>
-        <w:t xml:space="preserve"> — the only campaign on “bamboo cooling sheets”, the largest focus term (8,166 searches, rank 30 from 36). 90 days: 418 clicks, 42 orders; $415 in the last 14 days on a $40 budget. The run raises the modifier 718% → 818% (31) and trims the base (34). The review held both on open record 2150 (the 09-15 raise, behind on rank with its traffic delivered) and on the previous review’s hold of the same move. We agree with the hold. It leaves the focus’s head term with no move this run, and the campaign keeps advertising BAMBOO-QUEEN-WHITE for a term that names no size. It is not among the Queen re-points.</w:t>
+        <w:t xml:space="preserve"> — the only campaign on “bamboo cooling sheets”, the largest focus term (8,166 searches, rank 30 from 36). 90 days: 418 clicks, 42 orders; $415 in the last 14 days on a $40 budget. The run raises the modifier 718% → 818% (31) and trims the base (34). The review held both on open record 2150, which is behind on rank with its traffic delivered. We agree with the hold. It leaves the focus’s head term with no move this run, and the campaign keeps advertising BAMBOO-QUEEN-WHITE for a term that names no size. It is not among the Queen re-points.</w:t>
       </w:r>
     </w:p>
     <w:p>
@@ -6310,7 +6310,7 @@
         <w:t xml:space="preserve">Bamboo Sheets-(VHSV)-Exact-(Ranking)-DO-BAMBOO-KING-WHITE</w:t>
       </w:r>
       <w:r>
-        <w:t xml:space="preserve"> — “bamboo sheets”, the product’s largest term (490 plan clicks a week, target 10). $4,463 in the last 14 days, or $319 a day and 29% of the engine’s spend baseline. 90 days on the target: 1,155 clicks, 131 orders. The run reads delivery as 79 top-of-search clicks a week, which is a 90-day average; in the deal it took about 331 a week (21 September document, D5). Top-of-search impression share is 3.3%. The Bamboo group in the deal: $937 a day, ACoS 50.3% (33.8% before), CVR 10.7% (13.1%), orders 25.9 a day (17.6), rank 35 → 33. The brief has no current rank for “bamboo sheets” (null), while the campaign’s claim uses 36.</w:t>
+        <w:t xml:space="preserve"> — “bamboo sheets”, the product’s largest term (490 plan clicks a week, target 10). $4,463 in the last 14 days, or $319 a day and 29% of the engine’s spend baseline. 90 days on the target: 1,155 clicks, 131 orders. The run reads delivery as 79 top-of-search clicks a week, which is a 90-day average; in the deal it took about 330 a week, 47 a day (Command Center). Top-of-search impression share is 3.3%. The Bamboo group in the deal: $937 a day, ACoS 50.3% (33.8% before), CVR 10.7% (13.1%), orders 25.9 a day (17.6), rank 35 → 33. The brief has no current rank for “bamboo sheets” (null), while the campaign’s claim uses 36.</w:t>
       </w:r>
     </w:p>
     <w:p>
@@ -6325,7 +6325,7 @@
         <w:t xml:space="preserve">Bamboo Sheets King Size-(HSV)-Exact-(Ranking)-DO-BAMBOO-KING-WHITE</w:t>
       </w:r>
       <w:r>
-        <w:t xml:space="preserve"> — “bamboo sheets king size”, 21,541 searches, rank 35 (24 thirty days ago: 11 positions lost). Top-of-search impression share 0.97%. The 21 September corrections pushed it +30%; that was never loaded (modifier still 210%). This run reshapes it instead: base −16% on four targets, modifier 210% → 268%, price held at $4.96. No row names why it fell.</w:t>
+        <w:t xml:space="preserve"> — “bamboo sheets king size”, 21,541 searches, rank 35 (24 thirty days ago: 11 positions lost). Top-of-search impression share 0.97%. This run reshapes it: base −16% on four targets, modifier 210% → 268%, price held at $4.96. No row names why it fell.</w:t>
       </w:r>
     </w:p>
     <w:p>
@@ -6341,7 +6341,7 @@
         <w:t xml:space="preserve">Correction. </w:t>
       </w:r>
       <w:r>
-        <w:t xml:space="preserve">The engine’s hold is what §14 requires. The campaign delivered about 68% of 490 in the deal and 16% on its 90-day read, so both the 21 September step-down to break-even and the run’s own −10% taper would cut a push that never received its clicks. I withdraw the taper rung I proposed in the first version of this document. What is missing is §11. At today’s $7.42, 490 clicks a week is 70 a day, or $519 a day, against a $340 budget that is already spending $319 (94%): a $179-a-day shortfall, and budget is the first cause §6 names. At 12.9% top-of-search conversion each order costs about $57.50 against $24.49 contribution, so funding it fully is roughly $300 a day of deliberate loss. Write it as one decision row for the owner by 09-30 (Part D): fund it at $519 a day at today’s price with no climb, or stop it on a dated loss ceiling. For “bamboo sheets king size”, name the cause of the 11-position fall before the reshape loads (§12: a collapse of more than 10 positions is never answered with spend).</w:t>
+        <w:t xml:space="preserve">The engine’s hold is what §14 requires. The campaign delivered about 67% of 490 in the deal and 16% on its 90-day read, so the run’s own −10% taper would cut a push that never received its clicks. What is missing is §11. At today’s $7.42, 490 clicks a week is 70 a day, or $519 a day, against a $340 budget that is already spending $319 (94%): a $179-a-day shortfall, and budget is the first cause §6 names. At the 10–12.5% top-of-search conversion it ran in the deal (about 11%, Command Center), each order costs about $67 against $24.49 contribution, so funding it fully is roughly $330 a day of deliberate loss. Write it as one decision row for the owner by 09-30 (Part D): fund it at $519 a day at today’s price with no climb, or stop it on a dated loss ceiling. For “bamboo sheets king size”, name the cause of the 11-position fall before the reshape loads (§12: a collapse of more than 10 positions is never answered with spend).</w:t>
       </w:r>
     </w:p>
     <w:p>
@@ -6437,7 +6437,7 @@
         <w:t xml:space="preserve">What the run did. </w:t>
       </w:r>
       <w:r>
-        <w:t xml:space="preserve">Exports 40 rows whose rank claim reads “change → HOLD” (the engine’s own gate: no gradeable rank claim) as changes, and the review passed 39 of them. It also writes 17 rows on three paused campaigns and 11 duplicate bid rows. The 21 September file had 35 such “change → HOLD” rows.</w:t>
+        <w:t xml:space="preserve">Exports 40 rows whose rank claim reads “change → HOLD” (the engine’s own gate: no gradeable rank claim) as changes, and the review passed 39 of them. It also writes 17 rows on three paused campaigns and 11 duplicate bid rows.</w:t>
       </w:r>
     </w:p>
     <w:p>
@@ -6614,7 +6614,7 @@
         <w:t xml:space="preserve">Correction. </w:t>
       </w:r>
       <w:r>
-        <w:t xml:space="preserve">Name the cause on each and load the Twin swap first. The freeze starts at 30 positions, while the 21 September rule was 10. Out of focus, “bamboo sheets king size” (24 → 35) and “cooling bed sheets” (21 → 35, 12,715 searches) are reshaped or held without a named cause.</w:t>
+        <w:t xml:space="preserve">Name the cause on each and load the Twin swap first. The freeze starts at 30 positions, while the logic’s collapse line is 10 (§12). Out of focus, “bamboo sheets king size” (24 → 35) and “cooling bed sheets” (21 → 35, 12,715 searches) are reshaped or held without a named cause.</w:t>
       </w:r>
     </w:p>
     <w:p>
@@ -6630,7 +6630,7 @@
         <w:pStyle w:val="Heading1"/>
       </w:pPr>
       <w:r>
-        <w:t xml:space="preserve">C1. What the deal and the last corrections did</w:t>
+        <w:t xml:space="preserve">C1. What the deal did</w:t>
       </w:r>
     </w:p>
     <w:p>
@@ -6646,7 +6646,7 @@
         <w:t xml:space="preserve">The rule. </w:t>
       </w:r>
       <w:r>
-        <w:t xml:space="preserve">Every write is a test. Verify what loaded (approved ≠ uploaded), then read what it did before sizing the next one.</w:t>
+        <w:t xml:space="preserve">Every write is a test. Read what it did before sizing the next one.</w:t>
       </w:r>
     </w:p>
     <w:p>
@@ -6654,62 +6654,7 @@
         <w:spacing w:after="100"/>
       </w:pPr>
       <w:r>
-        <w:t xml:space="preserve">The 15/16 September round is the only price move that shows in the account. The effective top-of-search bid went from about $4.40 to $5.50, and top-of-search clicks from 94 to about 150 a day. Nothing moved after that. The second week had the same bid ($5.40) and slightly fewer top-of-search clicks, and product pages grew to match top of search.</w:t>
-      </w:r>
-    </w:p>
-    <w:p>
-      <w:pPr>
-        <w:spacing w:after="100"/>
-      </w:pPr>
-      <w:r>
-        <w:t xml:space="preserve">None of the 21 September corrections for 09-24 is in the account:</w:t>
-      </w:r>
-    </w:p>
-    <w:p>
-      <w:pPr>
-        <w:pStyle w:val="ListParagraph"/>
-        <w:numPr>
-          <w:ilvl w:val="0"/>
-          <w:numId w:val="2"/>
-        </w:numPr>
-        <w:spacing w:after="60"/>
-      </w:pPr>
-      <w:r>
-        <w:t xml:space="preserve">the flagship’s modifier is 299% at this audit (the correction wrote 419%);</w:t>
-      </w:r>
-    </w:p>
-    <w:p>
-      <w:pPr>
-        <w:pStyle w:val="ListParagraph"/>
-        <w:numPr>
-          <w:ilvl w:val="0"/>
-          <w:numId w:val="2"/>
-        </w:numPr>
-        <w:spacing w:after="60"/>
-      </w:pPr>
-      <w:r>
-        <w:t xml:space="preserve">“Bamboo Sheets King Size” is at 210% (437%);</w:t>
-      </w:r>
-    </w:p>
-    <w:p>
-      <w:pPr>
-        <w:pStyle w:val="ListParagraph"/>
-        <w:numPr>
-          <w:ilvl w:val="0"/>
-          <w:numId w:val="2"/>
-        </w:numPr>
-        <w:spacing w:after="60"/>
-      </w:pPr>
-      <w:r>
-        <w:t xml:space="preserve">“Bamboo Sheets Queen Size” is still on dynamic up-and-down bidding (the correction: fixed bids near $12).</w:t>
-      </w:r>
-    </w:p>
-    <w:p>
-      <w:pPr>
-        <w:spacing w:after="100"/>
-      </w:pPr>
-      <w:r>
-        <w:t xml:space="preserve">The 19 September review’s correction on “Cal King Bamboo Sheets” (276% → 389%) was not loaded either: the modifier is 276% today, and this run proposes 421%. The brief’s “previous run” is the 19 September run, and the 21 September run is not on record at all.</w:t>
+        <w:t xml:space="preserve">The effective top-of-search bid rose once, at the start of the deal (about $4.40 → $5.50 on 15–16 September), and top-of-search clicks went from 94 to about 150 a day. Nothing moved after that. The second week had the same bid ($5.40) and slightly fewer top-of-search clicks, and product pages grew to match top of search. The account today carries the flagship at 299%, “Bamboo Sheets King Size” at 210% and “Cal King Bamboo Sheets” at 276%, and “Bamboo Sheets Queen Size” is on dynamic up-and-down bidding.</w:t>
       </w:r>
     </w:p>
     <w:tbl>
@@ -8871,7 +8816,7 @@
           <w:sz w:val="17"/>
           <w:szCs w:val="17"/>
         </w:rPr>
-        <w:t xml:space="preserve">B4, all campaigns, 01–27 September: estimated top-of-search and product-page clicks a day, the spend-weighted effective top-of-search bid, and group rank (daily median). Dashed lines: the 10 September round, the 15/16 September round, and 24 September, when the corrected daily push was due. Shaded: the Best Deal.</w:t>
+        <w:t xml:space="preserve">B4, all campaigns, 01–27 September: estimated top-of-search and product-page clicks a day, the spend-weighted effective top-of-search bid, and group rank (daily median). Shaded: the Best Deal.</w:t>
       </w:r>
     </w:p>
     <w:p>
@@ -8895,7 +8840,7 @@
         <w:t xml:space="preserve">Correction. </w:t>
       </w:r>
       <w:r>
-        <w:t xml:space="preserve">Before this file loads, verify execution: diff the rows approved on 19 and 21 September against the account, write down which loaded, and grade only those. The engine should record every run it is given, so that the next brief’s “previous” is the last run, not the last reviewed one.</w:t>
+        <w:t xml:space="preserve">Grade each of this run’s writes against its own campaign on clean post-deal days, before the next write on that campaign.</w:t>
       </w:r>
     </w:p>
     <w:p>
@@ -9048,7 +8993,7 @@
         <w:t xml:space="preserve">The rule. </w:t>
       </w:r>
       <w:r>
-        <w:t xml:space="preserve">These campaigns are priced inside their own ceiling (21 September document, C2). Under 15 clicks: hold, with no cut and no raise. Inside the ceiling: nothing moves, including a top-of-search modifier whose top of search pays. Over it: the base comes down.</w:t>
+        <w:t xml:space="preserve">These campaigns are priced inside their own ceiling. Under 15 clicks: hold, with no cut and no raise. Inside the ceiling: nothing moves, including a top-of-search modifier whose top of search pays. Over it: the base comes down.</w:t>
       </w:r>
     </w:p>
     <w:p>
@@ -9079,7 +9024,7 @@
         <w:t xml:space="preserve">B08KQHRDDG-(PAT)-Targeting-(Conversion)-DO-BAMBOO-KING-WHITE</w:t>
       </w:r>
       <w:r>
-        <w:t xml:space="preserve"> — ACoS 9.7% on 586 clicks and 142 orders in 90 days; $481 in the last 14 days. The run cuts the modifier 32% → 29% (2212). The 21 September corrections named this campaign: “inside its ceiling — hold; reverse the TOS modifier cut”. The cut is back. Correction: hold.</w:t>
+        <w:t xml:space="preserve"> — ACoS 9.7% on 586 clicks and 142 orders in 90 days; $481 in the last 14 days. The run cuts the modifier 32% → 29% (2212). Correction: hold.</w:t>
       </w:r>
     </w:p>
     <w:p>
@@ -9124,7 +9069,7 @@
         <w:t xml:space="preserve">B07YKCZHGK-(PAT)-Targeting-(Conversion)-DO-BAMBOO-KING-CREME</w:t>
       </w:r>
       <w:r>
-        <w:t xml:space="preserve"> — seven ASIN bids cut to $1.50, up to −25% (2120–2126), on a 90-day ACoS of 45.9%. The 21 September document read it on 14 days at 23% and held it. The sweep reads only 90 days, and it prices break-even at 34.4% where the brief says 33.3%.</w:t>
+        <w:t xml:space="preserve"> — seven ASIN bids cut to $1.50, up to −25% (2120–2126), on a 90-day ACoS of 45.9%. The sweep reads only 90 days, and it prices break-even at 34.4% where the brief says 33.3%.</w:t>
       </w:r>
     </w:p>
     <w:p>
@@ -9200,7 +9145,7 @@
         <w:t xml:space="preserve">King is not re-pointed, and shouldn’t be. </w:t>
       </w:r>
       <w:r>
-        <w:t xml:space="preserve">Engine check 1 fails on it (“26 holds on a served hero with no swap row”). But the King hero has 228 units: 24 days at today’s rate, with 606 landing 10-16, 18 days out. That covers the arrival at today’s pace. The product audit also found White the best King converter (12.95% paid CVR on 12,562 clicks). Keep King on White, and record the check failure as a check that read push pace on a size that isn’t pushed.</w:t>
+        <w:t xml:space="preserve">Engine check 1 fails on it (“26 holds on a served hero with no swap row”). But the King hero has 228 units: 24 days at today’s rate, with 606 landing 10-16, 18 days out. That covers the arrival at today’s pace. The brief’s product findings also show White as the best King converter (12.95% paid CVR on 12,562 clicks). Keep King on White, and record the check failure as a check that read push pace on a size that isn’t pushed.</w:t>
       </w:r>
     </w:p>
     <w:p>
@@ -9390,7 +9335,7 @@
         <w:spacing w:after="100"/>
       </w:pPr>
       <w:r>
-        <w:t xml:space="preserve">The review’s figure (192 a week) only removes held rows. Bid-cut savings are counted twice where rows repeat (B3). The spend baseline is 14 deal days. The product’s prediction hit rate is 13.4% (22 of 164 graded in 90 days; 62 withdrawn).</w:t>
+        <w:t xml:space="preserve">The review’s figure (192 a week) only removes held rows. Bid-cut savings are counted twice where rows repeat (B3). The spend baseline is 14 deal days.</w:t>
       </w:r>
     </w:p>
     <w:p>
@@ -9591,7 +9536,7 @@
           <w:b/>
           <w:bCs/>
         </w:rPr>
-        <w:t xml:space="preserve">The two engine checks are named this time: </w:t>
+        <w:t xml:space="preserve">The two engine checks: </w:t>
       </w:r>
       <w:r>
         <w:t xml:space="preserve">check 1 (King swap) is rejected in C3, and check 2 (R14 probes) is covered by the review’s holds.</w:t>
@@ -9610,7 +9555,7 @@
         <w:spacing w:after="100"/>
       </w:pPr>
       <w:r>
-        <w:t xml:space="preserve">Carried over from 21 September and still open:</w:t>
+        <w:t xml:space="preserve">Engine fixes:</w:t>
       </w:r>
     </w:p>
     <w:p>
@@ -9650,7 +9595,7 @@
         <w:t xml:space="preserve">Read the right window. </w:t>
       </w:r>
       <w:r>
-        <w:t xml:space="preserve">The flagship’s delivery (79 a week) is a 90-day average; in the deal it ran about 331 a week. The B07YKCZHGK cut reads only 90 days.</w:t>
+        <w:t xml:space="preserve">The flagship’s delivery (79 a week) is a 90-day average; in the deal it ran about 330 a week. The B07YKCZHGK cut reads only 90 days.</w:t>
       </w:r>
     </w:p>
     <w:p>
@@ -9710,7 +9655,7 @@
         <w:t xml:space="preserve">Carry the gate’s verdict into the export. </w:t>
       </w:r>
       <w:r>
-        <w:t xml:space="preserve">40 “change → HOLD” rows export as changes (35 last time). Drop no-op rows on paused campaigns, and de-duplicate targets that appear twice (by id and by keyword).</w:t>
+        <w:t xml:space="preserve">40 “change → HOLD” rows export as changes. Drop no-op rows on paused campaigns, and de-duplicate targets that appear twice (by id and by keyword).</w:t>
       </w:r>
     </w:p>
     <w:p>
@@ -9730,7 +9675,7 @@
         <w:t xml:space="preserve">Grade before writing, and cite the record. </w:t>
       </w:r>
       <w:r>
-        <w:t xml:space="preserve">91 of the 172 price rows sit on 49 campaigns whose tuner records read behind, stalled or wrong-direction, and none cites its record (42% last time, 53% now).</w:t>
+        <w:t xml:space="preserve">91 of the 172 price rows sit on 49 campaigns whose tuner records read behind, stalled or wrong-direction, and none cites its record (53%).</w:t>
       </w:r>
     </w:p>
     <w:p>
@@ -9843,14 +9788,6 @@
     </w:p>
     <w:p>
       <w:pPr>
-        <w:spacing w:after="100"/>
-      </w:pPr>
-      <w:r>
-        <w:t xml:space="preserve">New from this run:</w:t>
-      </w:r>
-    </w:p>
-    <w:p>
-      <w:pPr>
         <w:pStyle w:val="ListParagraph"/>
         <w:numPr>
           <w:ilvl w:val="0"/>
@@ -9863,10 +9800,10 @@
           <w:b/>
           <w:bCs/>
         </w:rPr>
-        <w:t xml:space="preserve">Verify execution. </w:t>
-      </w:r>
-      <w:r>
-        <w:t xml:space="preserve">Record what loaded from every run, and keep every run in “previous”. Nothing from 09-21 loaded, and the 19 September correction on Cal King did not load either.</w:t>
+        <w:t xml:space="preserve">Keep a row’s prose true to its column. </w:t>
+      </w:r>
+      <w:r>
+        <w:t xml:space="preserve">369 says “held to 200%” and “not pushed” while writing 425%. 687 says “no climb” while climbing. 398 quotes a 187% version, and 2147 calls +143% “a single +30% step”.</w:t>
       </w:r>
     </w:p>
     <w:p>
@@ -9883,10 +9820,10 @@
           <w:b/>
           <w:bCs/>
         </w:rPr>
-        <w:t xml:space="preserve">Keep a row’s prose true to its column. </w:t>
-      </w:r>
-      <w:r>
-        <w:t xml:space="preserve">369 says “held to 200%” and “not pushed” while writing 425%. 687 says “no climb” while climbing. 398 quotes a 187% version, and 2147 calls +143% “a single +30% step”.</w:t>
+        <w:t xml:space="preserve">Bind reshape pairs. </w:t>
+      </w:r>
+      <w:r>
+        <w:t xml:space="preserve">A modifier and its base rows load together or not at all.</w:t>
       </w:r>
     </w:p>
     <w:p>
@@ -9903,10 +9840,10 @@
           <w:b/>
           <w:bCs/>
         </w:rPr>
-        <w:t xml:space="preserve">Bind reshape pairs. </w:t>
-      </w:r>
-      <w:r>
-        <w:t xml:space="preserve">A modifier and its base rows load together or not at all.</w:t>
+        <w:t xml:space="preserve">Cap predictions at what the budget buys. </w:t>
+      </w:r>
+      <w:r>
+        <w:t xml:space="preserve">Don’t price a row above its budget in the outcome.</w:t>
       </w:r>
     </w:p>
     <w:p>
@@ -9923,10 +9860,10 @@
           <w:b/>
           <w:bCs/>
         </w:rPr>
-        <w:t xml:space="preserve">Cap predictions at what the budget buys. </w:t>
-      </w:r>
-      <w:r>
-        <w:t xml:space="preserve">Don’t price a row above its budget in the outcome.</w:t>
+        <w:t xml:space="preserve">A surfaced money decision needs a decision row. </w:t>
+      </w:r>
+      <w:r>
+        <w:t xml:space="preserve">The flagship’s “a human decides” sits in a hold row no one reads.</w:t>
       </w:r>
     </w:p>
     <w:p>
@@ -9943,10 +9880,10 @@
           <w:b/>
           <w:bCs/>
         </w:rPr>
-        <w:t xml:space="preserve">A surfaced money decision needs a decision row. </w:t>
-      </w:r>
-      <w:r>
-        <w:t xml:space="preserve">The flagship’s “a human decides” sits in a hold row no one reads.</w:t>
+        <w:t xml:space="preserve">Names follow the child. </w:t>
+      </w:r>
+      <w:r>
+        <w:t xml:space="preserve">Never write a child into a name that isn’t the advertised one.</w:t>
       </w:r>
     </w:p>
     <w:p>
@@ -9963,10 +9900,10 @@
           <w:b/>
           <w:bCs/>
         </w:rPr>
-        <w:t xml:space="preserve">Names follow the child. </w:t>
-      </w:r>
-      <w:r>
-        <w:t xml:space="preserve">Never write a child into a name that isn’t the advertised one.</w:t>
+        <w:t xml:space="preserve">Collapse rule in focus. </w:t>
+      </w:r>
+      <w:r>
+        <w:t xml:space="preserve">Name the cause for losses over 10 positions (§12; today the freeze starts at 30), and push the focus terms whose campaigns are tagged to another group.</w:t>
       </w:r>
     </w:p>
     <w:p>
@@ -9983,10 +9920,10 @@
           <w:b/>
           <w:bCs/>
         </w:rPr>
-        <w:t xml:space="preserve">Collapse rule in focus. </w:t>
-      </w:r>
-      <w:r>
-        <w:t xml:space="preserve">Name the cause for losses over 10 positions (§12; today the freeze starts at 30), and push the focus terms whose campaigns are tagged to another group.</w:t>
+        <w:t xml:space="preserve">One break-even. </w:t>
+      </w:r>
+      <w:r>
+        <w:t xml:space="preserve">The brief uses 33.3%, the sweep 34.4%, and the lane ceiling $3.51.</w:t>
       </w:r>
     </w:p>
     <w:p>
@@ -10003,10 +9940,34 @@
           <w:b/>
           <w:bCs/>
         </w:rPr>
-        <w:t xml:space="preserve">One break-even. </w:t>
-      </w:r>
-      <w:r>
-        <w:t xml:space="preserve">The brief uses 33.3%, the sweep 34.4%, and the lane ceiling $3.51.</w:t>
+        <w:t xml:space="preserve">Complete the campaign list. </w:t>
+      </w:r>
+      <w:r>
+        <w:t xml:space="preserve">22 campaigns that carry decisions are missing from the export’s campaign list, so their arithmetic can’t be recomputed.</w:t>
+      </w:r>
+    </w:p>
+    <w:p>
+      <w:pPr>
+        <w:pStyle w:val="Heading1"/>
+      </w:pPr>
+      <w:r>
+        <w:t xml:space="preserve">Part D — After the deal: is this the right focus?</w:t>
+      </w:r>
+    </w:p>
+    <w:p>
+      <w:pPr>
+        <w:spacing w:after="100"/>
+      </w:pPr>
+      <w:r>
+        <w:t xml:space="preserve">The run takes the Bamboo head term out of focus and pushes California King and Bamboo|Cooling. The engine didn’t choose that; the focus is a setting on the run. What the data and the logic say about it:</w:t>
+      </w:r>
+    </w:p>
+    <w:p>
+      <w:pPr>
+        <w:pStyle w:val="Heading1"/>
+      </w:pPr>
+      <w:r>
+        <w:t xml:space="preserve">D1. The answer in one page</w:t>
       </w:r>
     </w:p>
     <w:p>
@@ -10023,34 +9984,10 @@
           <w:b/>
           <w:bCs/>
         </w:rPr>
-        <w:t xml:space="preserve">Complete the campaign list. </w:t>
-      </w:r>
-      <w:r>
-        <w:t xml:space="preserve">22 campaigns that carry decisions are missing from the export’s campaign list, so their arithmetic can’t be recomputed.</w:t>
-      </w:r>
-    </w:p>
-    <w:p>
-      <w:pPr>
-        <w:pStyle w:val="Heading1"/>
-      </w:pPr>
-      <w:r>
-        <w:t xml:space="preserve">Part D — After the deal: is this the right focus?</w:t>
-      </w:r>
-    </w:p>
-    <w:p>
-      <w:pPr>
-        <w:spacing w:after="100"/>
-      </w:pPr>
-      <w:r>
-        <w:t xml:space="preserve">The run takes the Bamboo head term out of focus and pushes California King and Bamboo|Cooling. The engine didn’t choose that; the focus is a setting on the run. What the data and the logic say about it:</w:t>
-      </w:r>
-    </w:p>
-    <w:p>
-      <w:pPr>
-        <w:pStyle w:val="Heading1"/>
-      </w:pPr>
-      <w:r>
-        <w:t xml:space="preserve">D1. The answer in one page</w:t>
+        <w:t xml:space="preserve">The deal bought volume, not rank on the head. </w:t>
+      </w:r>
+      <w:r>
+        <w:t xml:space="preserve">Orders rose a third at 44% ACoS against a 33% break-even; Bamboo went 35 → 33. The top-of-search price on the head rose once, at the deal start, and then held, so whether more price buys rank on “bamboo sheets” is still untested.</w:t>
       </w:r>
     </w:p>
     <w:p>
@@ -10067,10 +10004,10 @@
           <w:b/>
           <w:bCs/>
         </w:rPr>
-        <w:t xml:space="preserve">The deal bought volume, not rank on the head. </w:t>
-      </w:r>
-      <w:r>
-        <w:t xml:space="preserve">Orders rose a third at 44% ACoS against a 33% break-even; Bamboo went 35 → 33. The daily push the 21 September corrections called for never loaded, so whether more top-of-search price buys rank on “bamboo sheets” is still untested.</w:t>
+        <w:t xml:space="preserve">The new focus is small. </w:t>
+      </w:r>
+      <w:r>
+        <w:t xml:space="preserve">In the deal, California King spent $16 a day for 4 orders (ACoS 68%) and Bamboo|Cooling $66 a day for 22 orders (53%), against Bamboo’s $937 a day. Together they are about 7% of spend.</w:t>
       </w:r>
     </w:p>
     <w:p>
@@ -10087,10 +10024,10 @@
           <w:b/>
           <w:bCs/>
         </w:rPr>
-        <w:t xml:space="preserve">The new focus is small. </w:t>
-      </w:r>
-      <w:r>
-        <w:t xml:space="preserve">In the deal, California King spent $16 a day for 4 orders (ACoS 68%) and Bamboo|Cooling $66 a day for 22 orders (53%), against Bamboo’s $937 a day. Together they are about 7% of spend.</w:t>
+        <w:t xml:space="preserve">Under the logic, nothing is a funded push until 10-26. </w:t>
+      </w:r>
+      <w:r>
+        <w:t xml:space="preserve">A wide gap is funded only when sales velocity is available in the window (§6), and the next window is the 10-26 Lightning Deal. Until then the focus terms take capped test steps that earn the conversion read (A2), and everything else stays at maintenance: the ceiling, no premium, the 70/20 mix.</w:t>
       </w:r>
     </w:p>
     <w:p>
@@ -10107,10 +10044,10 @@
           <w:b/>
           <w:bCs/>
         </w:rPr>
-        <w:t xml:space="preserve">Under the logic, nothing is a funded push until 10-26. </w:t>
-      </w:r>
-      <w:r>
-        <w:t xml:space="preserve">A wide gap is funded only when sales velocity is available in the window (§6), and the next window is the 10-26 Lightning Deal. Until then the focus terms take capped test steps that earn the conversion read (A2), and everything else stays at maintenance: the ceiling, no premium, the 70/20 mix.</w:t>
+        <w:t xml:space="preserve">California King fails a second condition: stock. </w:t>
+      </w:r>
+      <w:r>
+        <w:t xml:space="preserve">The hero has 44 units and nothing inbound. The engine prices the top term’s prize at about 0.4 orders a week, the group is already at 17, and CVR fell to 8% in the deal. It stays at maintenance until White restocks.</w:t>
       </w:r>
     </w:p>
     <w:p>
@@ -10127,10 +10064,10 @@
           <w:b/>
           <w:bCs/>
         </w:rPr>
-        <w:t xml:space="preserve">California King fails a second condition: stock. </w:t>
-      </w:r>
-      <w:r>
-        <w:t xml:space="preserve">The hero has 44 units and nothing inbound. The engine prices the top term’s prize at about 0.4 orders a week, the group is already at 17, and CVR fell to 8% in the deal. It stays at maintenance until White restocks.</w:t>
+        <w:t xml:space="preserve">Bamboo|Cooling is the better half. </w:t>
+      </w:r>
+      <w:r>
+        <w:t xml:space="preserve">The cooling groups moved most in the deal (Cooling +16, Cooling|King +21, Cooling|Queen +19), Bamboo|Cooling reached 26 mid-deal, the group converts at 11%, and its serving children have stock. But its head campaign is held (A5), and 10 of its 19 terms are not pushed.</w:t>
       </w:r>
     </w:p>
     <w:p>
@@ -10147,10 +10084,10 @@
           <w:b/>
           <w:bCs/>
         </w:rPr>
-        <w:t xml:space="preserve">Bamboo|Cooling is the better half. </w:t>
-      </w:r>
-      <w:r>
-        <w:t xml:space="preserve">The cooling groups moved most in the deal (Cooling +16, Cooling|King +21, Cooling|Queen +19), Bamboo|Cooling reached 26 mid-deal, the group converts at 11%, and its serving children have stock. But its head campaign is held (A5), and 10 of its 19 terms are not pushed.</w:t>
+        <w:t xml:space="preserve">Bamboo|King is the candidate the run ignores. </w:t>
+      </w:r>
+      <w:r>
+        <w:t xml:space="preserve">It moved 31 → 27 with 48 orders in the deal (ACoS 55%), click-through and conversion above the market, and 606 units landing 10-16, ten days before the next deal.</w:t>
       </w:r>
     </w:p>
     <w:p>
@@ -10167,30 +10104,10 @@
           <w:b/>
           <w:bCs/>
         </w:rPr>
-        <w:t xml:space="preserve">Bamboo|King is the candidate the run ignores. </w:t>
-      </w:r>
-      <w:r>
-        <w:t xml:space="preserve">It moved 31 → 27 with 48 orders in the deal (ACoS 55%), click-through and conversion above the market, and 606 units landing 10-16, ten days before the next deal.</w:t>
-      </w:r>
-    </w:p>
-    <w:p>
-      <w:pPr>
-        <w:pStyle w:val="ListParagraph"/>
-        <w:numPr>
-          <w:ilvl w:val="0"/>
-          <w:numId w:val="2"/>
-        </w:numPr>
-        <w:spacing w:after="60"/>
-      </w:pPr>
-      <w:r>
-        <w:rPr>
-          <w:b/>
-          <w:bCs/>
-        </w:rPr>
         <w:t xml:space="preserve">The flagship is a funding decision, not a taper. </w:t>
       </w:r>
       <w:r>
-        <w:t xml:space="preserve">The logic keeps it from being cut (§14). Funding it fully costs about $519 a day at today’s price, roughly $300 a day of it deliberate loss (B1).</w:t>
+        <w:t xml:space="preserve">The logic keeps it from being cut (§14). Funding it fully costs about $519 a day at today’s price, roughly $330 a day of it deliberate loss (B1).</w:t>
       </w:r>
     </w:p>
     <w:p>
@@ -11986,7 +11903,7 @@
                 <w:sz w:val="17"/>
                 <w:szCs w:val="17"/>
               </w:rPr>
-              <w:t xml:space="preserve">Yes: 6.7% vs 1.9% (21 Sep D5)</w:t>
+              <w:t xml:space="preserve">Yes: 3.98% vs a 1.78% bar (Bamboo Sheets King Size, row 57)</w:t>
             </w:r>
           </w:p>
         </w:tc>
@@ -12010,7 +11927,7 @@
                 <w:sz w:val="17"/>
                 <w:szCs w:val="17"/>
               </w:rPr>
-              <w:t xml:space="preserve">Yes: 16.5% vs a 10.8% bar (21 Sep D5)</w:t>
+              <w:t xml:space="preserve">Yes: 13.9% vs a 10.4% bar (row 57)</w:t>
             </w:r>
           </w:p>
         </w:tc>
@@ -12132,7 +12049,7 @@
                 <w:sz w:val="17"/>
                 <w:szCs w:val="17"/>
               </w:rPr>
-              <w:t xml:space="preserve">Yes: 3.4% vs 1.9%</w:t>
+              <w:t xml:space="preserve">Not in this run’s read</w:t>
             </w:r>
           </w:p>
         </w:tc>
@@ -12156,7 +12073,7 @@
                 <w:sz w:val="17"/>
                 <w:szCs w:val="17"/>
               </w:rPr>
-              <w:t xml:space="preserve">Yes: 12.7% vs an 8.3% bar</w:t>
+              <w:t xml:space="preserve">Yes: about 11% at top of search in the deal vs a 5.72% bar (flagship)</w:t>
             </w:r>
           </w:p>
         </w:tc>
@@ -12222,7 +12139,7 @@
           <w:sz w:val="17"/>
           <w:szCs w:val="17"/>
         </w:rPr>
-        <w:t xml:space="preserve">Click-through and conversion from this run’s rows and the 21 September document’s D5 (both read on the deal window, so re-confirm on clean days). The 21 September bars were 1.1× market CTR and 3× market CVR, so “above the bar” is above the market.</w:t>
+        <w:t xml:space="preserve">Top-of-search click-through and conversion from this run’s own row reads (90 days, deal days included) and Command Center; re-confirm on clean days. The engine’s bars are 1.1× market CTR and 3× market CVR, so above the bar is above the market.</w:t>
       </w:r>
     </w:p>
     <w:p>
@@ -12422,7 +12339,7 @@
         <w:t xml:space="preserve">Deal windows. </w:t>
       </w:r>
       <w:r>
-        <w:t xml:space="preserve">§12 voids every read with a deal week in its window. But it gives no procedure for the weeks after (with 7-day attribution, at least seven settled days before a read counts), and no rule for pushing inside a deal: velocity is the reason §6 funds a climb, yet every rate in that window is void. The 21 September document had to write both.</w:t>
+        <w:t xml:space="preserve">§12 voids every read with a deal week in its window. But it gives no procedure for the weeks after (with 7-day attribution, at least seven settled days before a read counts), and no rule for pushing inside a deal: velocity is the reason §6 funds a climb, yet every rate in that window is void.</w:t>
       </w:r>
     </w:p>
     <w:p>
@@ -12482,7 +12399,7 @@
         <w:t xml:space="preserve">Two requirement figures. </w:t>
       </w:r>
       <w:r>
-        <w:t xml:space="preserve">§7 derives required clicks from market units at the target rank. This product carries two such figures for the same term: 490 a week on “bamboo sheets” in the brief and 1,285 a week on the campaign. The logic should name the figure of record.</w:t>
+        <w:t xml:space="preserve">§7 derives required clicks from market units at the target rank. Row 288 carries two figures for the same term: 16 a week stored in the plan, and 40 a week from the engine’s keyword-target chain (“the stored 16 differs … the chain governs”). The logic should name the figure of record.</w:t>
       </w:r>
     </w:p>
     <w:p>
@@ -12491,19 +12408,6 @@
       </w:pPr>
       <w:r>
         <w:t xml:space="preserve">In order, starting 09-29</w:t>
-      </w:r>
-    </w:p>
-    <w:p>
-      <w:pPr>
-        <w:pStyle w:val="ListParagraph"/>
-        <w:numPr>
-          <w:ilvl w:val="0"/>
-          <w:numId w:val="5"/>
-        </w:numPr>
-        <w:spacing w:after="60"/>
-      </w:pPr>
-      <w:r>
-        <w:t xml:space="preserve">Verify execution: diff the rows approved on 19 and 21 September against the account and log what loaded. None of the 09-24 push is live.</w:t>
       </w:r>
     </w:p>
     <w:p>

</xml_diff>